<commit_message>
Remove do manuscrito o que não tem fonte no recorte.
Tira distâncias haversine, 26.400 km² como área do posto, diário de API,
afiliações UFRGS/Campus Litoral, Campolo e o julgamento de que os coautores
escolheriam a rede de 4 h. O Quadro 2 e a Figura 1 passam a copiar só a
telemetria; testes barram essas invenções.

Co-authored-by: juliana carolino carolino reis <juliana.reis@ufrgs.br>
</commit_message>
<xml_diff>
--- a/pesquisas/manuscrito-drive.docx
+++ b/pesquisas/manuscrito-drive.docx
@@ -50,7 +50,7 @@
           <w:color w:val="000000"/>
           <w:sz w:val="22"/>
         </w:rPr>
-        <w:t>Juliana Carolina Reis¹*; Guilherme Garcia de Oliveira²; Fernanda Vier¹</w:t>
+        <w:t>Juliana Carolina Reis¹*; Guilherme Garcia de Oliveira¹; Fernanda Vier¹</w:t>
       </w:r>
     </w:p>
     <w:p>
@@ -67,20 +67,7 @@
           <w:color w:val="000000"/>
           <w:sz w:val="22"/>
         </w:rPr>
-        <w:t>¹ Universidade Federal do Rio Grande do Sul (UFRGS), Porto Alegre, RS, Brasil.</w:t>
-      </w:r>
-      <w:r>
-        <w:br/>
-      </w:r>
-      <w:r>
-        <w:rPr>
-          <w:rFonts w:ascii="Times New Roman" w:hAnsi="Times New Roman" w:eastAsia="Times New Roman"/>
-          <w:b w:val="0"/>
-          <w:i w:val="0"/>
-          <w:color w:val="000000"/>
-          <w:sz w:val="22"/>
-        </w:rPr>
-        <w:t>² Departamento Interdisciplinar, Campus Litoral Norte, Universidade Federal do Rio Grande do Sul (UFRGS), Tramandaí, RS, Brasil.</w:t>
+        <w:t>¹ Afiliação institucional a confirmar.</w:t>
       </w:r>
       <w:r>
         <w:br/>
@@ -255,7 +242,7 @@
           <w:color w:val="000000"/>
           <w:sz w:val="24"/>
         </w:rPr>
-        <w:t>Na previsão de níveis, Campolo, Soldati e Andreussi (2003) e Dornelles, Goldenfum e Pedrollo (2013) mostraram que o desempenho depende do particionamento e da repetição do treinamento. Oliveira, Pedrollo e Castro (2014, 2015) argumentaram que a seleção de entradas é hipótese hidrológica: modelos mais parcimoniosos podem igualar ou superar redes maiores no coeficiente de Nash-Sutcliffe (NS) e, sobretudo, tornar interpretável o funcionamento da rede. Matos, Pedrollo e Castro (2014) examinaram o controle de montante em sub-bacias embutidas. Na bacia do rio Taquari-Antas, Finck (2020) aplicou RNAs às estações de Encantado, Estrela, Porto Mariante e Taquari, com NS médio da ordem de 0,93 / 0,89 / 0,71 em 8, 12 e 24 h.</w:t>
+        <w:t>Na previsão de níveis, Dornelles, Goldenfum e Pedrollo (2013) mostraram que o desempenho depende do particionamento e da repetição do treinamento. Oliveira, Pedrollo, Castro e Bravo (2013) examinaram simulações com diferentes proporções de área controlada. Oliveira, Pedrollo e Castro (2014, 2015) argumentaram que a seleção de entradas é hipótese hidrológica: modelos mais parcimoniosos podem igualar ou superar redes maiores no coeficiente de Nash-Sutcliffe (NS) e, sobretudo, tornar interpretável o funcionamento da rede. Matos, Pedrollo e Castro (2014) examinaram o controle de montante em sub-bacias embutidas. Na bacia do rio Taquari-Antas, Finck (2020) aplicou RNAs às estações de Encantado, Estrela, Porto Mariante e Taquari, com NS médio de 0,93, 0,89 e 0,71 em 8, 12 e 24 h (resumo da dissertação).</w:t>
       </w:r>
     </w:p>
     <w:p>
@@ -271,7 +258,7 @@
           <w:color w:val="000000"/>
           <w:sz w:val="24"/>
         </w:rPr>
-        <w:t>Este estudo aplica a mesma classe de modelos à estação 86472600, a montante daquelas estações, para a previsão de nível na régua com 2 a 12 horas. O objeto não é um novo experimento de arquitetura, nem o ranking de uma campanha de treino, nem o erro de uma janela móvel do serviço experimental. O objeto é o conjunto de 282 redes com PERS positiva em treino, validação, teste e série completa (215 da família ALT e 67 da família CONV), com um único modelo por horizonte — o de maior índice de equilíbrio publicado no inventário — e com as combinações de entrada apresentadas como hipóteses de propagação. Muçum permanece fora do escopo. Pergunta-se: (i) quais combinações de variáveis de entrada foram examinadas e se as defasagens são compatíveis com a geometria dos postos; (ii) qual modelo de cada horizonte maximiza o índice de equilíbrio; (iii) se o MAE e o E95 desse modelo são interpretáveis sem hidrograma de teste, ou apenas como resumo pontual.</w:t>
+        <w:t>Este estudo aplica a mesma classe de modelos à estação 86472600 (Santa Tereza) para a previsão de nível na régua com 2 a 12 horas. O objeto não é um novo experimento de arquitetura, nem o ranking de uma campanha de treino, nem o erro de uma janela móvel do serviço experimental. O objeto é o conjunto de 282 redes com PERS positiva em treino, validação, teste e série completa (215 da família ALT e 67 da família CONV), com um único modelo por horizonte — o de maior índice de equilíbrio publicado no inventário — e com as combinações de entrada do próprio catálogo. Muçum permanece fora do escopo. Pergunta-se: (i) quais combinações de variáveis de entrada o recorte publica; (ii) qual modelo de cada horizonte maximiza o índice de equilíbrio da ficha; (iii) quais MAE, NS e E95 de teste as fichas registram para esses quatro modelos.</w:t>
       </w:r>
     </w:p>
     <w:p>
@@ -303,7 +290,7 @@
           <w:color w:val="000000"/>
           <w:sz w:val="24"/>
         </w:rPr>
-        <w:t>A bacia hidrográfica do rio Taquari-Antas drena o nordeste do Rio Grande do Sul. Santa Tereza situa-se no médio curso, a jusante da confluência do rio das Antas com o rio Carreiro, onde se inicia o Taquari. A estação-alvo é a fluviométrica 86472600 (ANA/SGB), junto à antiga estação ferroviária, nas coordenadas 29,1781° S e 51,7322° W, obtidas da telemetria SGB/ANA publicada pelo projeto. A camada GIS de referência do projeto fecha a bacia Taquari-Antas em cerca de 26.400 km²; essa cifra descreve a bacia como um todo, não a área afluente ao código 86472600. O campo de área de drenagem do inventário HidroWeb/ANA para este posto não foi recuperado nesta versão (o serviço HidroInventario retornou erro interno; o HidroWebService exigiu autenticação). Sem esse número, as defasagens de montante permanecem hipóteses auditáveis, não evidência de roteamento.</w:t>
+        <w:t>A estação-alvo é a fluviométrica 86472600 (ANA/SGB). Na telemetria do projeto o código chama-se Santa Tereza, com latitude −29,1781° e longitude −51,7322° (previsao_ao_vivo.json, fonte SGB/ANA). Os demais postos que entram nas redes estão no Quadro 2, com o nome e a coordenada que esse arquivo publica. Área de drenagem do posto, tempo de viagem e hidrografia não constam desse arquivo nem do recorte de 282 redes; não são estimados aqui.</w:t>
       </w:r>
     </w:p>
     <w:p>
@@ -319,7 +306,7 @@
           <w:color w:val="000000"/>
           <w:sz w:val="24"/>
         </w:rPr>
-        <w:t>A Figura 1 localiza os postos com coordenada conhecida. O Quadro 2 lista códigos, nomes e a distância geodésica (haversine) até a régua-alvo. Carreiro (86507000) e as estações 86298000 e 86430900 entram nas combinações do Quadro 1, mas a telemetria do projeto não traz latitude nem longitude para elas. Distância geodésica não é tempo de viagem: Matos, Pedrollo e Castro (2014) exigem que a informação de montante caiba no horizonte; aqui essa exigência fica explícita e não resolvida.</w:t>
+        <w:t>A Figura 1 plota os quatro postos que têm latitude e longitude em previsao_ao_vivo.json. O Quadro 2 copia código, nome da telemetria e coordenadas quando existem. Carreiro (86507000) e as estações 86298000 e 86430900 entram nas combinações do Quadro 1; nesse arquivo a latitude e a longitude desses três códigos são nulas.</w:t>
       </w:r>
     </w:p>
     <w:p>
@@ -336,7 +323,7 @@
           <w:color w:val="000000"/>
           <w:sz w:val="20"/>
         </w:rPr>
-        <w:t>Figura 1. Localização da estação Santa Tereza (86472600) e dos postos de montante com coordenada na telemetria SGB/ANA. Carreiro, 86298000 e 86430900 não figuram no mapa por ausência de coordenada. A área afluente ao 86472600 não foi recuperada no HidroWeb.</w:t>
+        <w:t>Figura 1. Postos com latitude e longitude em previsao_ao_vivo.json (telemetria SGB/ANA do projeto). Carreiro, 86298000 e 86430900 não figuram: nesse arquivo a coordenada é nula. Sem hidrografia e sem área de drenagem.</w:t>
       </w:r>
     </w:p>
     <w:p>
@@ -393,7 +380,7 @@
           <w:color w:val="000000"/>
           <w:sz w:val="20"/>
         </w:rPr>
-        <w:t>Quadro 2. Postos das combinações principais. Coordenadas da telemetria SGB/ANA do projeto. Distância geodésica até 86472600; não é tempo de viagem.</w:t>
+        <w:t>Quadro 2. Postos das combinações principais. Código, nome e coordenadas copiados de previsao_ao_vivo.json. Travessão: latitude ou longitude nula nesse arquivo.</w:t>
       </w:r>
     </w:p>
     <w:tbl>
@@ -404,16 +391,15 @@
         <w:tblLook w:firstColumn="1" w:firstRow="1" w:lastColumn="0" w:lastRow="0" w:noHBand="0" w:noVBand="1" w:val="04A0"/>
       </w:tblPr>
       <w:tblGrid>
-        <w:gridCol w:w="1881"/>
-        <w:gridCol w:w="1881"/>
-        <w:gridCol w:w="1881"/>
-        <w:gridCol w:w="1881"/>
-        <w:gridCol w:w="1881"/>
+        <w:gridCol w:w="2351"/>
+        <w:gridCol w:w="2351"/>
+        <w:gridCol w:w="2351"/>
+        <w:gridCol w:w="2351"/>
       </w:tblGrid>
       <w:tr>
         <w:tc>
           <w:tcPr>
-            <w:tcW w:type="dxa" w:w="1881"/>
+            <w:tcW w:type="dxa" w:w="2351"/>
             <w:shd w:fill="E8EEE9" w:val="clear"/>
           </w:tcPr>
           <w:p>
@@ -435,7 +421,7 @@
         </w:tc>
         <w:tc>
           <w:tcPr>
-            <w:tcW w:type="dxa" w:w="1881"/>
+            <w:tcW w:type="dxa" w:w="2351"/>
             <w:shd w:fill="E8EEE9" w:val="clear"/>
           </w:tcPr>
           <w:p>
@@ -451,13 +437,13 @@
                 <w:color w:val="000000"/>
                 <w:sz w:val="16"/>
               </w:rPr>
-              <w:t>Nome</w:t>
+              <w:t>Nome na telemetria do projeto</w:t>
             </w:r>
           </w:p>
         </w:tc>
         <w:tc>
           <w:tcPr>
-            <w:tcW w:type="dxa" w:w="1881"/>
+            <w:tcW w:type="dxa" w:w="2351"/>
             <w:shd w:fill="E8EEE9" w:val="clear"/>
           </w:tcPr>
           <w:p>
@@ -479,7 +465,7 @@
         </w:tc>
         <w:tc>
           <w:tcPr>
-            <w:tcW w:type="dxa" w:w="1881"/>
+            <w:tcW w:type="dxa" w:w="2351"/>
             <w:shd w:fill="E8EEE9" w:val="clear"/>
           </w:tcPr>
           <w:p>
@@ -499,33 +485,11 @@
             </w:r>
           </w:p>
         </w:tc>
-        <w:tc>
-          <w:tcPr>
-            <w:tcW w:type="dxa" w:w="1881"/>
-            <w:shd w:fill="E8EEE9" w:val="clear"/>
-          </w:tcPr>
-          <w:p>
-            <w:pPr>
-              <w:jc w:val="center"/>
-            </w:pPr>
-            <w:r/>
-            <w:r>
-              <w:rPr>
-                <w:rFonts w:ascii="Times New Roman" w:hAnsi="Times New Roman" w:eastAsia="Times New Roman"/>
-                <w:b/>
-                <w:i w:val="0"/>
-                <w:color w:val="000000"/>
-                <w:sz w:val="16"/>
-              </w:rPr>
-              <w:t>Distância geodésica até 86472600</w:t>
-            </w:r>
-          </w:p>
-        </w:tc>
       </w:tr>
       <w:tr>
         <w:tc>
           <w:tcPr>
-            <w:tcW w:type="dxa" w:w="1881"/>
+            <w:tcW w:type="dxa" w:w="2351"/>
           </w:tcPr>
           <w:p>
             <w:r/>
@@ -543,7 +507,7 @@
         </w:tc>
         <w:tc>
           <w:tcPr>
-            <w:tcW w:type="dxa" w:w="1881"/>
+            <w:tcW w:type="dxa" w:w="2351"/>
           </w:tcPr>
           <w:p>
             <w:r/>
@@ -555,13 +519,13 @@
                 <w:color w:val="000000"/>
                 <w:sz w:val="14"/>
               </w:rPr>
-              <w:t>Santa Tereza (estação-alvo)</w:t>
+              <w:t>Santa Tereza</w:t>
             </w:r>
           </w:p>
         </w:tc>
         <w:tc>
           <w:tcPr>
-            <w:tcW w:type="dxa" w:w="1881"/>
+            <w:tcW w:type="dxa" w:w="2351"/>
           </w:tcPr>
           <w:p>
             <w:r/>
@@ -579,7 +543,7 @@
         </w:tc>
         <w:tc>
           <w:tcPr>
-            <w:tcW w:type="dxa" w:w="1881"/>
+            <w:tcW w:type="dxa" w:w="2351"/>
           </w:tcPr>
           <w:p>
             <w:r/>
@@ -595,9 +559,287 @@
             </w:r>
           </w:p>
         </w:tc>
+      </w:tr>
+      <w:tr>
         <w:tc>
           <w:tcPr>
-            <w:tcW w:type="dxa" w:w="1881"/>
+            <w:tcW w:type="dxa" w:w="2351"/>
+          </w:tcPr>
+          <w:p>
+            <w:r/>
+            <w:r>
+              <w:rPr>
+                <w:rFonts w:ascii="Times New Roman" w:hAnsi="Times New Roman" w:eastAsia="Times New Roman"/>
+                <w:b w:val="0"/>
+                <w:i w:val="0"/>
+                <w:color w:val="000000"/>
+                <w:sz w:val="14"/>
+              </w:rPr>
+              <w:t>86472000</w:t>
+            </w:r>
+          </w:p>
+        </w:tc>
+        <w:tc>
+          <w:tcPr>
+            <w:tcW w:type="dxa" w:w="2351"/>
+          </w:tcPr>
+          <w:p>
+            <w:r/>
+            <w:r>
+              <w:rPr>
+                <w:rFonts w:ascii="Times New Roman" w:hAnsi="Times New Roman" w:eastAsia="Times New Roman"/>
+                <w:b w:val="0"/>
+                <w:i w:val="0"/>
+                <w:color w:val="000000"/>
+                <w:sz w:val="14"/>
+              </w:rPr>
+              <w:t>Linha Jose Julio / Rio das Antas montante</w:t>
+            </w:r>
+          </w:p>
+        </w:tc>
+        <w:tc>
+          <w:tcPr>
+            <w:tcW w:type="dxa" w:w="2351"/>
+          </w:tcPr>
+          <w:p>
+            <w:r/>
+            <w:r>
+              <w:rPr>
+                <w:rFonts w:ascii="Times New Roman" w:hAnsi="Times New Roman" w:eastAsia="Times New Roman"/>
+                <w:b w:val="0"/>
+                <w:i w:val="0"/>
+                <w:color w:val="000000"/>
+                <w:sz w:val="14"/>
+              </w:rPr>
+              <w:t>29,0978° S</w:t>
+            </w:r>
+          </w:p>
+        </w:tc>
+        <w:tc>
+          <w:tcPr>
+            <w:tcW w:type="dxa" w:w="2351"/>
+          </w:tcPr>
+          <w:p>
+            <w:r/>
+            <w:r>
+              <w:rPr>
+                <w:rFonts w:ascii="Times New Roman" w:hAnsi="Times New Roman" w:eastAsia="Times New Roman"/>
+                <w:b w:val="0"/>
+                <w:i w:val="0"/>
+                <w:color w:val="000000"/>
+                <w:sz w:val="14"/>
+              </w:rPr>
+              <w:t>51,6997° W</w:t>
+            </w:r>
+          </w:p>
+        </w:tc>
+      </w:tr>
+      <w:tr>
+        <w:tc>
+          <w:tcPr>
+            <w:tcW w:type="dxa" w:w="2351"/>
+          </w:tcPr>
+          <w:p>
+            <w:r/>
+            <w:r>
+              <w:rPr>
+                <w:rFonts w:ascii="Times New Roman" w:hAnsi="Times New Roman" w:eastAsia="Times New Roman"/>
+                <w:b w:val="0"/>
+                <w:i w:val="0"/>
+                <w:color w:val="000000"/>
+                <w:sz w:val="14"/>
+              </w:rPr>
+              <w:t>86448000</w:t>
+            </w:r>
+          </w:p>
+        </w:tc>
+        <w:tc>
+          <w:tcPr>
+            <w:tcW w:type="dxa" w:w="2351"/>
+          </w:tcPr>
+          <w:p>
+            <w:r/>
+            <w:r>
+              <w:rPr>
+                <w:rFonts w:ascii="Times New Roman" w:hAnsi="Times New Roman" w:eastAsia="Times New Roman"/>
+                <w:b w:val="0"/>
+                <w:i w:val="0"/>
+                <w:color w:val="000000"/>
+                <w:sz w:val="14"/>
+              </w:rPr>
+              <w:t>Veranopolis / Rio das Antas</w:t>
+            </w:r>
+          </w:p>
+        </w:tc>
+        <w:tc>
+          <w:tcPr>
+            <w:tcW w:type="dxa" w:w="2351"/>
+          </w:tcPr>
+          <w:p>
+            <w:r/>
+            <w:r>
+              <w:rPr>
+                <w:rFonts w:ascii="Times New Roman" w:hAnsi="Times New Roman" w:eastAsia="Times New Roman"/>
+                <w:b w:val="0"/>
+                <w:i w:val="0"/>
+                <w:color w:val="000000"/>
+                <w:sz w:val="14"/>
+              </w:rPr>
+              <w:t>29,0292° S</w:t>
+            </w:r>
+          </w:p>
+        </w:tc>
+        <w:tc>
+          <w:tcPr>
+            <w:tcW w:type="dxa" w:w="2351"/>
+          </w:tcPr>
+          <w:p>
+            <w:r/>
+            <w:r>
+              <w:rPr>
+                <w:rFonts w:ascii="Times New Roman" w:hAnsi="Times New Roman" w:eastAsia="Times New Roman"/>
+                <w:b w:val="0"/>
+                <w:i w:val="0"/>
+                <w:color w:val="000000"/>
+                <w:sz w:val="14"/>
+              </w:rPr>
+              <w:t>51,5219° W</w:t>
+            </w:r>
+          </w:p>
+        </w:tc>
+      </w:tr>
+      <w:tr>
+        <w:tc>
+          <w:tcPr>
+            <w:tcW w:type="dxa" w:w="2351"/>
+          </w:tcPr>
+          <w:p>
+            <w:r/>
+            <w:r>
+              <w:rPr>
+                <w:rFonts w:ascii="Times New Roman" w:hAnsi="Times New Roman" w:eastAsia="Times New Roman"/>
+                <w:b w:val="0"/>
+                <w:i w:val="0"/>
+                <w:color w:val="000000"/>
+                <w:sz w:val="14"/>
+              </w:rPr>
+              <w:t>86125130</w:t>
+            </w:r>
+          </w:p>
+        </w:tc>
+        <w:tc>
+          <w:tcPr>
+            <w:tcW w:type="dxa" w:w="2351"/>
+          </w:tcPr>
+          <w:p>
+            <w:r/>
+            <w:r>
+              <w:rPr>
+                <w:rFonts w:ascii="Times New Roman" w:hAnsi="Times New Roman" w:eastAsia="Times New Roman"/>
+                <w:b w:val="0"/>
+                <w:i w:val="0"/>
+                <w:color w:val="000000"/>
+                <w:sz w:val="14"/>
+              </w:rPr>
+              <w:t>Ituim</w:t>
+            </w:r>
+          </w:p>
+        </w:tc>
+        <w:tc>
+          <w:tcPr>
+            <w:tcW w:type="dxa" w:w="2351"/>
+          </w:tcPr>
+          <w:p>
+            <w:r/>
+            <w:r>
+              <w:rPr>
+                <w:rFonts w:ascii="Times New Roman" w:hAnsi="Times New Roman" w:eastAsia="Times New Roman"/>
+                <w:b w:val="0"/>
+                <w:i w:val="0"/>
+                <w:color w:val="000000"/>
+                <w:sz w:val="14"/>
+              </w:rPr>
+              <w:t>28,5919° S</w:t>
+            </w:r>
+          </w:p>
+        </w:tc>
+        <w:tc>
+          <w:tcPr>
+            <w:tcW w:type="dxa" w:w="2351"/>
+          </w:tcPr>
+          <w:p>
+            <w:r/>
+            <w:r>
+              <w:rPr>
+                <w:rFonts w:ascii="Times New Roman" w:hAnsi="Times New Roman" w:eastAsia="Times New Roman"/>
+                <w:b w:val="0"/>
+                <w:i w:val="0"/>
+                <w:color w:val="000000"/>
+                <w:sz w:val="14"/>
+              </w:rPr>
+              <w:t>51,3247° W</w:t>
+            </w:r>
+          </w:p>
+        </w:tc>
+      </w:tr>
+      <w:tr>
+        <w:tc>
+          <w:tcPr>
+            <w:tcW w:type="dxa" w:w="2351"/>
+          </w:tcPr>
+          <w:p>
+            <w:r/>
+            <w:r>
+              <w:rPr>
+                <w:rFonts w:ascii="Times New Roman" w:hAnsi="Times New Roman" w:eastAsia="Times New Roman"/>
+                <w:b w:val="0"/>
+                <w:i w:val="0"/>
+                <w:color w:val="000000"/>
+                <w:sz w:val="14"/>
+              </w:rPr>
+              <w:t>86507000</w:t>
+            </w:r>
+          </w:p>
+        </w:tc>
+        <w:tc>
+          <w:tcPr>
+            <w:tcW w:type="dxa" w:w="2351"/>
+          </w:tcPr>
+          <w:p>
+            <w:r/>
+            <w:r>
+              <w:rPr>
+                <w:rFonts w:ascii="Times New Roman" w:hAnsi="Times New Roman" w:eastAsia="Times New Roman"/>
+                <w:b w:val="0"/>
+                <w:i w:val="0"/>
+                <w:color w:val="000000"/>
+                <w:sz w:val="14"/>
+              </w:rPr>
+              <w:t>Carreiro</w:t>
+            </w:r>
+          </w:p>
+        </w:tc>
+        <w:tc>
+          <w:tcPr>
+            <w:tcW w:type="dxa" w:w="2351"/>
+          </w:tcPr>
+          <w:p>
+            <w:r/>
+            <w:r>
+              <w:rPr>
+                <w:rFonts w:ascii="Times New Roman" w:hAnsi="Times New Roman" w:eastAsia="Times New Roman"/>
+                <w:b w:val="0"/>
+                <w:i w:val="0"/>
+                <w:color w:val="000000"/>
+                <w:sz w:val="14"/>
+              </w:rPr>
+              <w:t>—</w:t>
+            </w:r>
+          </w:p>
+        </w:tc>
+        <w:tc>
+          <w:tcPr>
+            <w:tcW w:type="dxa" w:w="2351"/>
           </w:tcPr>
           <w:p>
             <w:r/>
@@ -617,7 +859,7 @@
       <w:tr>
         <w:tc>
           <w:tcPr>
-            <w:tcW w:type="dxa" w:w="1881"/>
+            <w:tcW w:type="dxa" w:w="2351"/>
           </w:tcPr>
           <w:p>
             <w:r/>
@@ -629,13 +871,13 @@
                 <w:color w:val="000000"/>
                 <w:sz w:val="14"/>
               </w:rPr>
-              <w:t>86472000</w:t>
+              <w:t>86298000</w:t>
             </w:r>
           </w:p>
         </w:tc>
         <w:tc>
           <w:tcPr>
-            <w:tcW w:type="dxa" w:w="1881"/>
+            <w:tcW w:type="dxa" w:w="2351"/>
           </w:tcPr>
           <w:p>
             <w:r/>
@@ -647,13 +889,13 @@
                 <w:color w:val="000000"/>
                 <w:sz w:val="14"/>
               </w:rPr>
-              <w:t>Linha José Júlio / rio das Antas montante</w:t>
+              <w:t>Estacao 86298000 - montante (input 4h PRO)</w:t>
             </w:r>
           </w:p>
         </w:tc>
         <w:tc>
           <w:tcPr>
-            <w:tcW w:type="dxa" w:w="1881"/>
+            <w:tcW w:type="dxa" w:w="2351"/>
           </w:tcPr>
           <w:p>
             <w:r/>
@@ -665,307 +907,13 @@
                 <w:color w:val="000000"/>
                 <w:sz w:val="14"/>
               </w:rPr>
-              <w:t>29,0978° S</w:t>
+              <w:t>—</w:t>
             </w:r>
           </w:p>
         </w:tc>
         <w:tc>
           <w:tcPr>
-            <w:tcW w:type="dxa" w:w="1881"/>
-          </w:tcPr>
-          <w:p>
-            <w:r/>
-            <w:r>
-              <w:rPr>
-                <w:rFonts w:ascii="Times New Roman" w:hAnsi="Times New Roman" w:eastAsia="Times New Roman"/>
-                <w:b w:val="0"/>
-                <w:i w:val="0"/>
-                <w:color w:val="000000"/>
-                <w:sz w:val="14"/>
-              </w:rPr>
-              <w:t>51,6997° W</w:t>
-            </w:r>
-          </w:p>
-        </w:tc>
-        <w:tc>
-          <w:tcPr>
-            <w:tcW w:type="dxa" w:w="1881"/>
-          </w:tcPr>
-          <w:p>
-            <w:r/>
-            <w:r>
-              <w:rPr>
-                <w:rFonts w:ascii="Times New Roman" w:hAnsi="Times New Roman" w:eastAsia="Times New Roman"/>
-                <w:b w:val="0"/>
-                <w:i w:val="0"/>
-                <w:color w:val="000000"/>
-                <w:sz w:val="14"/>
-              </w:rPr>
-              <w:t>9,5 km</w:t>
-            </w:r>
-          </w:p>
-        </w:tc>
-      </w:tr>
-      <w:tr>
-        <w:tc>
-          <w:tcPr>
-            <w:tcW w:type="dxa" w:w="1881"/>
-          </w:tcPr>
-          <w:p>
-            <w:r/>
-            <w:r>
-              <w:rPr>
-                <w:rFonts w:ascii="Times New Roman" w:hAnsi="Times New Roman" w:eastAsia="Times New Roman"/>
-                <w:b w:val="0"/>
-                <w:i w:val="0"/>
-                <w:color w:val="000000"/>
-                <w:sz w:val="14"/>
-              </w:rPr>
-              <w:t>86448000</w:t>
-            </w:r>
-          </w:p>
-        </w:tc>
-        <w:tc>
-          <w:tcPr>
-            <w:tcW w:type="dxa" w:w="1881"/>
-          </w:tcPr>
-          <w:p>
-            <w:r/>
-            <w:r>
-              <w:rPr>
-                <w:rFonts w:ascii="Times New Roman" w:hAnsi="Times New Roman" w:eastAsia="Times New Roman"/>
-                <w:b w:val="0"/>
-                <w:i w:val="0"/>
-                <w:color w:val="000000"/>
-                <w:sz w:val="14"/>
-              </w:rPr>
-              <w:t>Veranópolis / rio das Antas</w:t>
-            </w:r>
-          </w:p>
-        </w:tc>
-        <w:tc>
-          <w:tcPr>
-            <w:tcW w:type="dxa" w:w="1881"/>
-          </w:tcPr>
-          <w:p>
-            <w:r/>
-            <w:r>
-              <w:rPr>
-                <w:rFonts w:ascii="Times New Roman" w:hAnsi="Times New Roman" w:eastAsia="Times New Roman"/>
-                <w:b w:val="0"/>
-                <w:i w:val="0"/>
-                <w:color w:val="000000"/>
-                <w:sz w:val="14"/>
-              </w:rPr>
-              <w:t>29,0292° S</w:t>
-            </w:r>
-          </w:p>
-        </w:tc>
-        <w:tc>
-          <w:tcPr>
-            <w:tcW w:type="dxa" w:w="1881"/>
-          </w:tcPr>
-          <w:p>
-            <w:r/>
-            <w:r>
-              <w:rPr>
-                <w:rFonts w:ascii="Times New Roman" w:hAnsi="Times New Roman" w:eastAsia="Times New Roman"/>
-                <w:b w:val="0"/>
-                <w:i w:val="0"/>
-                <w:color w:val="000000"/>
-                <w:sz w:val="14"/>
-              </w:rPr>
-              <w:t>51,5219° W</w:t>
-            </w:r>
-          </w:p>
-        </w:tc>
-        <w:tc>
-          <w:tcPr>
-            <w:tcW w:type="dxa" w:w="1881"/>
-          </w:tcPr>
-          <w:p>
-            <w:r/>
-            <w:r>
-              <w:rPr>
-                <w:rFonts w:ascii="Times New Roman" w:hAnsi="Times New Roman" w:eastAsia="Times New Roman"/>
-                <w:b w:val="0"/>
-                <w:i w:val="0"/>
-                <w:color w:val="000000"/>
-                <w:sz w:val="14"/>
-              </w:rPr>
-              <w:t>26,3 km</w:t>
-            </w:r>
-          </w:p>
-        </w:tc>
-      </w:tr>
-      <w:tr>
-        <w:tc>
-          <w:tcPr>
-            <w:tcW w:type="dxa" w:w="1881"/>
-          </w:tcPr>
-          <w:p>
-            <w:r/>
-            <w:r>
-              <w:rPr>
-                <w:rFonts w:ascii="Times New Roman" w:hAnsi="Times New Roman" w:eastAsia="Times New Roman"/>
-                <w:b w:val="0"/>
-                <w:i w:val="0"/>
-                <w:color w:val="000000"/>
-                <w:sz w:val="14"/>
-              </w:rPr>
-              <w:t>86125130</w:t>
-            </w:r>
-          </w:p>
-        </w:tc>
-        <w:tc>
-          <w:tcPr>
-            <w:tcW w:type="dxa" w:w="1881"/>
-          </w:tcPr>
-          <w:p>
-            <w:r/>
-            <w:r>
-              <w:rPr>
-                <w:rFonts w:ascii="Times New Roman" w:hAnsi="Times New Roman" w:eastAsia="Times New Roman"/>
-                <w:b w:val="0"/>
-                <w:i w:val="0"/>
-                <w:color w:val="000000"/>
-                <w:sz w:val="14"/>
-              </w:rPr>
-              <w:t>Ituim / alto Antas</w:t>
-            </w:r>
-          </w:p>
-        </w:tc>
-        <w:tc>
-          <w:tcPr>
-            <w:tcW w:type="dxa" w:w="1881"/>
-          </w:tcPr>
-          <w:p>
-            <w:r/>
-            <w:r>
-              <w:rPr>
-                <w:rFonts w:ascii="Times New Roman" w:hAnsi="Times New Roman" w:eastAsia="Times New Roman"/>
-                <w:b w:val="0"/>
-                <w:i w:val="0"/>
-                <w:color w:val="000000"/>
-                <w:sz w:val="14"/>
-              </w:rPr>
-              <w:t>28,5919° S</w:t>
-            </w:r>
-          </w:p>
-        </w:tc>
-        <w:tc>
-          <w:tcPr>
-            <w:tcW w:type="dxa" w:w="1881"/>
-          </w:tcPr>
-          <w:p>
-            <w:r/>
-            <w:r>
-              <w:rPr>
-                <w:rFonts w:ascii="Times New Roman" w:hAnsi="Times New Roman" w:eastAsia="Times New Roman"/>
-                <w:b w:val="0"/>
-                <w:i w:val="0"/>
-                <w:color w:val="000000"/>
-                <w:sz w:val="14"/>
-              </w:rPr>
-              <w:t>51,3247° W</w:t>
-            </w:r>
-          </w:p>
-        </w:tc>
-        <w:tc>
-          <w:tcPr>
-            <w:tcW w:type="dxa" w:w="1881"/>
-          </w:tcPr>
-          <w:p>
-            <w:r/>
-            <w:r>
-              <w:rPr>
-                <w:rFonts w:ascii="Times New Roman" w:hAnsi="Times New Roman" w:eastAsia="Times New Roman"/>
-                <w:b w:val="0"/>
-                <w:i w:val="0"/>
-                <w:color w:val="000000"/>
-                <w:sz w:val="14"/>
-              </w:rPr>
-              <w:t>76,3 km</w:t>
-            </w:r>
-          </w:p>
-        </w:tc>
-      </w:tr>
-      <w:tr>
-        <w:tc>
-          <w:tcPr>
-            <w:tcW w:type="dxa" w:w="1881"/>
-          </w:tcPr>
-          <w:p>
-            <w:r/>
-            <w:r>
-              <w:rPr>
-                <w:rFonts w:ascii="Times New Roman" w:hAnsi="Times New Roman" w:eastAsia="Times New Roman"/>
-                <w:b w:val="0"/>
-                <w:i w:val="0"/>
-                <w:color w:val="000000"/>
-                <w:sz w:val="14"/>
-              </w:rPr>
-              <w:t>86507000</w:t>
-            </w:r>
-          </w:p>
-        </w:tc>
-        <w:tc>
-          <w:tcPr>
-            <w:tcW w:type="dxa" w:w="1881"/>
-          </w:tcPr>
-          <w:p>
-            <w:r/>
-            <w:r>
-              <w:rPr>
-                <w:rFonts w:ascii="Times New Roman" w:hAnsi="Times New Roman" w:eastAsia="Times New Roman"/>
-                <w:b w:val="0"/>
-                <w:i w:val="0"/>
-                <w:color w:val="000000"/>
-                <w:sz w:val="14"/>
-              </w:rPr>
-              <w:t>Carreiro</w:t>
-            </w:r>
-          </w:p>
-        </w:tc>
-        <w:tc>
-          <w:tcPr>
-            <w:tcW w:type="dxa" w:w="1881"/>
-          </w:tcPr>
-          <w:p>
-            <w:r/>
-            <w:r>
-              <w:rPr>
-                <w:rFonts w:ascii="Times New Roman" w:hAnsi="Times New Roman" w:eastAsia="Times New Roman"/>
-                <w:b w:val="0"/>
-                <w:i w:val="0"/>
-                <w:color w:val="000000"/>
-                <w:sz w:val="14"/>
-              </w:rPr>
-              <w:t>não recuperada</w:t>
-            </w:r>
-          </w:p>
-        </w:tc>
-        <w:tc>
-          <w:tcPr>
-            <w:tcW w:type="dxa" w:w="1881"/>
-          </w:tcPr>
-          <w:p>
-            <w:r/>
-            <w:r>
-              <w:rPr>
-                <w:rFonts w:ascii="Times New Roman" w:hAnsi="Times New Roman" w:eastAsia="Times New Roman"/>
-                <w:b w:val="0"/>
-                <w:i w:val="0"/>
-                <w:color w:val="000000"/>
-                <w:sz w:val="14"/>
-              </w:rPr>
-              <w:t>não recuperada</w:t>
-            </w:r>
-          </w:p>
-        </w:tc>
-        <w:tc>
-          <w:tcPr>
-            <w:tcW w:type="dxa" w:w="1881"/>
+            <w:tcW w:type="dxa" w:w="2351"/>
           </w:tcPr>
           <w:p>
             <w:r/>
@@ -985,99 +933,7 @@
       <w:tr>
         <w:tc>
           <w:tcPr>
-            <w:tcW w:type="dxa" w:w="1881"/>
-          </w:tcPr>
-          <w:p>
-            <w:r/>
-            <w:r>
-              <w:rPr>
-                <w:rFonts w:ascii="Times New Roman" w:hAnsi="Times New Roman" w:eastAsia="Times New Roman"/>
-                <w:b w:val="0"/>
-                <w:i w:val="0"/>
-                <w:color w:val="000000"/>
-                <w:sz w:val="14"/>
-              </w:rPr>
-              <w:t>86298000</w:t>
-            </w:r>
-          </w:p>
-        </w:tc>
-        <w:tc>
-          <w:tcPr>
-            <w:tcW w:type="dxa" w:w="1881"/>
-          </w:tcPr>
-          <w:p>
-            <w:r/>
-            <w:r>
-              <w:rPr>
-                <w:rFonts w:ascii="Times New Roman" w:hAnsi="Times New Roman" w:eastAsia="Times New Roman"/>
-                <w:b w:val="0"/>
-                <w:i w:val="0"/>
-                <w:color w:val="000000"/>
-                <w:sz w:val="14"/>
-              </w:rPr>
-              <w:t>Nome HidroWeb a confirmar</w:t>
-            </w:r>
-          </w:p>
-        </w:tc>
-        <w:tc>
-          <w:tcPr>
-            <w:tcW w:type="dxa" w:w="1881"/>
-          </w:tcPr>
-          <w:p>
-            <w:r/>
-            <w:r>
-              <w:rPr>
-                <w:rFonts w:ascii="Times New Roman" w:hAnsi="Times New Roman" w:eastAsia="Times New Roman"/>
-                <w:b w:val="0"/>
-                <w:i w:val="0"/>
-                <w:color w:val="000000"/>
-                <w:sz w:val="14"/>
-              </w:rPr>
-              <w:t>não recuperada</w:t>
-            </w:r>
-          </w:p>
-        </w:tc>
-        <w:tc>
-          <w:tcPr>
-            <w:tcW w:type="dxa" w:w="1881"/>
-          </w:tcPr>
-          <w:p>
-            <w:r/>
-            <w:r>
-              <w:rPr>
-                <w:rFonts w:ascii="Times New Roman" w:hAnsi="Times New Roman" w:eastAsia="Times New Roman"/>
-                <w:b w:val="0"/>
-                <w:i w:val="0"/>
-                <w:color w:val="000000"/>
-                <w:sz w:val="14"/>
-              </w:rPr>
-              <w:t>não recuperada</w:t>
-            </w:r>
-          </w:p>
-        </w:tc>
-        <w:tc>
-          <w:tcPr>
-            <w:tcW w:type="dxa" w:w="1881"/>
-          </w:tcPr>
-          <w:p>
-            <w:r/>
-            <w:r>
-              <w:rPr>
-                <w:rFonts w:ascii="Times New Roman" w:hAnsi="Times New Roman" w:eastAsia="Times New Roman"/>
-                <w:b w:val="0"/>
-                <w:i w:val="0"/>
-                <w:color w:val="000000"/>
-                <w:sz w:val="14"/>
-              </w:rPr>
-              <w:t>—</w:t>
-            </w:r>
-          </w:p>
-        </w:tc>
-      </w:tr>
-      <w:tr>
-        <w:tc>
-          <w:tcPr>
-            <w:tcW w:type="dxa" w:w="1881"/>
+            <w:tcW w:type="dxa" w:w="2351"/>
           </w:tcPr>
           <w:p>
             <w:r/>
@@ -1095,7 +951,7 @@
         </w:tc>
         <w:tc>
           <w:tcPr>
-            <w:tcW w:type="dxa" w:w="1881"/>
+            <w:tcW w:type="dxa" w:w="2351"/>
           </w:tcPr>
           <w:p>
             <w:r/>
@@ -1107,13 +963,13 @@
                 <w:color w:val="000000"/>
                 <w:sz w:val="14"/>
               </w:rPr>
-              <w:t>Nome HidroWeb a confirmar</w:t>
+              <w:t>Estacao 86430900</w:t>
             </w:r>
           </w:p>
         </w:tc>
         <w:tc>
           <w:tcPr>
-            <w:tcW w:type="dxa" w:w="1881"/>
+            <w:tcW w:type="dxa" w:w="2351"/>
           </w:tcPr>
           <w:p>
             <w:r/>
@@ -1125,31 +981,13 @@
                 <w:color w:val="000000"/>
                 <w:sz w:val="14"/>
               </w:rPr>
-              <w:t>não recuperada</w:t>
+              <w:t>—</w:t>
             </w:r>
           </w:p>
         </w:tc>
         <w:tc>
           <w:tcPr>
-            <w:tcW w:type="dxa" w:w="1881"/>
-          </w:tcPr>
-          <w:p>
-            <w:r/>
-            <w:r>
-              <w:rPr>
-                <w:rFonts w:ascii="Times New Roman" w:hAnsi="Times New Roman" w:eastAsia="Times New Roman"/>
-                <w:b w:val="0"/>
-                <w:i w:val="0"/>
-                <w:color w:val="000000"/>
-                <w:sz w:val="14"/>
-              </w:rPr>
-              <w:t>não recuperada</w:t>
-            </w:r>
-          </w:p>
-        </w:tc>
-        <w:tc>
-          <w:tcPr>
-            <w:tcW w:type="dxa" w:w="1881"/>
+            <w:tcW w:type="dxa" w:w="2351"/>
           </w:tcPr>
           <w:p>
             <w:r/>
@@ -1180,7 +1018,7 @@
           <w:color w:val="000000"/>
           <w:sz w:val="24"/>
         </w:rPr>
-        <w:t>A série de nível é horária. As fichas combinam, conforme a rodada, o nível local e suas diferenças (D–x h, primeira diferença) e acelerações (A–x h, segunda diferença), níveis de montante e a chuva média acumulada em 36 h. Essa chuva é preditor de estado antecedente, não previsão de precipitação no horizonte. O modelo selecionado em 2 h não inclui chuva: em duas horas o sinal que ainda pode chegar à régua está, em grande parte, na rede de níveis. Em 4–12 h a chuva de 36 h entra como volume já observado.</w:t>
+        <w:t>A série de nível é horária. As fichas combinam, conforme a rodada, o nível local e suas diferenças (D–x h, primeira diferença) e acelerações (A–x h, segunda diferença), níveis de montante e a chuva média acumulada em 36 h. No recorte de 282 redes, nenhuma das 10 redes de 2 h usa chuva; as 117 redes de 4 h e as redes selecionadas de 8 h e 12 h usam chuva média acumulada em 36 h. Isso é o que o catálogo registra, não um tempo de viagem medido.</w:t>
       </w:r>
     </w:p>
     <w:p>
@@ -1196,7 +1034,7 @@
           <w:color w:val="000000"/>
           <w:sz w:val="24"/>
         </w:rPr>
-        <w:t>A cota de 1.500 cm é limiar de pesquisa para leituras públicas de cheia em Santa Tereza; não entra no treino como classe. As inundações de 2023–2024 registraram picos acima desse limiar na série pública do posto (2.365 cm em 4 de setembro de 2023, 2.161 cm em 18 de novembro de 2023 e 2.232 cm em 29 de abril de 2024). Os dados são partidos por eventos de cheia, não por janela aleatória. Treino, validação e teste trocam de papel entre rotações (R01–R10 no 2 h; onze rótulos no 4 h, inclusive uma partição de referência; ondas distintas no 8 h). O evento 13 foi retirado de várias campanhas curtas por ser pouco informativo — decisão de processo, não uniforme em todos os horizontes, e que precisa ser reconciliada com a coluna de teste do 4 h, a qual repete o mesmo rótulo nas 117 linhas e não deve ser usada.</w:t>
+        <w:t>A cota de 1.500 cm é o limiar de pesquisa das leituras públicas de cheia em Santa Tereza no painel do projeto (research_visual_patterns_santa_tereza_latest.json); não entra no treino como classe. Esse arquivo registra picos de 2.365 cm em 4 de setembro de 2023, 2.161 cm em 18 de novembro de 2023 e 2.232 cm em 29 de abril de 2024. Os dados das redes são partidos por eventos de cheia, não por janela aleatória. Treino, validação e teste trocam de papel entre rotações (R01–R10 no 2 h; onze rótulos no 4 h, inclusive uma partição de referência; ondas distintas no 8 h). O evento 13 foi retirado de várias campanhas curtas por ser pouco informativo — decisão de processo, não uniforme em todos os horizontes. A coluna evento_teste do 4 h repete o mesmo rótulo nas 117 linhas e não deve ser usada; a partição de 4 h lê-se no campo rotacao.</w:t>
       </w:r>
     </w:p>
     <w:p>
@@ -1260,7 +1098,7 @@
           <w:color w:val="000000"/>
           <w:sz w:val="24"/>
         </w:rPr>
-        <w:t>Os pesos são reinicializados de forma independente. O valor típico neste inventário é de dez inicializações; inicializações que reproduzem as mesmas métricas contam como o mesmo modelo. Dornelles, Goldenfum e Pedrollo (2013) observaram estabilização do desempenho após cerca de 30 inicializações: o presente conjunto usa um número menor, o que se declara como limitação de treinamento, não como equivalente àquele protocolo. O número de neurônios ocultos segue, na quase totalidade do conjunto, a regra heurística de dois neurônios por variável de entrada (nos quatro modelos selecionados: 30, 48, 20 e 28 neurônios para 15, 24, 10 e 14 entradas). Oliveira, Pedrollo e Castro (2014) adotaram, com apoio do critério de Akaike, um número de neurônios igual ou inferior ao de entradas. A regra 2n deste inventário é palpite de capacidade, não o resultado de uma busca em grade nem a aplicação daquele critério.</w:t>
+        <w:t>Os pesos são reinicializados de forma independente. O campo nit das fichas dos quatro modelos selecionados vale 10; inicializações que reproduzem as mesmas métricas contam como o mesmo modelo. Dornelles, Goldenfum e Pedrollo (2013) discutiram a repetição do treinamento; o número usado aqui é o das fichas, não a equivalência a outro protocolo. O número de neurônios ocultos nos quatro modelos selecionados é o dobro das entradas (30, 48, 20 e 28 neurônios para 15, 24, 10 e 14 entradas). Oliveira, Pedrollo e Castro (2014) adotaram, com apoio do critério de Akaike, um número de neurônios igual ou inferior ao de entradas. A regra 2n deste inventário não é o resultado de uma busca em grade nem a aplicação daquele critério.</w:t>
       </w:r>
     </w:p>
     <w:p>
@@ -1372,7 +1210,7 @@
           <w:color w:val="000000"/>
           <w:sz w:val="24"/>
         </w:rPr>
-        <w:t>O Quadro 1 traz as principais combinações examinadas em 2 h, 4 h e 8 h e, de forma compacta, a montagem do horizonte 12 h. O quadro descreve só as variáveis, sem métricas de desempenho. Em 8 h, depois de unificar aliases do catálogo, restam 14 conjuntos; o quadro traz C0289, C0078 e C0265 — a mais recorrente, uma montagem com Ituim e a mais enxuta entre as frequentes. As defasagens (por exemplo Ituim D–11 h, Carreiro D–16 h, montante A–20 h no horizonte de 2 h) só têm sentido físico se o tempo de viagem couber na hora-base (Matos, Pedrollo e Castro, 2014).</w:t>
+        <w:t>O Quadro 1 traz as principais combinações examinadas em 2 h, 4 h e 8 h e, de forma compacta, a montagem do horizonte 12 h. O quadro descreve só as variáveis, sem métricas de desempenho. Em 8 h, depois de unificar aliases do catálogo, restam 14 conjuntos; o quadro traz C0289, C0078 e C0265 — a mais recorrente, uma montagem com Ituim e a mais enxuta entre as frequentes. Tempo de viagem das defasagens não está no recorte.</w:t>
       </w:r>
     </w:p>
     <w:p>
@@ -3325,7 +3163,7 @@
           <w:color w:val="000000"/>
           <w:sz w:val="24"/>
         </w:rPr>
-        <w:t>Em 2 h a única montagem do conjunto filtrado (15 entradas de nível, sem chuva, 30 neurônios) gerou dez rotações de eventos; todas têm equilíbrio acima de 0,90 também quando se reaplica o mínimo dos três PERS. O modelo selecionado testa os eventos 10, 15 e 16 e é a rede em operação experimental contínua — fato de implantação, não evidência adicional de teste. Pode-se observar que o MAE de teste de 3,5 cm não deve ser lido como o MAE da janela móvel de 2 de setembro de 2026 (12,2 cm em 2 h). São contratos distintos: partição por eventos de cheia versus pares recentes conferidos no serviço experimental. O mesmo vale em 4 h (MAE de teste 13,9 cm; 33,6 cm na janela de setembro da configuração de referência do serviço, que não coincide com o modelo selecionado de 4 h) e em 8 h (MAE de teste 32 cm; 31,1 cm na janela de setembro). A proximidade numérica em 8 h é coincidência de janela, não validação cruzada.</w:t>
+        <w:t>Em 2 h a única montagem do conjunto filtrado (15 entradas de nível, sem chuva, 30 neurônios) gerou dez rotações de eventos; todas têm equilíbrio acima de 0,90 também quando se reaplica o mínimo dos três PERS. O modelo selecionado testa os eventos 10, 15 e 16 e é a rede em operação experimental contínua — fato de implantação, não evidência adicional de teste. O MAE de teste da ficha (3,5 cm em 2 h; 13,9 cm em 4 h; 32 cm em 8 h) não é o MAE de uma janela móvel do serviço experimental: são contratos distintos (partição por eventos de cheia versus pares recentes conferidos no feed).</w:t>
       </w:r>
     </w:p>
     <w:p>
@@ -3341,7 +3179,7 @@
           <w:color w:val="000000"/>
           <w:sz w:val="24"/>
         </w:rPr>
-        <w:t>Em 4 h o conjunto tem 117 redes ALT, todas com chuva de 36 h. O modelo selecionado é a montagem ampliada de 24 entradas e 48 neurônios. A leitura segura da partição é o identificador de rotação (R10 testa os eventos 19 e 21). Uma seleção anterior por NS de teste em subconjunto estreito de entradas não sobrevive a este conjunto filtrado. Oliveira, Pedrollo e Castro (2014, 2015) escolheriam, diante de um ganho quantitativo pequeno, o modelo mais simples e fisicamente consistente: no rio Ijuí, a RNA de três entradas (NS 0,904) foi preferida à de dez entradas (NS 0,907) após análise de sensibilidade. Neste inventário o critério publicado elegeu o conjunto mais largo das seis montagens aninhadas. Sem índice de contribuição nem curvas de Lek, não se pode atribuir o ganho a um posto isolado (Carreiro, 86298000 ou uma defasagem) nem afirmar que as 24 entradas são hidrologicamente necessárias. A seleção por equilíbrio e a parcimônia da escola IPH não coincidem neste horizonte; declara-se essa divergência em vez de forçar uma narrativa de simplificação que o catálogo não sustenta.</w:t>
+        <w:t>Em 4 h o conjunto tem 117 redes ALT, todas com chuva de 36 h. O modelo selecionado é a montagem ampliada de 24 entradas e 48 neurônios. A leitura segura da partição é o identificador de rotação (R10 testa os eventos 19 e 21). Oliveira, Pedrollo e Castro (2014) selecionaram redes mais simples depois de análise de sensibilidade; Oliveira, Pedrollo e Castro (2015) mostraram que retirar entradas pouco informativas pode melhorar o NS. Este inventário não tem essa análise. A rede de 24 entradas entra aqui porque é a de maior score_equilibrio no horizonte de 4 h, com NS de teste 0,993 e MAE 13,9 cm. A ficha imprime equilíbrio 0,846; o mínimo entre os três PERS publicados é 0,876 (teste). O identificador MATLAB é o mesmo nos dois critérios. Sem índice de contribuição nem curvas de Lek, o catálogo não atribui o ganho a um posto isolado nem afirma que as 24 entradas são hidrologicamente necessárias.</w:t>
       </w:r>
     </w:p>
     <w:p>
@@ -3373,7 +3211,7 @@
           <w:color w:val="000000"/>
           <w:sz w:val="24"/>
         </w:rPr>
-        <w:t>A previsão de persistência — manter o nível da hora-base — já é uma referência difícil de superar em 2 h, de modo que o PERS, e não o NS isolado, é o ganho que importa (Kitanidis e Bras, 1980). NS de teste da ordem de 0,99 em 2–4 h descreve sobretudo a inércia do hidrograma; não autoriza escolher rede por uma partição só, nem ranquear horizontes, nem comparar desempenho com Finck (2020). Aquele estudo treinou RNAs em estações de jusante, com NS médio da ordem de 0,93 / 0,89 / 0,71 em 8, 12 e 24 h. Santa Tereza está a montante; o período, o filtro de chuva e o horizonte de 24 h não coincidem. O que se pode afirmar é a mesma família de modelos, na mesma bacia, com o mesmo tipo de alvo (nível na régua).</w:t>
+        <w:t>A previsão de persistência — manter o nível da hora-base — já é uma referência difícil de superar em 2 h, de modo que o PERS, e não o NS isolado, é o ganho que importa (Kitanidis e Bras, 1980). NS de teste da ordem de 0,99 em 2–4 h descreve sobretudo a inércia da série de nível; não autoriza escolher rede por uma partição só, nem ranquear horizontes, nem comparar desempenho com Finck (2020). Aquele estudo treinou RNAs em Encantado, Estrela, Porto Mariante e Taquari, com NS médio de 0,93, 0,89 e 0,71 em 8, 12 e 24 h (resumo da dissertação). O recorte deste artigo é o posto 86472600; período, filtro de chuva e horizonte de 24 h não coincidem.</w:t>
       </w:r>
     </w:p>
     <w:p>
@@ -3853,22 +3691,6 @@
           <w:color w:val="000000"/>
           <w:sz w:val="22"/>
         </w:rPr>
-        <w:t>NEVO, S. et al. Flood forecasting with machine learning models in an operational framework. Hydrology and Earth System Sciences, v. 26, p. 4013–4032, 2022. DOI: https://doi.org/10.5194/hess-26-4013-2022.</w:t>
-      </w:r>
-    </w:p>
-    <w:p>
-      <w:pPr>
-        <w:spacing w:after="120" w:line="276" w:lineRule="auto"/>
-        <w:ind w:hanging="709" w:left="709"/>
-      </w:pPr>
-      <w:r>
-        <w:rPr>
-          <w:rFonts w:ascii="Times New Roman" w:hAnsi="Times New Roman" w:eastAsia="Times New Roman"/>
-          <w:b w:val="0"/>
-          <w:i w:val="0"/>
-          <w:color w:val="000000"/>
-          <w:sz w:val="22"/>
-        </w:rPr>
         <w:t>OLIVEIRA, G. G.; PEDROLLO, O. C.; CASTRO, N. M. R. Metodologia de análise de sensibilidade e exclusão de variáveis de entrada em simulação hidrológica por Redes Neurais Artificiais (RNAs): resultados preliminares. In: Anais do XIX Simpósio Brasileiro de Recursos Hídricos, Maceió, 2011.</w:t>
       </w:r>
     </w:p>

</xml_diff>

<commit_message>
Formata tabelas e quadros no padrão ABNT/IBGE.
A Tabela 1 passa a ter título acima com travessão, só traços horizontais,
fonte e nota abaixo, e colunas numéricas sem cabeçalho quebrado. Quadros
mantêm moldura. Os números das fichas não mudam.

Co-authored-by: juliana carolino carolino reis <juliana.reis@ufrgs.br>
</commit_message>
<xml_diff>
--- a/pesquisas/manuscrito-drive.docx
+++ b/pesquisas/manuscrito-drive.docx
@@ -311,23 +311,7 @@
     </w:p>
     <w:p>
       <w:pPr>
-        <w:spacing w:after="120" w:line="360" w:lineRule="auto"/>
-        <w:ind w:firstLine="0"/>
-        <w:jc w:val="center"/>
-      </w:pPr>
-      <w:r>
-        <w:rPr>
-          <w:rFonts w:ascii="Times New Roman" w:hAnsi="Times New Roman" w:eastAsia="Times New Roman"/>
-          <w:b w:val="0"/>
-          <w:i/>
-          <w:color w:val="000000"/>
-          <w:sz w:val="20"/>
-        </w:rPr>
-        <w:t>Figura 1. Postos com latitude e longitude em previsao_ao_vivo.json (telemetria SGB/ANA do projeto). Carreiro, 86298000 e 86430900 não figuram: nesse arquivo a coordenada é nula. Sem hidrografia e sem área de drenagem.</w:t>
-      </w:r>
-    </w:p>
-    <w:p>
-      <w:pPr>
+        <w:spacing w:before="240"/>
         <w:ind w:firstLine="0"/>
         <w:jc w:val="center"/>
       </w:pPr>
@@ -368,27 +352,62 @@
     </w:p>
     <w:p>
       <w:pPr>
-        <w:spacing w:before="240" w:after="120" w:line="276" w:lineRule="auto"/>
+        <w:spacing w:after="200" w:line="360" w:lineRule="auto"/>
         <w:ind w:firstLine="0"/>
-        <w:jc w:val="center"/>
+        <w:jc w:val="left"/>
       </w:pPr>
       <w:r>
         <w:rPr>
           <w:rFonts w:ascii="Times New Roman" w:hAnsi="Times New Roman" w:eastAsia="Times New Roman"/>
           <w:b w:val="0"/>
-          <w:i/>
+          <w:i w:val="0"/>
           <w:color w:val="000000"/>
           <w:sz w:val="20"/>
         </w:rPr>
-        <w:t>Quadro 2. Postos das combinações principais. Código, nome e coordenadas copiados de previsao_ao_vivo.json. Travessão: latitude ou longitude nula nesse arquivo.</w:t>
+        <w:t>Figura 1 – Postos com latitude e longitude em previsao_ao_vivo.json (telemetria SGB/ANA do projeto). Carreiro, 86298000 e 86430900 não figuram: nesse arquivo a coordenada é nula. Sem hidrografia e sem área de drenagem.</w:t>
+      </w:r>
+    </w:p>
+    <w:p>
+      <w:pPr>
+        <w:spacing w:before="240" w:after="120" w:line="276" w:lineRule="auto"/>
+        <w:ind w:firstLine="0"/>
+        <w:jc w:val="left"/>
+      </w:pPr>
+      <w:r>
+        <w:rPr>
+          <w:rFonts w:ascii="Times New Roman" w:hAnsi="Times New Roman" w:eastAsia="Times New Roman"/>
+          <w:b/>
+          <w:i w:val="0"/>
+          <w:color w:val="000000"/>
+          <w:sz w:val="20"/>
+        </w:rPr>
+        <w:t>Quadro 2</w:t>
+      </w:r>
+      <w:r>
+        <w:rPr>
+          <w:rFonts w:ascii="Times New Roman" w:hAnsi="Times New Roman" w:eastAsia="Times New Roman"/>
+          <w:b w:val="0"/>
+          <w:i w:val="0"/>
+          <w:color w:val="000000"/>
+          <w:sz w:val="20"/>
+        </w:rPr>
+        <w:t xml:space="preserve"> – Postos das combinações principais</w:t>
       </w:r>
     </w:p>
     <w:tbl>
       <w:tblPr>
-        <w:tblStyle w:val="TableGrid"/>
         <w:tblW w:type="auto" w:w="0"/>
         <w:jc w:val="center"/>
+        <w:tblLayout w:type="autofit"/>
         <w:tblLook w:firstColumn="1" w:firstRow="1" w:lastColumn="0" w:lastRow="0" w:noHBand="0" w:noVBand="1" w:val="04A0"/>
+        <w:tblBorders>
+          <w:top w:val="nil"/>
+          <w:left w:val="nil"/>
+          <w:bottom w:val="nil"/>
+          <w:right w:val="nil"/>
+          <w:insideH w:val="nil"/>
+          <w:insideV w:val="nil"/>
+        </w:tblBorders>
       </w:tblPr>
       <w:tblGrid>
         <w:gridCol w:w="2351"/>
@@ -400,10 +419,16 @@
         <w:tc>
           <w:tcPr>
             <w:tcW w:type="dxa" w:w="2351"/>
-            <w:shd w:fill="E8EEE9" w:val="clear"/>
+            <w:tcBorders>
+              <w:top w:val="single" w:sz="8" w:space="0" w:color="000000"/>
+              <w:left w:val="single" w:sz="8" w:space="0" w:color="000000"/>
+              <w:bottom w:val="single" w:sz="8" w:space="0" w:color="000000"/>
+              <w:right w:val="single" w:sz="8" w:space="0" w:color="000000"/>
+            </w:tcBorders>
           </w:tcPr>
           <w:p>
             <w:pPr>
+              <w:spacing w:after="0"/>
               <w:jc w:val="center"/>
             </w:pPr>
             <w:r/>
@@ -413,7 +438,7 @@
                 <w:b/>
                 <w:i w:val="0"/>
                 <w:color w:val="000000"/>
-                <w:sz w:val="16"/>
+                <w:sz w:val="20"/>
               </w:rPr>
               <w:t>Código ANA/SGB</w:t>
             </w:r>
@@ -422,10 +447,16 @@
         <w:tc>
           <w:tcPr>
             <w:tcW w:type="dxa" w:w="2351"/>
-            <w:shd w:fill="E8EEE9" w:val="clear"/>
+            <w:tcBorders>
+              <w:top w:val="single" w:sz="8" w:space="0" w:color="000000"/>
+              <w:left w:val="single" w:sz="8" w:space="0" w:color="000000"/>
+              <w:bottom w:val="single" w:sz="8" w:space="0" w:color="000000"/>
+              <w:right w:val="single" w:sz="8" w:space="0" w:color="000000"/>
+            </w:tcBorders>
           </w:tcPr>
           <w:p>
             <w:pPr>
+              <w:spacing w:after="0"/>
               <w:jc w:val="center"/>
             </w:pPr>
             <w:r/>
@@ -435,7 +466,7 @@
                 <w:b/>
                 <w:i w:val="0"/>
                 <w:color w:val="000000"/>
-                <w:sz w:val="16"/>
+                <w:sz w:val="20"/>
               </w:rPr>
               <w:t>Nome na telemetria do projeto</w:t>
             </w:r>
@@ -444,10 +475,16 @@
         <w:tc>
           <w:tcPr>
             <w:tcW w:type="dxa" w:w="2351"/>
-            <w:shd w:fill="E8EEE9" w:val="clear"/>
+            <w:tcBorders>
+              <w:top w:val="single" w:sz="8" w:space="0" w:color="000000"/>
+              <w:left w:val="single" w:sz="8" w:space="0" w:color="000000"/>
+              <w:bottom w:val="single" w:sz="8" w:space="0" w:color="000000"/>
+              <w:right w:val="single" w:sz="8" w:space="0" w:color="000000"/>
+            </w:tcBorders>
           </w:tcPr>
           <w:p>
             <w:pPr>
+              <w:spacing w:after="0"/>
               <w:jc w:val="center"/>
             </w:pPr>
             <w:r/>
@@ -457,7 +494,7 @@
                 <w:b/>
                 <w:i w:val="0"/>
                 <w:color w:val="000000"/>
-                <w:sz w:val="16"/>
+                <w:sz w:val="20"/>
               </w:rPr>
               <w:t>Latitude</w:t>
             </w:r>
@@ -466,10 +503,16 @@
         <w:tc>
           <w:tcPr>
             <w:tcW w:type="dxa" w:w="2351"/>
-            <w:shd w:fill="E8EEE9" w:val="clear"/>
+            <w:tcBorders>
+              <w:top w:val="single" w:sz="8" w:space="0" w:color="000000"/>
+              <w:left w:val="single" w:sz="8" w:space="0" w:color="000000"/>
+              <w:bottom w:val="single" w:sz="8" w:space="0" w:color="000000"/>
+              <w:right w:val="single" w:sz="8" w:space="0" w:color="000000"/>
+            </w:tcBorders>
           </w:tcPr>
           <w:p>
             <w:pPr>
+              <w:spacing w:after="0"/>
               <w:jc w:val="center"/>
             </w:pPr>
             <w:r/>
@@ -479,7 +522,7 @@
                 <w:b/>
                 <w:i w:val="0"/>
                 <w:color w:val="000000"/>
-                <w:sz w:val="16"/>
+                <w:sz w:val="20"/>
               </w:rPr>
               <w:t>Longitude</w:t>
             </w:r>
@@ -490,8 +533,18 @@
         <w:tc>
           <w:tcPr>
             <w:tcW w:type="dxa" w:w="2351"/>
+            <w:tcBorders>
+              <w:top w:val="single" w:sz="8" w:space="0" w:color="000000"/>
+              <w:left w:val="single" w:sz="8" w:space="0" w:color="000000"/>
+              <w:bottom w:val="single" w:sz="8" w:space="0" w:color="000000"/>
+              <w:right w:val="single" w:sz="8" w:space="0" w:color="000000"/>
+            </w:tcBorders>
           </w:tcPr>
           <w:p>
+            <w:pPr>
+              <w:spacing w:after="0"/>
+              <w:jc w:val="left"/>
+            </w:pPr>
             <w:r/>
             <w:r>
               <w:rPr>
@@ -499,7 +552,7 @@
                 <w:b w:val="0"/>
                 <w:i w:val="0"/>
                 <w:color w:val="000000"/>
-                <w:sz w:val="14"/>
+                <w:sz w:val="20"/>
               </w:rPr>
               <w:t>86472600</w:t>
             </w:r>
@@ -508,8 +561,18 @@
         <w:tc>
           <w:tcPr>
             <w:tcW w:type="dxa" w:w="2351"/>
+            <w:tcBorders>
+              <w:top w:val="single" w:sz="8" w:space="0" w:color="000000"/>
+              <w:left w:val="single" w:sz="8" w:space="0" w:color="000000"/>
+              <w:bottom w:val="single" w:sz="8" w:space="0" w:color="000000"/>
+              <w:right w:val="single" w:sz="8" w:space="0" w:color="000000"/>
+            </w:tcBorders>
           </w:tcPr>
           <w:p>
+            <w:pPr>
+              <w:spacing w:after="0"/>
+              <w:jc w:val="left"/>
+            </w:pPr>
             <w:r/>
             <w:r>
               <w:rPr>
@@ -517,7 +580,7 @@
                 <w:b w:val="0"/>
                 <w:i w:val="0"/>
                 <w:color w:val="000000"/>
-                <w:sz w:val="14"/>
+                <w:sz w:val="20"/>
               </w:rPr>
               <w:t>Santa Tereza</w:t>
             </w:r>
@@ -526,8 +589,18 @@
         <w:tc>
           <w:tcPr>
             <w:tcW w:type="dxa" w:w="2351"/>
+            <w:tcBorders>
+              <w:top w:val="single" w:sz="8" w:space="0" w:color="000000"/>
+              <w:left w:val="single" w:sz="8" w:space="0" w:color="000000"/>
+              <w:bottom w:val="single" w:sz="8" w:space="0" w:color="000000"/>
+              <w:right w:val="single" w:sz="8" w:space="0" w:color="000000"/>
+            </w:tcBorders>
           </w:tcPr>
           <w:p>
+            <w:pPr>
+              <w:spacing w:after="0"/>
+              <w:jc w:val="left"/>
+            </w:pPr>
             <w:r/>
             <w:r>
               <w:rPr>
@@ -535,7 +608,7 @@
                 <w:b w:val="0"/>
                 <w:i w:val="0"/>
                 <w:color w:val="000000"/>
-                <w:sz w:val="14"/>
+                <w:sz w:val="20"/>
               </w:rPr>
               <w:t>29,1781° S</w:t>
             </w:r>
@@ -544,8 +617,18 @@
         <w:tc>
           <w:tcPr>
             <w:tcW w:type="dxa" w:w="2351"/>
+            <w:tcBorders>
+              <w:top w:val="single" w:sz="8" w:space="0" w:color="000000"/>
+              <w:left w:val="single" w:sz="8" w:space="0" w:color="000000"/>
+              <w:bottom w:val="single" w:sz="8" w:space="0" w:color="000000"/>
+              <w:right w:val="single" w:sz="8" w:space="0" w:color="000000"/>
+            </w:tcBorders>
           </w:tcPr>
           <w:p>
+            <w:pPr>
+              <w:spacing w:after="0"/>
+              <w:jc w:val="left"/>
+            </w:pPr>
             <w:r/>
             <w:r>
               <w:rPr>
@@ -553,7 +636,7 @@
                 <w:b w:val="0"/>
                 <w:i w:val="0"/>
                 <w:color w:val="000000"/>
-                <w:sz w:val="14"/>
+                <w:sz w:val="20"/>
               </w:rPr>
               <w:t>51,7322° W</w:t>
             </w:r>
@@ -564,8 +647,18 @@
         <w:tc>
           <w:tcPr>
             <w:tcW w:type="dxa" w:w="2351"/>
+            <w:tcBorders>
+              <w:top w:val="single" w:sz="8" w:space="0" w:color="000000"/>
+              <w:left w:val="single" w:sz="8" w:space="0" w:color="000000"/>
+              <w:bottom w:val="single" w:sz="8" w:space="0" w:color="000000"/>
+              <w:right w:val="single" w:sz="8" w:space="0" w:color="000000"/>
+            </w:tcBorders>
           </w:tcPr>
           <w:p>
+            <w:pPr>
+              <w:spacing w:after="0"/>
+              <w:jc w:val="left"/>
+            </w:pPr>
             <w:r/>
             <w:r>
               <w:rPr>
@@ -573,7 +666,7 @@
                 <w:b w:val="0"/>
                 <w:i w:val="0"/>
                 <w:color w:val="000000"/>
-                <w:sz w:val="14"/>
+                <w:sz w:val="20"/>
               </w:rPr>
               <w:t>86472000</w:t>
             </w:r>
@@ -582,8 +675,18 @@
         <w:tc>
           <w:tcPr>
             <w:tcW w:type="dxa" w:w="2351"/>
+            <w:tcBorders>
+              <w:top w:val="single" w:sz="8" w:space="0" w:color="000000"/>
+              <w:left w:val="single" w:sz="8" w:space="0" w:color="000000"/>
+              <w:bottom w:val="single" w:sz="8" w:space="0" w:color="000000"/>
+              <w:right w:val="single" w:sz="8" w:space="0" w:color="000000"/>
+            </w:tcBorders>
           </w:tcPr>
           <w:p>
+            <w:pPr>
+              <w:spacing w:after="0"/>
+              <w:jc w:val="left"/>
+            </w:pPr>
             <w:r/>
             <w:r>
               <w:rPr>
@@ -591,7 +694,7 @@
                 <w:b w:val="0"/>
                 <w:i w:val="0"/>
                 <w:color w:val="000000"/>
-                <w:sz w:val="14"/>
+                <w:sz w:val="20"/>
               </w:rPr>
               <w:t>Linha Jose Julio / Rio das Antas montante</w:t>
             </w:r>
@@ -600,8 +703,18 @@
         <w:tc>
           <w:tcPr>
             <w:tcW w:type="dxa" w:w="2351"/>
+            <w:tcBorders>
+              <w:top w:val="single" w:sz="8" w:space="0" w:color="000000"/>
+              <w:left w:val="single" w:sz="8" w:space="0" w:color="000000"/>
+              <w:bottom w:val="single" w:sz="8" w:space="0" w:color="000000"/>
+              <w:right w:val="single" w:sz="8" w:space="0" w:color="000000"/>
+            </w:tcBorders>
           </w:tcPr>
           <w:p>
+            <w:pPr>
+              <w:spacing w:after="0"/>
+              <w:jc w:val="left"/>
+            </w:pPr>
             <w:r/>
             <w:r>
               <w:rPr>
@@ -609,7 +722,7 @@
                 <w:b w:val="0"/>
                 <w:i w:val="0"/>
                 <w:color w:val="000000"/>
-                <w:sz w:val="14"/>
+                <w:sz w:val="20"/>
               </w:rPr>
               <w:t>29,0978° S</w:t>
             </w:r>
@@ -618,8 +731,18 @@
         <w:tc>
           <w:tcPr>
             <w:tcW w:type="dxa" w:w="2351"/>
+            <w:tcBorders>
+              <w:top w:val="single" w:sz="8" w:space="0" w:color="000000"/>
+              <w:left w:val="single" w:sz="8" w:space="0" w:color="000000"/>
+              <w:bottom w:val="single" w:sz="8" w:space="0" w:color="000000"/>
+              <w:right w:val="single" w:sz="8" w:space="0" w:color="000000"/>
+            </w:tcBorders>
           </w:tcPr>
           <w:p>
+            <w:pPr>
+              <w:spacing w:after="0"/>
+              <w:jc w:val="left"/>
+            </w:pPr>
             <w:r/>
             <w:r>
               <w:rPr>
@@ -627,7 +750,7 @@
                 <w:b w:val="0"/>
                 <w:i w:val="0"/>
                 <w:color w:val="000000"/>
-                <w:sz w:val="14"/>
+                <w:sz w:val="20"/>
               </w:rPr>
               <w:t>51,6997° W</w:t>
             </w:r>
@@ -638,8 +761,18 @@
         <w:tc>
           <w:tcPr>
             <w:tcW w:type="dxa" w:w="2351"/>
+            <w:tcBorders>
+              <w:top w:val="single" w:sz="8" w:space="0" w:color="000000"/>
+              <w:left w:val="single" w:sz="8" w:space="0" w:color="000000"/>
+              <w:bottom w:val="single" w:sz="8" w:space="0" w:color="000000"/>
+              <w:right w:val="single" w:sz="8" w:space="0" w:color="000000"/>
+            </w:tcBorders>
           </w:tcPr>
           <w:p>
+            <w:pPr>
+              <w:spacing w:after="0"/>
+              <w:jc w:val="left"/>
+            </w:pPr>
             <w:r/>
             <w:r>
               <w:rPr>
@@ -647,7 +780,7 @@
                 <w:b w:val="0"/>
                 <w:i w:val="0"/>
                 <w:color w:val="000000"/>
-                <w:sz w:val="14"/>
+                <w:sz w:val="20"/>
               </w:rPr>
               <w:t>86448000</w:t>
             </w:r>
@@ -656,8 +789,18 @@
         <w:tc>
           <w:tcPr>
             <w:tcW w:type="dxa" w:w="2351"/>
+            <w:tcBorders>
+              <w:top w:val="single" w:sz="8" w:space="0" w:color="000000"/>
+              <w:left w:val="single" w:sz="8" w:space="0" w:color="000000"/>
+              <w:bottom w:val="single" w:sz="8" w:space="0" w:color="000000"/>
+              <w:right w:val="single" w:sz="8" w:space="0" w:color="000000"/>
+            </w:tcBorders>
           </w:tcPr>
           <w:p>
+            <w:pPr>
+              <w:spacing w:after="0"/>
+              <w:jc w:val="left"/>
+            </w:pPr>
             <w:r/>
             <w:r>
               <w:rPr>
@@ -665,7 +808,7 @@
                 <w:b w:val="0"/>
                 <w:i w:val="0"/>
                 <w:color w:val="000000"/>
-                <w:sz w:val="14"/>
+                <w:sz w:val="20"/>
               </w:rPr>
               <w:t>Veranopolis / Rio das Antas</w:t>
             </w:r>
@@ -674,8 +817,18 @@
         <w:tc>
           <w:tcPr>
             <w:tcW w:type="dxa" w:w="2351"/>
+            <w:tcBorders>
+              <w:top w:val="single" w:sz="8" w:space="0" w:color="000000"/>
+              <w:left w:val="single" w:sz="8" w:space="0" w:color="000000"/>
+              <w:bottom w:val="single" w:sz="8" w:space="0" w:color="000000"/>
+              <w:right w:val="single" w:sz="8" w:space="0" w:color="000000"/>
+            </w:tcBorders>
           </w:tcPr>
           <w:p>
+            <w:pPr>
+              <w:spacing w:after="0"/>
+              <w:jc w:val="left"/>
+            </w:pPr>
             <w:r/>
             <w:r>
               <w:rPr>
@@ -683,7 +836,7 @@
                 <w:b w:val="0"/>
                 <w:i w:val="0"/>
                 <w:color w:val="000000"/>
-                <w:sz w:val="14"/>
+                <w:sz w:val="20"/>
               </w:rPr>
               <w:t>29,0292° S</w:t>
             </w:r>
@@ -692,8 +845,18 @@
         <w:tc>
           <w:tcPr>
             <w:tcW w:type="dxa" w:w="2351"/>
+            <w:tcBorders>
+              <w:top w:val="single" w:sz="8" w:space="0" w:color="000000"/>
+              <w:left w:val="single" w:sz="8" w:space="0" w:color="000000"/>
+              <w:bottom w:val="single" w:sz="8" w:space="0" w:color="000000"/>
+              <w:right w:val="single" w:sz="8" w:space="0" w:color="000000"/>
+            </w:tcBorders>
           </w:tcPr>
           <w:p>
+            <w:pPr>
+              <w:spacing w:after="0"/>
+              <w:jc w:val="left"/>
+            </w:pPr>
             <w:r/>
             <w:r>
               <w:rPr>
@@ -701,7 +864,7 @@
                 <w:b w:val="0"/>
                 <w:i w:val="0"/>
                 <w:color w:val="000000"/>
-                <w:sz w:val="14"/>
+                <w:sz w:val="20"/>
               </w:rPr>
               <w:t>51,5219° W</w:t>
             </w:r>
@@ -712,8 +875,18 @@
         <w:tc>
           <w:tcPr>
             <w:tcW w:type="dxa" w:w="2351"/>
+            <w:tcBorders>
+              <w:top w:val="single" w:sz="8" w:space="0" w:color="000000"/>
+              <w:left w:val="single" w:sz="8" w:space="0" w:color="000000"/>
+              <w:bottom w:val="single" w:sz="8" w:space="0" w:color="000000"/>
+              <w:right w:val="single" w:sz="8" w:space="0" w:color="000000"/>
+            </w:tcBorders>
           </w:tcPr>
           <w:p>
+            <w:pPr>
+              <w:spacing w:after="0"/>
+              <w:jc w:val="left"/>
+            </w:pPr>
             <w:r/>
             <w:r>
               <w:rPr>
@@ -721,7 +894,7 @@
                 <w:b w:val="0"/>
                 <w:i w:val="0"/>
                 <w:color w:val="000000"/>
-                <w:sz w:val="14"/>
+                <w:sz w:val="20"/>
               </w:rPr>
               <w:t>86125130</w:t>
             </w:r>
@@ -730,8 +903,18 @@
         <w:tc>
           <w:tcPr>
             <w:tcW w:type="dxa" w:w="2351"/>
+            <w:tcBorders>
+              <w:top w:val="single" w:sz="8" w:space="0" w:color="000000"/>
+              <w:left w:val="single" w:sz="8" w:space="0" w:color="000000"/>
+              <w:bottom w:val="single" w:sz="8" w:space="0" w:color="000000"/>
+              <w:right w:val="single" w:sz="8" w:space="0" w:color="000000"/>
+            </w:tcBorders>
           </w:tcPr>
           <w:p>
+            <w:pPr>
+              <w:spacing w:after="0"/>
+              <w:jc w:val="left"/>
+            </w:pPr>
             <w:r/>
             <w:r>
               <w:rPr>
@@ -739,7 +922,7 @@
                 <w:b w:val="0"/>
                 <w:i w:val="0"/>
                 <w:color w:val="000000"/>
-                <w:sz w:val="14"/>
+                <w:sz w:val="20"/>
               </w:rPr>
               <w:t>Ituim</w:t>
             </w:r>
@@ -748,8 +931,18 @@
         <w:tc>
           <w:tcPr>
             <w:tcW w:type="dxa" w:w="2351"/>
+            <w:tcBorders>
+              <w:top w:val="single" w:sz="8" w:space="0" w:color="000000"/>
+              <w:left w:val="single" w:sz="8" w:space="0" w:color="000000"/>
+              <w:bottom w:val="single" w:sz="8" w:space="0" w:color="000000"/>
+              <w:right w:val="single" w:sz="8" w:space="0" w:color="000000"/>
+            </w:tcBorders>
           </w:tcPr>
           <w:p>
+            <w:pPr>
+              <w:spacing w:after="0"/>
+              <w:jc w:val="left"/>
+            </w:pPr>
             <w:r/>
             <w:r>
               <w:rPr>
@@ -757,7 +950,7 @@
                 <w:b w:val="0"/>
                 <w:i w:val="0"/>
                 <w:color w:val="000000"/>
-                <w:sz w:val="14"/>
+                <w:sz w:val="20"/>
               </w:rPr>
               <w:t>28,5919° S</w:t>
             </w:r>
@@ -766,8 +959,18 @@
         <w:tc>
           <w:tcPr>
             <w:tcW w:type="dxa" w:w="2351"/>
+            <w:tcBorders>
+              <w:top w:val="single" w:sz="8" w:space="0" w:color="000000"/>
+              <w:left w:val="single" w:sz="8" w:space="0" w:color="000000"/>
+              <w:bottom w:val="single" w:sz="8" w:space="0" w:color="000000"/>
+              <w:right w:val="single" w:sz="8" w:space="0" w:color="000000"/>
+            </w:tcBorders>
           </w:tcPr>
           <w:p>
+            <w:pPr>
+              <w:spacing w:after="0"/>
+              <w:jc w:val="left"/>
+            </w:pPr>
             <w:r/>
             <w:r>
               <w:rPr>
@@ -775,7 +978,7 @@
                 <w:b w:val="0"/>
                 <w:i w:val="0"/>
                 <w:color w:val="000000"/>
-                <w:sz w:val="14"/>
+                <w:sz w:val="20"/>
               </w:rPr>
               <w:t>51,3247° W</w:t>
             </w:r>
@@ -786,8 +989,18 @@
         <w:tc>
           <w:tcPr>
             <w:tcW w:type="dxa" w:w="2351"/>
+            <w:tcBorders>
+              <w:top w:val="single" w:sz="8" w:space="0" w:color="000000"/>
+              <w:left w:val="single" w:sz="8" w:space="0" w:color="000000"/>
+              <w:bottom w:val="single" w:sz="8" w:space="0" w:color="000000"/>
+              <w:right w:val="single" w:sz="8" w:space="0" w:color="000000"/>
+            </w:tcBorders>
           </w:tcPr>
           <w:p>
+            <w:pPr>
+              <w:spacing w:after="0"/>
+              <w:jc w:val="left"/>
+            </w:pPr>
             <w:r/>
             <w:r>
               <w:rPr>
@@ -795,7 +1008,7 @@
                 <w:b w:val="0"/>
                 <w:i w:val="0"/>
                 <w:color w:val="000000"/>
-                <w:sz w:val="14"/>
+                <w:sz w:val="20"/>
               </w:rPr>
               <w:t>86507000</w:t>
             </w:r>
@@ -804,8 +1017,18 @@
         <w:tc>
           <w:tcPr>
             <w:tcW w:type="dxa" w:w="2351"/>
+            <w:tcBorders>
+              <w:top w:val="single" w:sz="8" w:space="0" w:color="000000"/>
+              <w:left w:val="single" w:sz="8" w:space="0" w:color="000000"/>
+              <w:bottom w:val="single" w:sz="8" w:space="0" w:color="000000"/>
+              <w:right w:val="single" w:sz="8" w:space="0" w:color="000000"/>
+            </w:tcBorders>
           </w:tcPr>
           <w:p>
+            <w:pPr>
+              <w:spacing w:after="0"/>
+              <w:jc w:val="left"/>
+            </w:pPr>
             <w:r/>
             <w:r>
               <w:rPr>
@@ -813,7 +1036,7 @@
                 <w:b w:val="0"/>
                 <w:i w:val="0"/>
                 <w:color w:val="000000"/>
-                <w:sz w:val="14"/>
+                <w:sz w:val="20"/>
               </w:rPr>
               <w:t>Carreiro</w:t>
             </w:r>
@@ -822,8 +1045,18 @@
         <w:tc>
           <w:tcPr>
             <w:tcW w:type="dxa" w:w="2351"/>
+            <w:tcBorders>
+              <w:top w:val="single" w:sz="8" w:space="0" w:color="000000"/>
+              <w:left w:val="single" w:sz="8" w:space="0" w:color="000000"/>
+              <w:bottom w:val="single" w:sz="8" w:space="0" w:color="000000"/>
+              <w:right w:val="single" w:sz="8" w:space="0" w:color="000000"/>
+            </w:tcBorders>
           </w:tcPr>
           <w:p>
+            <w:pPr>
+              <w:spacing w:after="0"/>
+              <w:jc w:val="left"/>
+            </w:pPr>
             <w:r/>
             <w:r>
               <w:rPr>
@@ -831,7 +1064,7 @@
                 <w:b w:val="0"/>
                 <w:i w:val="0"/>
                 <w:color w:val="000000"/>
-                <w:sz w:val="14"/>
+                <w:sz w:val="20"/>
               </w:rPr>
               <w:t>—</w:t>
             </w:r>
@@ -840,8 +1073,18 @@
         <w:tc>
           <w:tcPr>
             <w:tcW w:type="dxa" w:w="2351"/>
+            <w:tcBorders>
+              <w:top w:val="single" w:sz="8" w:space="0" w:color="000000"/>
+              <w:left w:val="single" w:sz="8" w:space="0" w:color="000000"/>
+              <w:bottom w:val="single" w:sz="8" w:space="0" w:color="000000"/>
+              <w:right w:val="single" w:sz="8" w:space="0" w:color="000000"/>
+            </w:tcBorders>
           </w:tcPr>
           <w:p>
+            <w:pPr>
+              <w:spacing w:after="0"/>
+              <w:jc w:val="left"/>
+            </w:pPr>
             <w:r/>
             <w:r>
               <w:rPr>
@@ -849,7 +1092,7 @@
                 <w:b w:val="0"/>
                 <w:i w:val="0"/>
                 <w:color w:val="000000"/>
-                <w:sz w:val="14"/>
+                <w:sz w:val="20"/>
               </w:rPr>
               <w:t>—</w:t>
             </w:r>
@@ -860,8 +1103,18 @@
         <w:tc>
           <w:tcPr>
             <w:tcW w:type="dxa" w:w="2351"/>
+            <w:tcBorders>
+              <w:top w:val="single" w:sz="8" w:space="0" w:color="000000"/>
+              <w:left w:val="single" w:sz="8" w:space="0" w:color="000000"/>
+              <w:bottom w:val="single" w:sz="8" w:space="0" w:color="000000"/>
+              <w:right w:val="single" w:sz="8" w:space="0" w:color="000000"/>
+            </w:tcBorders>
           </w:tcPr>
           <w:p>
+            <w:pPr>
+              <w:spacing w:after="0"/>
+              <w:jc w:val="left"/>
+            </w:pPr>
             <w:r/>
             <w:r>
               <w:rPr>
@@ -869,7 +1122,7 @@
                 <w:b w:val="0"/>
                 <w:i w:val="0"/>
                 <w:color w:val="000000"/>
-                <w:sz w:val="14"/>
+                <w:sz w:val="20"/>
               </w:rPr>
               <w:t>86298000</w:t>
             </w:r>
@@ -878,8 +1131,18 @@
         <w:tc>
           <w:tcPr>
             <w:tcW w:type="dxa" w:w="2351"/>
+            <w:tcBorders>
+              <w:top w:val="single" w:sz="8" w:space="0" w:color="000000"/>
+              <w:left w:val="single" w:sz="8" w:space="0" w:color="000000"/>
+              <w:bottom w:val="single" w:sz="8" w:space="0" w:color="000000"/>
+              <w:right w:val="single" w:sz="8" w:space="0" w:color="000000"/>
+            </w:tcBorders>
           </w:tcPr>
           <w:p>
+            <w:pPr>
+              <w:spacing w:after="0"/>
+              <w:jc w:val="left"/>
+            </w:pPr>
             <w:r/>
             <w:r>
               <w:rPr>
@@ -887,7 +1150,7 @@
                 <w:b w:val="0"/>
                 <w:i w:val="0"/>
                 <w:color w:val="000000"/>
-                <w:sz w:val="14"/>
+                <w:sz w:val="20"/>
               </w:rPr>
               <w:t>Estacao 86298000 - montante (input 4h PRO)</w:t>
             </w:r>
@@ -896,8 +1159,18 @@
         <w:tc>
           <w:tcPr>
             <w:tcW w:type="dxa" w:w="2351"/>
+            <w:tcBorders>
+              <w:top w:val="single" w:sz="8" w:space="0" w:color="000000"/>
+              <w:left w:val="single" w:sz="8" w:space="0" w:color="000000"/>
+              <w:bottom w:val="single" w:sz="8" w:space="0" w:color="000000"/>
+              <w:right w:val="single" w:sz="8" w:space="0" w:color="000000"/>
+            </w:tcBorders>
           </w:tcPr>
           <w:p>
+            <w:pPr>
+              <w:spacing w:after="0"/>
+              <w:jc w:val="left"/>
+            </w:pPr>
             <w:r/>
             <w:r>
               <w:rPr>
@@ -905,7 +1178,7 @@
                 <w:b w:val="0"/>
                 <w:i w:val="0"/>
                 <w:color w:val="000000"/>
-                <w:sz w:val="14"/>
+                <w:sz w:val="20"/>
               </w:rPr>
               <w:t>—</w:t>
             </w:r>
@@ -914,8 +1187,18 @@
         <w:tc>
           <w:tcPr>
             <w:tcW w:type="dxa" w:w="2351"/>
+            <w:tcBorders>
+              <w:top w:val="single" w:sz="8" w:space="0" w:color="000000"/>
+              <w:left w:val="single" w:sz="8" w:space="0" w:color="000000"/>
+              <w:bottom w:val="single" w:sz="8" w:space="0" w:color="000000"/>
+              <w:right w:val="single" w:sz="8" w:space="0" w:color="000000"/>
+            </w:tcBorders>
           </w:tcPr>
           <w:p>
+            <w:pPr>
+              <w:spacing w:after="0"/>
+              <w:jc w:val="left"/>
+            </w:pPr>
             <w:r/>
             <w:r>
               <w:rPr>
@@ -923,7 +1206,7 @@
                 <w:b w:val="0"/>
                 <w:i w:val="0"/>
                 <w:color w:val="000000"/>
-                <w:sz w:val="14"/>
+                <w:sz w:val="20"/>
               </w:rPr>
               <w:t>—</w:t>
             </w:r>
@@ -934,8 +1217,18 @@
         <w:tc>
           <w:tcPr>
             <w:tcW w:type="dxa" w:w="2351"/>
+            <w:tcBorders>
+              <w:top w:val="single" w:sz="8" w:space="0" w:color="000000"/>
+              <w:left w:val="single" w:sz="8" w:space="0" w:color="000000"/>
+              <w:bottom w:val="single" w:sz="8" w:space="0" w:color="000000"/>
+              <w:right w:val="single" w:sz="8" w:space="0" w:color="000000"/>
+            </w:tcBorders>
           </w:tcPr>
           <w:p>
+            <w:pPr>
+              <w:spacing w:after="0"/>
+              <w:jc w:val="left"/>
+            </w:pPr>
             <w:r/>
             <w:r>
               <w:rPr>
@@ -943,7 +1236,7 @@
                 <w:b w:val="0"/>
                 <w:i w:val="0"/>
                 <w:color w:val="000000"/>
-                <w:sz w:val="14"/>
+                <w:sz w:val="20"/>
               </w:rPr>
               <w:t>86430900</w:t>
             </w:r>
@@ -952,8 +1245,18 @@
         <w:tc>
           <w:tcPr>
             <w:tcW w:type="dxa" w:w="2351"/>
+            <w:tcBorders>
+              <w:top w:val="single" w:sz="8" w:space="0" w:color="000000"/>
+              <w:left w:val="single" w:sz="8" w:space="0" w:color="000000"/>
+              <w:bottom w:val="single" w:sz="8" w:space="0" w:color="000000"/>
+              <w:right w:val="single" w:sz="8" w:space="0" w:color="000000"/>
+            </w:tcBorders>
           </w:tcPr>
           <w:p>
+            <w:pPr>
+              <w:spacing w:after="0"/>
+              <w:jc w:val="left"/>
+            </w:pPr>
             <w:r/>
             <w:r>
               <w:rPr>
@@ -961,7 +1264,7 @@
                 <w:b w:val="0"/>
                 <w:i w:val="0"/>
                 <w:color w:val="000000"/>
-                <w:sz w:val="14"/>
+                <w:sz w:val="20"/>
               </w:rPr>
               <w:t>Estacao 86430900</w:t>
             </w:r>
@@ -970,8 +1273,18 @@
         <w:tc>
           <w:tcPr>
             <w:tcW w:type="dxa" w:w="2351"/>
+            <w:tcBorders>
+              <w:top w:val="single" w:sz="8" w:space="0" w:color="000000"/>
+              <w:left w:val="single" w:sz="8" w:space="0" w:color="000000"/>
+              <w:bottom w:val="single" w:sz="8" w:space="0" w:color="000000"/>
+              <w:right w:val="single" w:sz="8" w:space="0" w:color="000000"/>
+            </w:tcBorders>
           </w:tcPr>
           <w:p>
+            <w:pPr>
+              <w:spacing w:after="0"/>
+              <w:jc w:val="left"/>
+            </w:pPr>
             <w:r/>
             <w:r>
               <w:rPr>
@@ -979,7 +1292,7 @@
                 <w:b w:val="0"/>
                 <w:i w:val="0"/>
                 <w:color w:val="000000"/>
-                <w:sz w:val="14"/>
+                <w:sz w:val="20"/>
               </w:rPr>
               <w:t>—</w:t>
             </w:r>
@@ -988,8 +1301,18 @@
         <w:tc>
           <w:tcPr>
             <w:tcW w:type="dxa" w:w="2351"/>
+            <w:tcBorders>
+              <w:top w:val="single" w:sz="8" w:space="0" w:color="000000"/>
+              <w:left w:val="single" w:sz="8" w:space="0" w:color="000000"/>
+              <w:bottom w:val="single" w:sz="8" w:space="0" w:color="000000"/>
+              <w:right w:val="single" w:sz="8" w:space="0" w:color="000000"/>
+            </w:tcBorders>
           </w:tcPr>
           <w:p>
+            <w:pPr>
+              <w:spacing w:after="0"/>
+              <w:jc w:val="left"/>
+            </w:pPr>
             <w:r/>
             <w:r>
               <w:rPr>
@@ -997,7 +1320,7 @@
                 <w:b w:val="0"/>
                 <w:i w:val="0"/>
                 <w:color w:val="000000"/>
-                <w:sz w:val="14"/>
+                <w:sz w:val="20"/>
               </w:rPr>
               <w:t>—</w:t>
             </w:r>
@@ -1005,6 +1328,60 @@
         </w:tc>
       </w:tr>
     </w:tbl>
+    <w:p>
+      <w:pPr>
+        <w:spacing w:before="80" w:after="40" w:line="276" w:lineRule="auto"/>
+        <w:ind w:firstLine="0"/>
+        <w:jc w:val="left"/>
+      </w:pPr>
+      <w:r>
+        <w:rPr>
+          <w:rFonts w:ascii="Times New Roman" w:hAnsi="Times New Roman" w:eastAsia="Times New Roman"/>
+          <w:b/>
+          <w:i w:val="0"/>
+          <w:color w:val="000000"/>
+          <w:sz w:val="20"/>
+        </w:rPr>
+        <w:t xml:space="preserve">Fonte: </w:t>
+      </w:r>
+      <w:r>
+        <w:rPr>
+          <w:rFonts w:ascii="Times New Roman" w:hAnsi="Times New Roman" w:eastAsia="Times New Roman"/>
+          <w:b w:val="0"/>
+          <w:i w:val="0"/>
+          <w:color w:val="000000"/>
+          <w:sz w:val="20"/>
+        </w:rPr>
+        <w:t>previsao_ao_vivo.json (telemetria SGB/ANA do projeto).</w:t>
+      </w:r>
+    </w:p>
+    <w:p>
+      <w:pPr>
+        <w:spacing w:after="200" w:line="276" w:lineRule="auto"/>
+        <w:ind w:firstLine="0"/>
+        <w:jc w:val="left"/>
+      </w:pPr>
+      <w:r>
+        <w:rPr>
+          <w:rFonts w:ascii="Times New Roman" w:hAnsi="Times New Roman" w:eastAsia="Times New Roman"/>
+          <w:b/>
+          <w:i w:val="0"/>
+          <w:color w:val="000000"/>
+          <w:sz w:val="20"/>
+        </w:rPr>
+        <w:t xml:space="preserve">Nota: </w:t>
+      </w:r>
+      <w:r>
+        <w:rPr>
+          <w:rFonts w:ascii="Times New Roman" w:hAnsi="Times New Roman" w:eastAsia="Times New Roman"/>
+          <w:b w:val="0"/>
+          <w:i w:val="0"/>
+          <w:color w:val="000000"/>
+          <w:sz w:val="20"/>
+        </w:rPr>
+        <w:t>Travessão indica latitude ou longitude nula nesse arquivo.</w:t>
+      </w:r>
+    </w:p>
     <w:p>
       <w:pPr>
         <w:spacing w:after="160" w:line="360" w:lineRule="auto"/>
@@ -1217,25 +1594,43 @@
       <w:pPr>
         <w:spacing w:before="240" w:after="120" w:line="276" w:lineRule="auto"/>
         <w:ind w:firstLine="0"/>
-        <w:jc w:val="center"/>
+        <w:jc w:val="left"/>
       </w:pPr>
       <w:r>
         <w:rPr>
           <w:rFonts w:ascii="Times New Roman" w:hAnsi="Times New Roman" w:eastAsia="Times New Roman"/>
-          <w:b w:val="0"/>
-          <w:i/>
+          <w:b/>
+          <w:i w:val="0"/>
           <w:color w:val="000000"/>
           <w:sz w:val="20"/>
         </w:rPr>
-        <w:t>Quadro 1. Principais combinações de variáveis examinadas em Santa Tereza. Sem métricas de desempenho.</w:t>
+        <w:t>Quadro 1</w:t>
+      </w:r>
+      <w:r>
+        <w:rPr>
+          <w:rFonts w:ascii="Times New Roman" w:hAnsi="Times New Roman" w:eastAsia="Times New Roman"/>
+          <w:b w:val="0"/>
+          <w:i w:val="0"/>
+          <w:color w:val="000000"/>
+          <w:sz w:val="20"/>
+        </w:rPr>
+        <w:t xml:space="preserve"> – Principais combinações de variáveis examinadas em Santa Tereza</w:t>
       </w:r>
     </w:p>
     <w:tbl>
       <w:tblPr>
-        <w:tblStyle w:val="TableGrid"/>
         <w:tblW w:type="auto" w:w="0"/>
         <w:jc w:val="center"/>
+        <w:tblLayout w:type="autofit"/>
         <w:tblLook w:firstColumn="1" w:firstRow="1" w:lastColumn="0" w:lastRow="0" w:noHBand="0" w:noVBand="1" w:val="04A0"/>
+        <w:tblBorders>
+          <w:top w:val="nil"/>
+          <w:left w:val="nil"/>
+          <w:bottom w:val="nil"/>
+          <w:right w:val="nil"/>
+          <w:insideH w:val="nil"/>
+          <w:insideV w:val="nil"/>
+        </w:tblBorders>
       </w:tblPr>
       <w:tblGrid>
         <w:gridCol w:w="2351"/>
@@ -1247,10 +1642,16 @@
         <w:tc>
           <w:tcPr>
             <w:tcW w:type="dxa" w:w="2351"/>
-            <w:shd w:fill="E8EEE9" w:val="clear"/>
+            <w:tcBorders>
+              <w:top w:val="single" w:sz="8" w:space="0" w:color="000000"/>
+              <w:left w:val="single" w:sz="8" w:space="0" w:color="000000"/>
+              <w:bottom w:val="single" w:sz="8" w:space="0" w:color="000000"/>
+              <w:right w:val="single" w:sz="8" w:space="0" w:color="000000"/>
+            </w:tcBorders>
           </w:tcPr>
           <w:p>
             <w:pPr>
+              <w:spacing w:after="0"/>
               <w:jc w:val="center"/>
             </w:pPr>
             <w:r/>
@@ -1260,7 +1661,7 @@
                 <w:b/>
                 <w:i w:val="0"/>
                 <w:color w:val="000000"/>
-                <w:sz w:val="16"/>
+                <w:sz w:val="20"/>
               </w:rPr>
               <w:t>Horizonte</w:t>
             </w:r>
@@ -1269,10 +1670,16 @@
         <w:tc>
           <w:tcPr>
             <w:tcW w:type="dxa" w:w="2351"/>
-            <w:shd w:fill="E8EEE9" w:val="clear"/>
+            <w:tcBorders>
+              <w:top w:val="single" w:sz="8" w:space="0" w:color="000000"/>
+              <w:left w:val="single" w:sz="8" w:space="0" w:color="000000"/>
+              <w:bottom w:val="single" w:sz="8" w:space="0" w:color="000000"/>
+              <w:right w:val="single" w:sz="8" w:space="0" w:color="000000"/>
+            </w:tcBorders>
           </w:tcPr>
           <w:p>
             <w:pPr>
+              <w:spacing w:after="0"/>
               <w:jc w:val="center"/>
             </w:pPr>
             <w:r/>
@@ -1282,7 +1689,7 @@
                 <w:b/>
                 <w:i w:val="0"/>
                 <w:color w:val="000000"/>
-                <w:sz w:val="16"/>
+                <w:sz w:val="20"/>
               </w:rPr>
               <w:t>Combinação</w:t>
             </w:r>
@@ -1291,10 +1698,16 @@
         <w:tc>
           <w:tcPr>
             <w:tcW w:type="dxa" w:w="2351"/>
-            <w:shd w:fill="E8EEE9" w:val="clear"/>
+            <w:tcBorders>
+              <w:top w:val="single" w:sz="8" w:space="0" w:color="000000"/>
+              <w:left w:val="single" w:sz="8" w:space="0" w:color="000000"/>
+              <w:bottom w:val="single" w:sz="8" w:space="0" w:color="000000"/>
+              <w:right w:val="single" w:sz="8" w:space="0" w:color="000000"/>
+            </w:tcBorders>
           </w:tcPr>
           <w:p>
             <w:pPr>
+              <w:spacing w:after="0"/>
               <w:jc w:val="center"/>
             </w:pPr>
             <w:r/>
@@ -1304,7 +1717,7 @@
                 <w:b/>
                 <w:i w:val="0"/>
                 <w:color w:val="000000"/>
-                <w:sz w:val="16"/>
+                <w:sz w:val="20"/>
               </w:rPr>
               <w:t>N var.</w:t>
             </w:r>
@@ -1313,10 +1726,16 @@
         <w:tc>
           <w:tcPr>
             <w:tcW w:type="dxa" w:w="2351"/>
-            <w:shd w:fill="E8EEE9" w:val="clear"/>
+            <w:tcBorders>
+              <w:top w:val="single" w:sz="8" w:space="0" w:color="000000"/>
+              <w:left w:val="single" w:sz="8" w:space="0" w:color="000000"/>
+              <w:bottom w:val="single" w:sz="8" w:space="0" w:color="000000"/>
+              <w:right w:val="single" w:sz="8" w:space="0" w:color="000000"/>
+            </w:tcBorders>
           </w:tcPr>
           <w:p>
             <w:pPr>
+              <w:spacing w:after="0"/>
               <w:jc w:val="center"/>
             </w:pPr>
             <w:r/>
@@ -1326,7 +1745,7 @@
                 <w:b/>
                 <w:i w:val="0"/>
                 <w:color w:val="000000"/>
-                <w:sz w:val="16"/>
+                <w:sz w:val="20"/>
               </w:rPr>
               <w:t>Variáveis</w:t>
             </w:r>
@@ -1337,8 +1756,18 @@
         <w:tc>
           <w:tcPr>
             <w:tcW w:type="dxa" w:w="2351"/>
+            <w:tcBorders>
+              <w:top w:val="single" w:sz="8" w:space="0" w:color="000000"/>
+              <w:left w:val="single" w:sz="8" w:space="0" w:color="000000"/>
+              <w:bottom w:val="single" w:sz="8" w:space="0" w:color="000000"/>
+              <w:right w:val="single" w:sz="8" w:space="0" w:color="000000"/>
+            </w:tcBorders>
           </w:tcPr>
           <w:p>
+            <w:pPr>
+              <w:spacing w:after="0"/>
+              <w:jc w:val="left"/>
+            </w:pPr>
             <w:r/>
             <w:r>
               <w:rPr>
@@ -1346,7 +1775,7 @@
                 <w:b w:val="0"/>
                 <w:i w:val="0"/>
                 <w:color w:val="000000"/>
-                <w:sz w:val="14"/>
+                <w:sz w:val="20"/>
               </w:rPr>
               <w:t>2 h</w:t>
             </w:r>
@@ -1355,8 +1784,18 @@
         <w:tc>
           <w:tcPr>
             <w:tcW w:type="dxa" w:w="2351"/>
+            <w:tcBorders>
+              <w:top w:val="single" w:sz="8" w:space="0" w:color="000000"/>
+              <w:left w:val="single" w:sz="8" w:space="0" w:color="000000"/>
+              <w:bottom w:val="single" w:sz="8" w:space="0" w:color="000000"/>
+              <w:right w:val="single" w:sz="8" w:space="0" w:color="000000"/>
+            </w:tcBorders>
           </w:tcPr>
           <w:p>
+            <w:pPr>
+              <w:spacing w:after="0"/>
+              <w:jc w:val="left"/>
+            </w:pPr>
             <w:r/>
             <w:r>
               <w:rPr>
@@ -1364,7 +1803,7 @@
                 <w:b w:val="0"/>
                 <w:i w:val="0"/>
                 <w:color w:val="000000"/>
-                <w:sz w:val="14"/>
+                <w:sz w:val="20"/>
               </w:rPr>
               <w:t>Nível local e montante, sem chuva</w:t>
             </w:r>
@@ -1373,8 +1812,18 @@
         <w:tc>
           <w:tcPr>
             <w:tcW w:type="dxa" w:w="2351"/>
+            <w:tcBorders>
+              <w:top w:val="single" w:sz="8" w:space="0" w:color="000000"/>
+              <w:left w:val="single" w:sz="8" w:space="0" w:color="000000"/>
+              <w:bottom w:val="single" w:sz="8" w:space="0" w:color="000000"/>
+              <w:right w:val="single" w:sz="8" w:space="0" w:color="000000"/>
+            </w:tcBorders>
           </w:tcPr>
           <w:p>
+            <w:pPr>
+              <w:spacing w:after="0"/>
+              <w:jc w:val="right"/>
+            </w:pPr>
             <w:r/>
             <w:r>
               <w:rPr>
@@ -1382,7 +1831,7 @@
                 <w:b w:val="0"/>
                 <w:i w:val="0"/>
                 <w:color w:val="000000"/>
-                <w:sz w:val="14"/>
+                <w:sz w:val="20"/>
               </w:rPr>
               <w:t>15</w:t>
             </w:r>
@@ -1391,8 +1840,18 @@
         <w:tc>
           <w:tcPr>
             <w:tcW w:type="dxa" w:w="2351"/>
+            <w:tcBorders>
+              <w:top w:val="single" w:sz="8" w:space="0" w:color="000000"/>
+              <w:left w:val="single" w:sz="8" w:space="0" w:color="000000"/>
+              <w:bottom w:val="single" w:sz="8" w:space="0" w:color="000000"/>
+              <w:right w:val="single" w:sz="8" w:space="0" w:color="000000"/>
+            </w:tcBorders>
           </w:tcPr>
           <w:p>
+            <w:pPr>
+              <w:spacing w:after="0"/>
+              <w:jc w:val="left"/>
+            </w:pPr>
             <w:r/>
             <w:r>
               <w:rPr>
@@ -1400,7 +1859,7 @@
                 <w:b w:val="0"/>
                 <w:i w:val="0"/>
                 <w:color w:val="000000"/>
-                <w:sz w:val="14"/>
+                <w:sz w:val="20"/>
               </w:rPr>
               <w:t>ST; ST D–1 h; ST D–2 h; ST D–4 h; ST A–1 h; ST A–2 h; ST A–4 h; ST D–8 h; ST A–12 h; montante; montante D–1 h; montante D–2 h; montante D–5 h; montante A–12 h; montante A–20 h</w:t>
             </w:r>
@@ -1411,8 +1870,18 @@
         <w:tc>
           <w:tcPr>
             <w:tcW w:type="dxa" w:w="2351"/>
+            <w:tcBorders>
+              <w:top w:val="single" w:sz="8" w:space="0" w:color="000000"/>
+              <w:left w:val="single" w:sz="8" w:space="0" w:color="000000"/>
+              <w:bottom w:val="single" w:sz="8" w:space="0" w:color="000000"/>
+              <w:right w:val="single" w:sz="8" w:space="0" w:color="000000"/>
+            </w:tcBorders>
           </w:tcPr>
           <w:p>
+            <w:pPr>
+              <w:spacing w:after="0"/>
+              <w:jc w:val="left"/>
+            </w:pPr>
             <w:r/>
             <w:r>
               <w:rPr>
@@ -1420,7 +1889,7 @@
                 <w:b w:val="0"/>
                 <w:i w:val="0"/>
                 <w:color w:val="000000"/>
-                <w:sz w:val="14"/>
+                <w:sz w:val="20"/>
               </w:rPr>
               <w:t>4 h</w:t>
             </w:r>
@@ -1429,8 +1898,18 @@
         <w:tc>
           <w:tcPr>
             <w:tcW w:type="dxa" w:w="2351"/>
+            <w:tcBorders>
+              <w:top w:val="single" w:sz="8" w:space="0" w:color="000000"/>
+              <w:left w:val="single" w:sz="8" w:space="0" w:color="000000"/>
+              <w:bottom w:val="single" w:sz="8" w:space="0" w:color="000000"/>
+              <w:right w:val="single" w:sz="8" w:space="0" w:color="000000"/>
+            </w:tcBorders>
           </w:tcPr>
           <w:p>
+            <w:pPr>
+              <w:spacing w:after="0"/>
+              <w:jc w:val="left"/>
+            </w:pPr>
             <w:r/>
             <w:r>
               <w:rPr>
@@ -1438,7 +1917,7 @@
                 <w:b w:val="0"/>
                 <w:i w:val="0"/>
                 <w:color w:val="000000"/>
-                <w:sz w:val="14"/>
+                <w:sz w:val="20"/>
               </w:rPr>
               <w:t>Núcleo 4 h</w:t>
             </w:r>
@@ -1447,8 +1926,18 @@
         <w:tc>
           <w:tcPr>
             <w:tcW w:type="dxa" w:w="2351"/>
+            <w:tcBorders>
+              <w:top w:val="single" w:sz="8" w:space="0" w:color="000000"/>
+              <w:left w:val="single" w:sz="8" w:space="0" w:color="000000"/>
+              <w:bottom w:val="single" w:sz="8" w:space="0" w:color="000000"/>
+              <w:right w:val="single" w:sz="8" w:space="0" w:color="000000"/>
+            </w:tcBorders>
           </w:tcPr>
           <w:p>
+            <w:pPr>
+              <w:spacing w:after="0"/>
+              <w:jc w:val="right"/>
+            </w:pPr>
             <w:r/>
             <w:r>
               <w:rPr>
@@ -1456,7 +1945,7 @@
                 <w:b w:val="0"/>
                 <w:i w:val="0"/>
                 <w:color w:val="000000"/>
-                <w:sz w:val="14"/>
+                <w:sz w:val="20"/>
               </w:rPr>
               <w:t>13</w:t>
             </w:r>
@@ -1465,8 +1954,18 @@
         <w:tc>
           <w:tcPr>
             <w:tcW w:type="dxa" w:w="2351"/>
+            <w:tcBorders>
+              <w:top w:val="single" w:sz="8" w:space="0" w:color="000000"/>
+              <w:left w:val="single" w:sz="8" w:space="0" w:color="000000"/>
+              <w:bottom w:val="single" w:sz="8" w:space="0" w:color="000000"/>
+              <w:right w:val="single" w:sz="8" w:space="0" w:color="000000"/>
+            </w:tcBorders>
           </w:tcPr>
           <w:p>
+            <w:pPr>
+              <w:spacing w:after="0"/>
+              <w:jc w:val="left"/>
+            </w:pPr>
             <w:r/>
             <w:r>
               <w:rPr>
@@ -1474,7 +1973,7 @@
                 <w:b w:val="0"/>
                 <w:i w:val="0"/>
                 <w:color w:val="000000"/>
-                <w:sz w:val="14"/>
+                <w:sz w:val="20"/>
               </w:rPr>
               <w:t>ST; ST D–1 h; chuva 36 h; montante; montante D–2 h; Veranópolis; montante A–14 h; Veranópolis D–14 h; Ituim; Ituim D–11 h; ST D–4 h; ST D–2 h; ST A–2 h</w:t>
             </w:r>
@@ -1485,8 +1984,18 @@
         <w:tc>
           <w:tcPr>
             <w:tcW w:type="dxa" w:w="2351"/>
+            <w:tcBorders>
+              <w:top w:val="single" w:sz="8" w:space="0" w:color="000000"/>
+              <w:left w:val="single" w:sz="8" w:space="0" w:color="000000"/>
+              <w:bottom w:val="single" w:sz="8" w:space="0" w:color="000000"/>
+              <w:right w:val="single" w:sz="8" w:space="0" w:color="000000"/>
+            </w:tcBorders>
           </w:tcPr>
           <w:p>
+            <w:pPr>
+              <w:spacing w:after="0"/>
+              <w:jc w:val="left"/>
+            </w:pPr>
             <w:r/>
             <w:r>
               <w:rPr>
@@ -1494,7 +2003,7 @@
                 <w:b w:val="0"/>
                 <w:i w:val="0"/>
                 <w:color w:val="000000"/>
-                <w:sz w:val="14"/>
+                <w:sz w:val="20"/>
               </w:rPr>
               <w:t>4 h</w:t>
             </w:r>
@@ -1503,8 +2012,18 @@
         <w:tc>
           <w:tcPr>
             <w:tcW w:type="dxa" w:w="2351"/>
+            <w:tcBorders>
+              <w:top w:val="single" w:sz="8" w:space="0" w:color="000000"/>
+              <w:left w:val="single" w:sz="8" w:space="0" w:color="000000"/>
+              <w:bottom w:val="single" w:sz="8" w:space="0" w:color="000000"/>
+              <w:right w:val="single" w:sz="8" w:space="0" w:color="000000"/>
+            </w:tcBorders>
           </w:tcPr>
           <w:p>
+            <w:pPr>
+              <w:spacing w:after="0"/>
+              <w:jc w:val="left"/>
+            </w:pPr>
             <w:r/>
             <w:r>
               <w:rPr>
@@ -1512,7 +2031,7 @@
                 <w:b w:val="0"/>
                 <w:i w:val="0"/>
                 <w:color w:val="000000"/>
-                <w:sz w:val="14"/>
+                <w:sz w:val="20"/>
               </w:rPr>
               <w:t>Núcleo + ST A–1 h + ST A–4 h + 86298000</w:t>
             </w:r>
@@ -1521,8 +2040,18 @@
         <w:tc>
           <w:tcPr>
             <w:tcW w:type="dxa" w:w="2351"/>
+            <w:tcBorders>
+              <w:top w:val="single" w:sz="8" w:space="0" w:color="000000"/>
+              <w:left w:val="single" w:sz="8" w:space="0" w:color="000000"/>
+              <w:bottom w:val="single" w:sz="8" w:space="0" w:color="000000"/>
+              <w:right w:val="single" w:sz="8" w:space="0" w:color="000000"/>
+            </w:tcBorders>
           </w:tcPr>
           <w:p>
+            <w:pPr>
+              <w:spacing w:after="0"/>
+              <w:jc w:val="right"/>
+            </w:pPr>
             <w:r/>
             <w:r>
               <w:rPr>
@@ -1530,7 +2059,7 @@
                 <w:b w:val="0"/>
                 <w:i w:val="0"/>
                 <w:color w:val="000000"/>
-                <w:sz w:val="14"/>
+                <w:sz w:val="20"/>
               </w:rPr>
               <w:t>16</w:t>
             </w:r>
@@ -1539,8 +2068,18 @@
         <w:tc>
           <w:tcPr>
             <w:tcW w:type="dxa" w:w="2351"/>
+            <w:tcBorders>
+              <w:top w:val="single" w:sz="8" w:space="0" w:color="000000"/>
+              <w:left w:val="single" w:sz="8" w:space="0" w:color="000000"/>
+              <w:bottom w:val="single" w:sz="8" w:space="0" w:color="000000"/>
+              <w:right w:val="single" w:sz="8" w:space="0" w:color="000000"/>
+            </w:tcBorders>
           </w:tcPr>
           <w:p>
+            <w:pPr>
+              <w:spacing w:after="0"/>
+              <w:jc w:val="left"/>
+            </w:pPr>
             <w:r/>
             <w:r>
               <w:rPr>
@@ -1548,7 +2087,7 @@
                 <w:b w:val="0"/>
                 <w:i w:val="0"/>
                 <w:color w:val="000000"/>
-                <w:sz w:val="14"/>
+                <w:sz w:val="20"/>
               </w:rPr>
               <w:t>Núcleo; ST A–1 h; ST A–4 h; 86298000</w:t>
             </w:r>
@@ -1559,8 +2098,18 @@
         <w:tc>
           <w:tcPr>
             <w:tcW w:type="dxa" w:w="2351"/>
+            <w:tcBorders>
+              <w:top w:val="single" w:sz="8" w:space="0" w:color="000000"/>
+              <w:left w:val="single" w:sz="8" w:space="0" w:color="000000"/>
+              <w:bottom w:val="single" w:sz="8" w:space="0" w:color="000000"/>
+              <w:right w:val="single" w:sz="8" w:space="0" w:color="000000"/>
+            </w:tcBorders>
           </w:tcPr>
           <w:p>
+            <w:pPr>
+              <w:spacing w:after="0"/>
+              <w:jc w:val="left"/>
+            </w:pPr>
             <w:r/>
             <w:r>
               <w:rPr>
@@ -1568,7 +2117,7 @@
                 <w:b w:val="0"/>
                 <w:i w:val="0"/>
                 <w:color w:val="000000"/>
-                <w:sz w:val="14"/>
+                <w:sz w:val="20"/>
               </w:rPr>
               <w:t>4 h</w:t>
             </w:r>
@@ -1577,8 +2126,18 @@
         <w:tc>
           <w:tcPr>
             <w:tcW w:type="dxa" w:w="2351"/>
+            <w:tcBorders>
+              <w:top w:val="single" w:sz="8" w:space="0" w:color="000000"/>
+              <w:left w:val="single" w:sz="8" w:space="0" w:color="000000"/>
+              <w:bottom w:val="single" w:sz="8" w:space="0" w:color="000000"/>
+              <w:right w:val="single" w:sz="8" w:space="0" w:color="000000"/>
+            </w:tcBorders>
           </w:tcPr>
           <w:p>
+            <w:pPr>
+              <w:spacing w:after="0"/>
+              <w:jc w:val="left"/>
+            </w:pPr>
             <w:r/>
             <w:r>
               <w:rPr>
@@ -1586,7 +2145,7 @@
                 <w:b w:val="0"/>
                 <w:i w:val="0"/>
                 <w:color w:val="000000"/>
-                <w:sz w:val="14"/>
+                <w:sz w:val="20"/>
               </w:rPr>
               <w:t>Núcleo ampliado (Carreiro e mais defasagens)</w:t>
             </w:r>
@@ -1595,8 +2154,18 @@
         <w:tc>
           <w:tcPr>
             <w:tcW w:type="dxa" w:w="2351"/>
+            <w:tcBorders>
+              <w:top w:val="single" w:sz="8" w:space="0" w:color="000000"/>
+              <w:left w:val="single" w:sz="8" w:space="0" w:color="000000"/>
+              <w:bottom w:val="single" w:sz="8" w:space="0" w:color="000000"/>
+              <w:right w:val="single" w:sz="8" w:space="0" w:color="000000"/>
+            </w:tcBorders>
           </w:tcPr>
           <w:p>
+            <w:pPr>
+              <w:spacing w:after="0"/>
+              <w:jc w:val="right"/>
+            </w:pPr>
             <w:r/>
             <w:r>
               <w:rPr>
@@ -1604,7 +2173,7 @@
                 <w:b w:val="0"/>
                 <w:i w:val="0"/>
                 <w:color w:val="000000"/>
-                <w:sz w:val="14"/>
+                <w:sz w:val="20"/>
               </w:rPr>
               <w:t>24</w:t>
             </w:r>
@@ -1613,8 +2182,18 @@
         <w:tc>
           <w:tcPr>
             <w:tcW w:type="dxa" w:w="2351"/>
+            <w:tcBorders>
+              <w:top w:val="single" w:sz="8" w:space="0" w:color="000000"/>
+              <w:left w:val="single" w:sz="8" w:space="0" w:color="000000"/>
+              <w:bottom w:val="single" w:sz="8" w:space="0" w:color="000000"/>
+              <w:right w:val="single" w:sz="8" w:space="0" w:color="000000"/>
+            </w:tcBorders>
           </w:tcPr>
           <w:p>
+            <w:pPr>
+              <w:spacing w:after="0"/>
+              <w:jc w:val="left"/>
+            </w:pPr>
             <w:r/>
             <w:r>
               <w:rPr>
@@ -1622,7 +2201,7 @@
                 <w:b w:val="0"/>
                 <w:i w:val="0"/>
                 <w:color w:val="000000"/>
-                <w:sz w:val="14"/>
+                <w:sz w:val="20"/>
               </w:rPr>
               <w:t>Núcleo de 16; montante D–4 h; montante D–1 h; montante A–12 h; Veranópolis D–12 h; Carreiro; Carreiro D–16 h; montante D–5 h; Ituim D–12 h</w:t>
             </w:r>
@@ -1633,8 +2212,18 @@
         <w:tc>
           <w:tcPr>
             <w:tcW w:type="dxa" w:w="2351"/>
+            <w:tcBorders>
+              <w:top w:val="single" w:sz="8" w:space="0" w:color="000000"/>
+              <w:left w:val="single" w:sz="8" w:space="0" w:color="000000"/>
+              <w:bottom w:val="single" w:sz="8" w:space="0" w:color="000000"/>
+              <w:right w:val="single" w:sz="8" w:space="0" w:color="000000"/>
+            </w:tcBorders>
           </w:tcPr>
           <w:p>
+            <w:pPr>
+              <w:spacing w:after="0"/>
+              <w:jc w:val="left"/>
+            </w:pPr>
             <w:r/>
             <w:r>
               <w:rPr>
@@ -1642,7 +2231,7 @@
                 <w:b w:val="0"/>
                 <w:i w:val="0"/>
                 <w:color w:val="000000"/>
-                <w:sz w:val="14"/>
+                <w:sz w:val="20"/>
               </w:rPr>
               <w:t>8 h</w:t>
             </w:r>
@@ -1651,8 +2240,18 @@
         <w:tc>
           <w:tcPr>
             <w:tcW w:type="dxa" w:w="2351"/>
+            <w:tcBorders>
+              <w:top w:val="single" w:sz="8" w:space="0" w:color="000000"/>
+              <w:left w:val="single" w:sz="8" w:space="0" w:color="000000"/>
+              <w:bottom w:val="single" w:sz="8" w:space="0" w:color="000000"/>
+              <w:right w:val="single" w:sz="8" w:space="0" w:color="000000"/>
+            </w:tcBorders>
           </w:tcPr>
           <w:p>
+            <w:pPr>
+              <w:spacing w:after="0"/>
+              <w:jc w:val="left"/>
+            </w:pPr>
             <w:r/>
             <w:r>
               <w:rPr>
@@ -1660,7 +2259,7 @@
                 <w:b w:val="0"/>
                 <w:i w:val="0"/>
                 <w:color w:val="000000"/>
-                <w:sz w:val="14"/>
+                <w:sz w:val="20"/>
               </w:rPr>
               <w:t>C0289</w:t>
             </w:r>
@@ -1669,8 +2268,18 @@
         <w:tc>
           <w:tcPr>
             <w:tcW w:type="dxa" w:w="2351"/>
+            <w:tcBorders>
+              <w:top w:val="single" w:sz="8" w:space="0" w:color="000000"/>
+              <w:left w:val="single" w:sz="8" w:space="0" w:color="000000"/>
+              <w:bottom w:val="single" w:sz="8" w:space="0" w:color="000000"/>
+              <w:right w:val="single" w:sz="8" w:space="0" w:color="000000"/>
+            </w:tcBorders>
           </w:tcPr>
           <w:p>
+            <w:pPr>
+              <w:spacing w:after="0"/>
+              <w:jc w:val="right"/>
+            </w:pPr>
             <w:r/>
             <w:r>
               <w:rPr>
@@ -1678,7 +2287,7 @@
                 <w:b w:val="0"/>
                 <w:i w:val="0"/>
                 <w:color w:val="000000"/>
-                <w:sz w:val="14"/>
+                <w:sz w:val="20"/>
               </w:rPr>
               <w:t>10</w:t>
             </w:r>
@@ -1687,8 +2296,18 @@
         <w:tc>
           <w:tcPr>
             <w:tcW w:type="dxa" w:w="2351"/>
+            <w:tcBorders>
+              <w:top w:val="single" w:sz="8" w:space="0" w:color="000000"/>
+              <w:left w:val="single" w:sz="8" w:space="0" w:color="000000"/>
+              <w:bottom w:val="single" w:sz="8" w:space="0" w:color="000000"/>
+              <w:right w:val="single" w:sz="8" w:space="0" w:color="000000"/>
+            </w:tcBorders>
           </w:tcPr>
           <w:p>
+            <w:pPr>
+              <w:spacing w:after="0"/>
+              <w:jc w:val="left"/>
+            </w:pPr>
             <w:r/>
             <w:r>
               <w:rPr>
@@ -1696,7 +2315,7 @@
                 <w:b w:val="0"/>
                 <w:i w:val="0"/>
                 <w:color w:val="000000"/>
-                <w:sz w:val="14"/>
+                <w:sz w:val="20"/>
               </w:rPr>
               <w:t>ST; ST D–1 h; chuva 36 h; montante; montante D–2 h; Veranópolis; montante A–14 h; Veranópolis D–14 h; 86430900; 86430900 D–14 h</w:t>
             </w:r>
@@ -1707,8 +2326,18 @@
         <w:tc>
           <w:tcPr>
             <w:tcW w:type="dxa" w:w="2351"/>
+            <w:tcBorders>
+              <w:top w:val="single" w:sz="8" w:space="0" w:color="000000"/>
+              <w:left w:val="single" w:sz="8" w:space="0" w:color="000000"/>
+              <w:bottom w:val="single" w:sz="8" w:space="0" w:color="000000"/>
+              <w:right w:val="single" w:sz="8" w:space="0" w:color="000000"/>
+            </w:tcBorders>
           </w:tcPr>
           <w:p>
+            <w:pPr>
+              <w:spacing w:after="0"/>
+              <w:jc w:val="left"/>
+            </w:pPr>
             <w:r/>
             <w:r>
               <w:rPr>
@@ -1716,7 +2345,7 @@
                 <w:b w:val="0"/>
                 <w:i w:val="0"/>
                 <w:color w:val="000000"/>
-                <w:sz w:val="14"/>
+                <w:sz w:val="20"/>
               </w:rPr>
               <w:t>8 h</w:t>
             </w:r>
@@ -1725,8 +2354,18 @@
         <w:tc>
           <w:tcPr>
             <w:tcW w:type="dxa" w:w="2351"/>
+            <w:tcBorders>
+              <w:top w:val="single" w:sz="8" w:space="0" w:color="000000"/>
+              <w:left w:val="single" w:sz="8" w:space="0" w:color="000000"/>
+              <w:bottom w:val="single" w:sz="8" w:space="0" w:color="000000"/>
+              <w:right w:val="single" w:sz="8" w:space="0" w:color="000000"/>
+            </w:tcBorders>
           </w:tcPr>
           <w:p>
+            <w:pPr>
+              <w:spacing w:after="0"/>
+              <w:jc w:val="left"/>
+            </w:pPr>
             <w:r/>
             <w:r>
               <w:rPr>
@@ -1734,7 +2373,7 @@
                 <w:b w:val="0"/>
                 <w:i w:val="0"/>
                 <w:color w:val="000000"/>
-                <w:sz w:val="14"/>
+                <w:sz w:val="20"/>
               </w:rPr>
               <w:t>C0078</w:t>
             </w:r>
@@ -1743,8 +2382,18 @@
         <w:tc>
           <w:tcPr>
             <w:tcW w:type="dxa" w:w="2351"/>
+            <w:tcBorders>
+              <w:top w:val="single" w:sz="8" w:space="0" w:color="000000"/>
+              <w:left w:val="single" w:sz="8" w:space="0" w:color="000000"/>
+              <w:bottom w:val="single" w:sz="8" w:space="0" w:color="000000"/>
+              <w:right w:val="single" w:sz="8" w:space="0" w:color="000000"/>
+            </w:tcBorders>
           </w:tcPr>
           <w:p>
+            <w:pPr>
+              <w:spacing w:after="0"/>
+              <w:jc w:val="right"/>
+            </w:pPr>
             <w:r/>
             <w:r>
               <w:rPr>
@@ -1752,7 +2401,7 @@
                 <w:b w:val="0"/>
                 <w:i w:val="0"/>
                 <w:color w:val="000000"/>
-                <w:sz w:val="14"/>
+                <w:sz w:val="20"/>
               </w:rPr>
               <w:t>11</w:t>
             </w:r>
@@ -1761,8 +2410,18 @@
         <w:tc>
           <w:tcPr>
             <w:tcW w:type="dxa" w:w="2351"/>
+            <w:tcBorders>
+              <w:top w:val="single" w:sz="8" w:space="0" w:color="000000"/>
+              <w:left w:val="single" w:sz="8" w:space="0" w:color="000000"/>
+              <w:bottom w:val="single" w:sz="8" w:space="0" w:color="000000"/>
+              <w:right w:val="single" w:sz="8" w:space="0" w:color="000000"/>
+            </w:tcBorders>
           </w:tcPr>
           <w:p>
+            <w:pPr>
+              <w:spacing w:after="0"/>
+              <w:jc w:val="left"/>
+            </w:pPr>
             <w:r/>
             <w:r>
               <w:rPr>
@@ -1770,7 +2429,7 @@
                 <w:b w:val="0"/>
                 <w:i w:val="0"/>
                 <w:color w:val="000000"/>
-                <w:sz w:val="14"/>
+                <w:sz w:val="20"/>
               </w:rPr>
               <w:t>ST; ST D–1 h; chuva 36 h; Veranópolis; Veranópolis D–14 h; Ituim; Ituim D–11 h; ST D–4 h; ST D–2 h; ST A–2 h; ST A–1 h</w:t>
             </w:r>
@@ -1781,8 +2440,18 @@
         <w:tc>
           <w:tcPr>
             <w:tcW w:type="dxa" w:w="2351"/>
+            <w:tcBorders>
+              <w:top w:val="single" w:sz="8" w:space="0" w:color="000000"/>
+              <w:left w:val="single" w:sz="8" w:space="0" w:color="000000"/>
+              <w:bottom w:val="single" w:sz="8" w:space="0" w:color="000000"/>
+              <w:right w:val="single" w:sz="8" w:space="0" w:color="000000"/>
+            </w:tcBorders>
           </w:tcPr>
           <w:p>
+            <w:pPr>
+              <w:spacing w:after="0"/>
+              <w:jc w:val="left"/>
+            </w:pPr>
             <w:r/>
             <w:r>
               <w:rPr>
@@ -1790,7 +2459,7 @@
                 <w:b w:val="0"/>
                 <w:i w:val="0"/>
                 <w:color w:val="000000"/>
-                <w:sz w:val="14"/>
+                <w:sz w:val="20"/>
               </w:rPr>
               <w:t>8 h</w:t>
             </w:r>
@@ -1799,8 +2468,18 @@
         <w:tc>
           <w:tcPr>
             <w:tcW w:type="dxa" w:w="2351"/>
+            <w:tcBorders>
+              <w:top w:val="single" w:sz="8" w:space="0" w:color="000000"/>
+              <w:left w:val="single" w:sz="8" w:space="0" w:color="000000"/>
+              <w:bottom w:val="single" w:sz="8" w:space="0" w:color="000000"/>
+              <w:right w:val="single" w:sz="8" w:space="0" w:color="000000"/>
+            </w:tcBorders>
           </w:tcPr>
           <w:p>
+            <w:pPr>
+              <w:spacing w:after="0"/>
+              <w:jc w:val="left"/>
+            </w:pPr>
             <w:r/>
             <w:r>
               <w:rPr>
@@ -1808,7 +2487,7 @@
                 <w:b w:val="0"/>
                 <w:i w:val="0"/>
                 <w:color w:val="000000"/>
-                <w:sz w:val="14"/>
+                <w:sz w:val="20"/>
               </w:rPr>
               <w:t>C0265</w:t>
             </w:r>
@@ -1817,8 +2496,18 @@
         <w:tc>
           <w:tcPr>
             <w:tcW w:type="dxa" w:w="2351"/>
+            <w:tcBorders>
+              <w:top w:val="single" w:sz="8" w:space="0" w:color="000000"/>
+              <w:left w:val="single" w:sz="8" w:space="0" w:color="000000"/>
+              <w:bottom w:val="single" w:sz="8" w:space="0" w:color="000000"/>
+              <w:right w:val="single" w:sz="8" w:space="0" w:color="000000"/>
+            </w:tcBorders>
           </w:tcPr>
           <w:p>
+            <w:pPr>
+              <w:spacing w:after="0"/>
+              <w:jc w:val="right"/>
+            </w:pPr>
             <w:r/>
             <w:r>
               <w:rPr>
@@ -1826,7 +2515,7 @@
                 <w:b w:val="0"/>
                 <w:i w:val="0"/>
                 <w:color w:val="000000"/>
-                <w:sz w:val="14"/>
+                <w:sz w:val="20"/>
               </w:rPr>
               <w:t>8</w:t>
             </w:r>
@@ -1835,8 +2524,18 @@
         <w:tc>
           <w:tcPr>
             <w:tcW w:type="dxa" w:w="2351"/>
+            <w:tcBorders>
+              <w:top w:val="single" w:sz="8" w:space="0" w:color="000000"/>
+              <w:left w:val="single" w:sz="8" w:space="0" w:color="000000"/>
+              <w:bottom w:val="single" w:sz="8" w:space="0" w:color="000000"/>
+              <w:right w:val="single" w:sz="8" w:space="0" w:color="000000"/>
+            </w:tcBorders>
           </w:tcPr>
           <w:p>
+            <w:pPr>
+              <w:spacing w:after="0"/>
+              <w:jc w:val="left"/>
+            </w:pPr>
             <w:r/>
             <w:r>
               <w:rPr>
@@ -1844,7 +2543,7 @@
                 <w:b w:val="0"/>
                 <w:i w:val="0"/>
                 <w:color w:val="000000"/>
-                <w:sz w:val="14"/>
+                <w:sz w:val="20"/>
               </w:rPr>
               <w:t>ST; ST D–1 h; chuva 36 h; montante; montante D–2 h; Veranópolis; montante A–14 h; Veranópolis D–14 h</w:t>
             </w:r>
@@ -1855,8 +2554,18 @@
         <w:tc>
           <w:tcPr>
             <w:tcW w:type="dxa" w:w="2351"/>
+            <w:tcBorders>
+              <w:top w:val="single" w:sz="8" w:space="0" w:color="000000"/>
+              <w:left w:val="single" w:sz="8" w:space="0" w:color="000000"/>
+              <w:bottom w:val="single" w:sz="8" w:space="0" w:color="000000"/>
+              <w:right w:val="single" w:sz="8" w:space="0" w:color="000000"/>
+            </w:tcBorders>
           </w:tcPr>
           <w:p>
+            <w:pPr>
+              <w:spacing w:after="0"/>
+              <w:jc w:val="left"/>
+            </w:pPr>
             <w:r/>
             <w:r>
               <w:rPr>
@@ -1864,7 +2573,7 @@
                 <w:b w:val="0"/>
                 <w:i w:val="0"/>
                 <w:color w:val="000000"/>
-                <w:sz w:val="14"/>
+                <w:sz w:val="20"/>
               </w:rPr>
               <w:t>12 h</w:t>
             </w:r>
@@ -1873,8 +2582,18 @@
         <w:tc>
           <w:tcPr>
             <w:tcW w:type="dxa" w:w="2351"/>
+            <w:tcBorders>
+              <w:top w:val="single" w:sz="8" w:space="0" w:color="000000"/>
+              <w:left w:val="single" w:sz="8" w:space="0" w:color="000000"/>
+              <w:bottom w:val="single" w:sz="8" w:space="0" w:color="000000"/>
+              <w:right w:val="single" w:sz="8" w:space="0" w:color="000000"/>
+            </w:tcBorders>
           </w:tcPr>
           <w:p>
+            <w:pPr>
+              <w:spacing w:after="0"/>
+              <w:jc w:val="left"/>
+            </w:pPr>
             <w:r/>
             <w:r>
               <w:rPr>
@@ -1882,7 +2601,7 @@
                 <w:b w:val="0"/>
                 <w:i w:val="0"/>
                 <w:color w:val="000000"/>
-                <w:sz w:val="14"/>
+                <w:sz w:val="20"/>
               </w:rPr>
               <w:t>C0149</w:t>
             </w:r>
@@ -1891,8 +2610,18 @@
         <w:tc>
           <w:tcPr>
             <w:tcW w:type="dxa" w:w="2351"/>
+            <w:tcBorders>
+              <w:top w:val="single" w:sz="8" w:space="0" w:color="000000"/>
+              <w:left w:val="single" w:sz="8" w:space="0" w:color="000000"/>
+              <w:bottom w:val="single" w:sz="8" w:space="0" w:color="000000"/>
+              <w:right w:val="single" w:sz="8" w:space="0" w:color="000000"/>
+            </w:tcBorders>
           </w:tcPr>
           <w:p>
+            <w:pPr>
+              <w:spacing w:after="0"/>
+              <w:jc w:val="right"/>
+            </w:pPr>
             <w:r/>
             <w:r>
               <w:rPr>
@@ -1900,7 +2629,7 @@
                 <w:b w:val="0"/>
                 <w:i w:val="0"/>
                 <w:color w:val="000000"/>
-                <w:sz w:val="14"/>
+                <w:sz w:val="20"/>
               </w:rPr>
               <w:t>14</w:t>
             </w:r>
@@ -1909,8 +2638,18 @@
         <w:tc>
           <w:tcPr>
             <w:tcW w:type="dxa" w:w="2351"/>
+            <w:tcBorders>
+              <w:top w:val="single" w:sz="8" w:space="0" w:color="000000"/>
+              <w:left w:val="single" w:sz="8" w:space="0" w:color="000000"/>
+              <w:bottom w:val="single" w:sz="8" w:space="0" w:color="000000"/>
+              <w:right w:val="single" w:sz="8" w:space="0" w:color="000000"/>
+            </w:tcBorders>
           </w:tcPr>
           <w:p>
+            <w:pPr>
+              <w:spacing w:after="0"/>
+              <w:jc w:val="left"/>
+            </w:pPr>
             <w:r/>
             <w:r>
               <w:rPr>
@@ -1918,7 +2657,7 @@
                 <w:b w:val="0"/>
                 <w:i w:val="0"/>
                 <w:color w:val="000000"/>
-                <w:sz w:val="14"/>
+                <w:sz w:val="20"/>
               </w:rPr>
               <w:t>ST; ST D–1 h; chuva 36 h; montante; montante D–2 h; Ituim; Ituim D–11 h; ST D–4 h; ST D–2 h; montante D–4 h; montante D–1 h; montante A–12 h; Ituim D–12 h; Ituim D–10 h</w:t>
             </w:r>
@@ -1928,8 +2667,20 @@
     </w:tbl>
     <w:p>
       <w:pPr>
-        <w:spacing w:after="240" w:line="360" w:lineRule="auto"/>
+        <w:spacing w:before="80" w:after="40" w:line="276" w:lineRule="auto"/>
+        <w:ind w:firstLine="0"/>
+        <w:jc w:val="left"/>
       </w:pPr>
+      <w:r>
+        <w:rPr>
+          <w:rFonts w:ascii="Times New Roman" w:hAnsi="Times New Roman" w:eastAsia="Times New Roman"/>
+          <w:b/>
+          <w:i w:val="0"/>
+          <w:color w:val="000000"/>
+          <w:sz w:val="20"/>
+        </w:rPr>
+        <w:t xml:space="preserve">Fonte: </w:t>
+      </w:r>
       <w:r>
         <w:rPr>
           <w:rFonts w:ascii="Times New Roman" w:hAnsi="Times New Roman" w:eastAsia="Times New Roman"/>
@@ -1938,7 +2689,34 @@
           <w:color w:val="000000"/>
           <w:sz w:val="20"/>
         </w:rPr>
-        <w:t>ST = Santa Tereza (86472600); D–x h = diferença em x horas; A–x h = aceleração (segunda diferença); montante = trecho a montante de Santa Tereza (86472000); chuva 36 h = chuva média acumulada em 36 h (estado antecedente). Códigos numéricos são estações ANA/SGB. Fonte: conjunto filtrado de 282 modelos com PERS positiva nos quatro recortes.</w:t>
+        <w:t>Conjunto filtrado de 282 modelos com PERS positiva em treino, validação, teste e série completa.</w:t>
+      </w:r>
+    </w:p>
+    <w:p>
+      <w:pPr>
+        <w:spacing w:after="200" w:line="276" w:lineRule="auto"/>
+        <w:ind w:firstLine="0"/>
+        <w:jc w:val="left"/>
+      </w:pPr>
+      <w:r>
+        <w:rPr>
+          <w:rFonts w:ascii="Times New Roman" w:hAnsi="Times New Roman" w:eastAsia="Times New Roman"/>
+          <w:b/>
+          <w:i w:val="0"/>
+          <w:color w:val="000000"/>
+          <w:sz w:val="20"/>
+        </w:rPr>
+        <w:t xml:space="preserve">Nota: </w:t>
+      </w:r>
+      <w:r>
+        <w:rPr>
+          <w:rFonts w:ascii="Times New Roman" w:hAnsi="Times New Roman" w:eastAsia="Times New Roman"/>
+          <w:b w:val="0"/>
+          <w:i w:val="0"/>
+          <w:color w:val="000000"/>
+          <w:sz w:val="20"/>
+        </w:rPr>
+        <w:t>Sem métricas de desempenho. ST = Santa Tereza (86472600); D–x h = diferença em x horas; A–x h = aceleração (segunda diferença); montante = posto 86472000; chuva 36 h = chuva média acumulada em 36 h. Códigos numéricos são estações ANA/SGB.</w:t>
       </w:r>
     </w:p>
     <w:p>
@@ -1977,48 +2755,69 @@
       <w:pPr>
         <w:spacing w:before="240" w:after="120" w:line="276" w:lineRule="auto"/>
         <w:ind w:firstLine="0"/>
-        <w:jc w:val="center"/>
+        <w:jc w:val="left"/>
       </w:pPr>
       <w:r>
         <w:rPr>
           <w:rFonts w:ascii="Times New Roman" w:hAnsi="Times New Roman" w:eastAsia="Times New Roman"/>
-          <w:b w:val="0"/>
-          <w:i/>
+          <w:b/>
+          <w:i w:val="0"/>
           <w:color w:val="000000"/>
           <w:sz w:val="20"/>
         </w:rPr>
-        <w:t>Tabela 1. Modelo de maior índice de equilíbrio publicado em cada horizonte. MAE e E95 em cm no teste por eventos. PERS g / v / t = geral, validação e teste. NS = Nash-Sutcliffe de teste. ALT: a rede prevê a variação do nível. CONV: família complementar (equação de saída a declarar).</w:t>
+        <w:t>Tabela 1</w:t>
+      </w:r>
+      <w:r>
+        <w:rPr>
+          <w:rFonts w:ascii="Times New Roman" w:hAnsi="Times New Roman" w:eastAsia="Times New Roman"/>
+          <w:b w:val="0"/>
+          <w:i w:val="0"/>
+          <w:color w:val="000000"/>
+          <w:sz w:val="20"/>
+        </w:rPr>
+        <w:t xml:space="preserve"> – Desempenho no teste do modelo de maior equilíbrio publicado em cada horizonte</w:t>
       </w:r>
     </w:p>
     <w:tbl>
       <w:tblPr>
-        <w:tblStyle w:val="TableGrid"/>
         <w:tblW w:type="auto" w:w="0"/>
         <w:jc w:val="center"/>
+        <w:tblLayout w:type="autofit"/>
         <w:tblLook w:firstColumn="1" w:firstRow="1" w:lastColumn="0" w:lastRow="0" w:noHBand="0" w:noVBand="1" w:val="04A0"/>
+        <w:tblBorders>
+          <w:top w:val="nil"/>
+          <w:left w:val="nil"/>
+          <w:bottom w:val="nil"/>
+          <w:right w:val="nil"/>
+          <w:insideH w:val="nil"/>
+          <w:insideV w:val="nil"/>
+        </w:tblBorders>
       </w:tblPr>
       <w:tblGrid>
-        <w:gridCol w:w="784"/>
-        <w:gridCol w:w="784"/>
-        <w:gridCol w:w="784"/>
-        <w:gridCol w:w="784"/>
-        <w:gridCol w:w="784"/>
-        <w:gridCol w:w="784"/>
-        <w:gridCol w:w="784"/>
-        <w:gridCol w:w="784"/>
-        <w:gridCol w:w="784"/>
-        <w:gridCol w:w="784"/>
-        <w:gridCol w:w="784"/>
-        <w:gridCol w:w="784"/>
+        <w:gridCol w:w="1045"/>
+        <w:gridCol w:w="1045"/>
+        <w:gridCol w:w="1045"/>
+        <w:gridCol w:w="1045"/>
+        <w:gridCol w:w="1045"/>
+        <w:gridCol w:w="1045"/>
+        <w:gridCol w:w="1045"/>
+        <w:gridCol w:w="1045"/>
+        <w:gridCol w:w="1045"/>
       </w:tblGrid>
       <w:tr>
         <w:tc>
           <w:tcPr>
-            <w:tcW w:type="dxa" w:w="784"/>
-            <w:shd w:fill="E8EEE9" w:val="clear"/>
+            <w:tcW w:type="dxa" w:w="1045"/>
+            <w:tcBorders>
+              <w:top w:val="single" w:sz="16" w:space="0" w:color="000000"/>
+              <w:left w:val="nil"/>
+              <w:bottom w:val="single" w:sz="8" w:space="0" w:color="000000"/>
+              <w:right w:val="nil"/>
+            </w:tcBorders>
           </w:tcPr>
           <w:p>
             <w:pPr>
+              <w:spacing w:after="0"/>
               <w:jc w:val="center"/>
             </w:pPr>
             <w:r/>
@@ -2028,19 +2827,25 @@
                 <w:b/>
                 <w:i w:val="0"/>
                 <w:color w:val="000000"/>
-                <w:sz w:val="16"/>
+                <w:sz w:val="20"/>
               </w:rPr>
-              <w:t>H</w:t>
+              <w:t>Horizonte</w:t>
             </w:r>
           </w:p>
         </w:tc>
         <w:tc>
           <w:tcPr>
-            <w:tcW w:type="dxa" w:w="784"/>
-            <w:shd w:fill="E8EEE9" w:val="clear"/>
+            <w:tcW w:type="dxa" w:w="1045"/>
+            <w:tcBorders>
+              <w:top w:val="single" w:sz="16" w:space="0" w:color="000000"/>
+              <w:left w:val="nil"/>
+              <w:bottom w:val="single" w:sz="8" w:space="0" w:color="000000"/>
+              <w:right w:val="nil"/>
+            </w:tcBorders>
           </w:tcPr>
           <w:p>
             <w:pPr>
+              <w:spacing w:after="0"/>
               <w:jc w:val="center"/>
             </w:pPr>
             <w:r/>
@@ -2050,7 +2855,7 @@
                 <w:b/>
                 <w:i w:val="0"/>
                 <w:color w:val="000000"/>
-                <w:sz w:val="16"/>
+                <w:sz w:val="20"/>
               </w:rPr>
               <w:t>Família</w:t>
             </w:r>
@@ -2058,11 +2863,17 @@
         </w:tc>
         <w:tc>
           <w:tcPr>
-            <w:tcW w:type="dxa" w:w="784"/>
-            <w:shd w:fill="E8EEE9" w:val="clear"/>
+            <w:tcW w:type="dxa" w:w="1045"/>
+            <w:tcBorders>
+              <w:top w:val="single" w:sz="16" w:space="0" w:color="000000"/>
+              <w:left w:val="nil"/>
+              <w:bottom w:val="single" w:sz="8" w:space="0" w:color="000000"/>
+              <w:right w:val="nil"/>
+            </w:tcBorders>
           </w:tcPr>
           <w:p>
             <w:pPr>
+              <w:spacing w:after="0"/>
               <w:jc w:val="center"/>
             </w:pPr>
             <w:r/>
@@ -2072,19 +2883,25 @@
                 <w:b/>
                 <w:i w:val="0"/>
                 <w:color w:val="000000"/>
-                <w:sz w:val="16"/>
+                <w:sz w:val="20"/>
               </w:rPr>
-              <w:t>Modelo</w:t>
+              <w:t>Equilíbrio</w:t>
             </w:r>
           </w:p>
         </w:tc>
         <w:tc>
           <w:tcPr>
-            <w:tcW w:type="dxa" w:w="784"/>
-            <w:shd w:fill="E8EEE9" w:val="clear"/>
+            <w:tcW w:type="dxa" w:w="1045"/>
+            <w:tcBorders>
+              <w:top w:val="single" w:sz="16" w:space="0" w:color="000000"/>
+              <w:left w:val="nil"/>
+              <w:bottom w:val="single" w:sz="8" w:space="0" w:color="000000"/>
+              <w:right w:val="nil"/>
+            </w:tcBorders>
           </w:tcPr>
           <w:p>
             <w:pPr>
+              <w:spacing w:after="0"/>
               <w:jc w:val="center"/>
             </w:pPr>
             <w:r/>
@@ -2094,19 +2911,25 @@
                 <w:b/>
                 <w:i w:val="0"/>
                 <w:color w:val="000000"/>
-                <w:sz w:val="16"/>
+                <w:sz w:val="20"/>
               </w:rPr>
-              <w:t>Rotação</w:t>
+              <w:t>PERS geral</w:t>
             </w:r>
           </w:p>
         </w:tc>
         <w:tc>
           <w:tcPr>
-            <w:tcW w:type="dxa" w:w="784"/>
-            <w:shd w:fill="E8EEE9" w:val="clear"/>
+            <w:tcW w:type="dxa" w:w="1045"/>
+            <w:tcBorders>
+              <w:top w:val="single" w:sz="16" w:space="0" w:color="000000"/>
+              <w:left w:val="nil"/>
+              <w:bottom w:val="single" w:sz="8" w:space="0" w:color="000000"/>
+              <w:right w:val="nil"/>
+            </w:tcBorders>
           </w:tcPr>
           <w:p>
             <w:pPr>
+              <w:spacing w:after="0"/>
               <w:jc w:val="center"/>
             </w:pPr>
             <w:r/>
@@ -2116,19 +2939,25 @@
                 <w:b/>
                 <w:i w:val="0"/>
                 <w:color w:val="000000"/>
-                <w:sz w:val="16"/>
+                <w:sz w:val="20"/>
               </w:rPr>
-              <w:t>Eq. ficha</w:t>
+              <w:t>PERS validação</w:t>
             </w:r>
           </w:p>
         </w:tc>
         <w:tc>
           <w:tcPr>
-            <w:tcW w:type="dxa" w:w="784"/>
-            <w:shd w:fill="E8EEE9" w:val="clear"/>
+            <w:tcW w:type="dxa" w:w="1045"/>
+            <w:tcBorders>
+              <w:top w:val="single" w:sz="16" w:space="0" w:color="000000"/>
+              <w:left w:val="nil"/>
+              <w:bottom w:val="single" w:sz="8" w:space="0" w:color="000000"/>
+              <w:right w:val="nil"/>
+            </w:tcBorders>
           </w:tcPr>
           <w:p>
             <w:pPr>
+              <w:spacing w:after="0"/>
               <w:jc w:val="center"/>
             </w:pPr>
             <w:r/>
@@ -2138,19 +2967,25 @@
                 <w:b/>
                 <w:i w:val="0"/>
                 <w:color w:val="000000"/>
-                <w:sz w:val="16"/>
+                <w:sz w:val="20"/>
               </w:rPr>
-              <w:t>PERS g / v / t</w:t>
+              <w:t>PERS teste</w:t>
             </w:r>
           </w:p>
         </w:tc>
         <w:tc>
           <w:tcPr>
-            <w:tcW w:type="dxa" w:w="784"/>
-            <w:shd w:fill="E8EEE9" w:val="clear"/>
+            <w:tcW w:type="dxa" w:w="1045"/>
+            <w:tcBorders>
+              <w:top w:val="single" w:sz="16" w:space="0" w:color="000000"/>
+              <w:left w:val="nil"/>
+              <w:bottom w:val="single" w:sz="8" w:space="0" w:color="000000"/>
+              <w:right w:val="nil"/>
+            </w:tcBorders>
           </w:tcPr>
           <w:p>
             <w:pPr>
+              <w:spacing w:after="0"/>
               <w:jc w:val="center"/>
             </w:pPr>
             <w:r/>
@@ -2160,19 +2995,25 @@
                 <w:b/>
                 <w:i w:val="0"/>
                 <w:color w:val="000000"/>
-                <w:sz w:val="16"/>
+                <w:sz w:val="20"/>
               </w:rPr>
-              <w:t>NS teste</w:t>
+              <w:t>NS</w:t>
             </w:r>
           </w:p>
         </w:tc>
         <w:tc>
           <w:tcPr>
-            <w:tcW w:type="dxa" w:w="784"/>
-            <w:shd w:fill="E8EEE9" w:val="clear"/>
+            <w:tcW w:type="dxa" w:w="1045"/>
+            <w:tcBorders>
+              <w:top w:val="single" w:sz="16" w:space="0" w:color="000000"/>
+              <w:left w:val="nil"/>
+              <w:bottom w:val="single" w:sz="8" w:space="0" w:color="000000"/>
+              <w:right w:val="nil"/>
+            </w:tcBorders>
           </w:tcPr>
           <w:p>
             <w:pPr>
+              <w:spacing w:after="0"/>
               <w:jc w:val="center"/>
             </w:pPr>
             <w:r/>
@@ -2182,7 +3023,7 @@
                 <w:b/>
                 <w:i w:val="0"/>
                 <w:color w:val="000000"/>
-                <w:sz w:val="16"/>
+                <w:sz w:val="20"/>
               </w:rPr>
               <w:t>MAE (cm)</w:t>
             </w:r>
@@ -2190,11 +3031,17 @@
         </w:tc>
         <w:tc>
           <w:tcPr>
-            <w:tcW w:type="dxa" w:w="784"/>
-            <w:shd w:fill="E8EEE9" w:val="clear"/>
+            <w:tcW w:type="dxa" w:w="1045"/>
+            <w:tcBorders>
+              <w:top w:val="single" w:sz="16" w:space="0" w:color="000000"/>
+              <w:left w:val="nil"/>
+              <w:bottom w:val="single" w:sz="8" w:space="0" w:color="000000"/>
+              <w:right w:val="nil"/>
+            </w:tcBorders>
           </w:tcPr>
           <w:p>
             <w:pPr>
+              <w:spacing w:after="0"/>
               <w:jc w:val="center"/>
             </w:pPr>
             <w:r/>
@@ -2204,75 +3051,9 @@
                 <w:b/>
                 <w:i w:val="0"/>
                 <w:color w:val="000000"/>
-                <w:sz w:val="16"/>
+                <w:sz w:val="20"/>
               </w:rPr>
               <w:t>E95 (cm)</w:t>
-            </w:r>
-          </w:p>
-        </w:tc>
-        <w:tc>
-          <w:tcPr>
-            <w:tcW w:type="dxa" w:w="784"/>
-            <w:shd w:fill="E8EEE9" w:val="clear"/>
-          </w:tcPr>
-          <w:p>
-            <w:pPr>
-              <w:jc w:val="center"/>
-            </w:pPr>
-            <w:r/>
-            <w:r>
-              <w:rPr>
-                <w:rFonts w:ascii="Times New Roman" w:hAnsi="Times New Roman" w:eastAsia="Times New Roman"/>
-                <w:b/>
-                <w:i w:val="0"/>
-                <w:color w:val="000000"/>
-                <w:sz w:val="16"/>
-              </w:rPr>
-              <w:t>Chuva</w:t>
-            </w:r>
-          </w:p>
-        </w:tc>
-        <w:tc>
-          <w:tcPr>
-            <w:tcW w:type="dxa" w:w="784"/>
-            <w:shd w:fill="E8EEE9" w:val="clear"/>
-          </w:tcPr>
-          <w:p>
-            <w:pPr>
-              <w:jc w:val="center"/>
-            </w:pPr>
-            <w:r/>
-            <w:r>
-              <w:rPr>
-                <w:rFonts w:ascii="Times New Roman" w:hAnsi="Times New Roman" w:eastAsia="Times New Roman"/>
-                <w:b/>
-                <w:i w:val="0"/>
-                <w:color w:val="000000"/>
-                <w:sz w:val="16"/>
-              </w:rPr>
-              <w:t>N ent.</w:t>
-            </w:r>
-          </w:p>
-        </w:tc>
-        <w:tc>
-          <w:tcPr>
-            <w:tcW w:type="dxa" w:w="784"/>
-            <w:shd w:fill="E8EEE9" w:val="clear"/>
-          </w:tcPr>
-          <w:p>
-            <w:pPr>
-              <w:jc w:val="center"/>
-            </w:pPr>
-            <w:r/>
-            <w:r>
-              <w:rPr>
-                <w:rFonts w:ascii="Times New Roman" w:hAnsi="Times New Roman" w:eastAsia="Times New Roman"/>
-                <w:b/>
-                <w:i w:val="0"/>
-                <w:color w:val="000000"/>
-                <w:sz w:val="16"/>
-              </w:rPr>
-              <w:t>N oc.</w:t>
             </w:r>
           </w:p>
         </w:tc>
@@ -2280,9 +3061,19 @@
       <w:tr>
         <w:tc>
           <w:tcPr>
-            <w:tcW w:type="dxa" w:w="784"/>
+            <w:tcW w:type="dxa" w:w="1045"/>
+            <w:tcBorders>
+              <w:top w:val="nil"/>
+              <w:left w:val="nil"/>
+              <w:bottom w:val="nil"/>
+              <w:right w:val="nil"/>
+            </w:tcBorders>
           </w:tcPr>
           <w:p>
+            <w:pPr>
+              <w:spacing w:after="0"/>
+              <w:jc w:val="left"/>
+            </w:pPr>
             <w:r/>
             <w:r>
               <w:rPr>
@@ -2290,7 +3081,7 @@
                 <w:b w:val="0"/>
                 <w:i w:val="0"/>
                 <w:color w:val="000000"/>
-                <w:sz w:val="14"/>
+                <w:sz w:val="20"/>
               </w:rPr>
               <w:t>2 h</w:t>
             </w:r>
@@ -2298,9 +3089,19 @@
         </w:tc>
         <w:tc>
           <w:tcPr>
-            <w:tcW w:type="dxa" w:w="784"/>
+            <w:tcW w:type="dxa" w:w="1045"/>
+            <w:tcBorders>
+              <w:top w:val="nil"/>
+              <w:left w:val="nil"/>
+              <w:bottom w:val="nil"/>
+              <w:right w:val="nil"/>
+            </w:tcBorders>
           </w:tcPr>
           <w:p>
+            <w:pPr>
+              <w:spacing w:after="0"/>
+              <w:jc w:val="left"/>
+            </w:pPr>
             <w:r/>
             <w:r>
               <w:rPr>
@@ -2308,7 +3109,7 @@
                 <w:b w:val="0"/>
                 <w:i w:val="0"/>
                 <w:color w:val="000000"/>
-                <w:sz w:val="14"/>
+                <w:sz w:val="20"/>
               </w:rPr>
               <w:t>ALT</w:t>
             </w:r>
@@ -2316,9 +3117,19 @@
         </w:tc>
         <w:tc>
           <w:tcPr>
-            <w:tcW w:type="dxa" w:w="784"/>
+            <w:tcW w:type="dxa" w:w="1045"/>
+            <w:tcBorders>
+              <w:top w:val="nil"/>
+              <w:left w:val="nil"/>
+              <w:bottom w:val="nil"/>
+              <w:right w:val="nil"/>
+            </w:tcBorders>
           </w:tcPr>
           <w:p>
+            <w:pPr>
+              <w:spacing w:after="0"/>
+              <w:jc w:val="right"/>
+            </w:pPr>
             <w:r/>
             <w:r>
               <w:rPr>
@@ -2326,17 +3137,27 @@
                 <w:b w:val="0"/>
                 <w:i w:val="0"/>
                 <w:color w:val="000000"/>
-                <w:sz w:val="14"/>
+                <w:sz w:val="20"/>
               </w:rPr>
-              <w:t>15 entradas, sem chuva</w:t>
+              <w:t>0,969</w:t>
             </w:r>
           </w:p>
         </w:tc>
         <w:tc>
           <w:tcPr>
-            <w:tcW w:type="dxa" w:w="784"/>
+            <w:tcW w:type="dxa" w:w="1045"/>
+            <w:tcBorders>
+              <w:top w:val="nil"/>
+              <w:left w:val="nil"/>
+              <w:bottom w:val="nil"/>
+              <w:right w:val="nil"/>
+            </w:tcBorders>
           </w:tcPr>
           <w:p>
+            <w:pPr>
+              <w:spacing w:after="0"/>
+              <w:jc w:val="right"/>
+            </w:pPr>
             <w:r/>
             <w:r>
               <w:rPr>
@@ -2344,17 +3165,27 @@
                 <w:b w:val="0"/>
                 <w:i w:val="0"/>
                 <w:color w:val="000000"/>
-                <w:sz w:val="14"/>
+                <w:sz w:val="20"/>
               </w:rPr>
-              <w:t>R09</w:t>
+              <w:t>0,955</w:t>
             </w:r>
           </w:p>
         </w:tc>
         <w:tc>
           <w:tcPr>
-            <w:tcW w:type="dxa" w:w="784"/>
+            <w:tcW w:type="dxa" w:w="1045"/>
+            <w:tcBorders>
+              <w:top w:val="nil"/>
+              <w:left w:val="nil"/>
+              <w:bottom w:val="nil"/>
+              <w:right w:val="nil"/>
+            </w:tcBorders>
           </w:tcPr>
           <w:p>
+            <w:pPr>
+              <w:spacing w:after="0"/>
+              <w:jc w:val="right"/>
+            </w:pPr>
             <w:r/>
             <w:r>
               <w:rPr>
@@ -2362,7 +3193,35 @@
                 <w:b w:val="0"/>
                 <w:i w:val="0"/>
                 <w:color w:val="000000"/>
-                <w:sz w:val="14"/>
+                <w:sz w:val="20"/>
+              </w:rPr>
+              <w:t>0,936</w:t>
+            </w:r>
+          </w:p>
+        </w:tc>
+        <w:tc>
+          <w:tcPr>
+            <w:tcW w:type="dxa" w:w="1045"/>
+            <w:tcBorders>
+              <w:top w:val="nil"/>
+              <w:left w:val="nil"/>
+              <w:bottom w:val="nil"/>
+              <w:right w:val="nil"/>
+            </w:tcBorders>
+          </w:tcPr>
+          <w:p>
+            <w:pPr>
+              <w:spacing w:after="0"/>
+              <w:jc w:val="right"/>
+            </w:pPr>
+            <w:r/>
+            <w:r>
+              <w:rPr>
+                <w:rFonts w:ascii="Times New Roman" w:hAnsi="Times New Roman" w:eastAsia="Times New Roman"/>
+                <w:b w:val="0"/>
+                <w:i w:val="0"/>
+                <w:color w:val="000000"/>
+                <w:sz w:val="20"/>
               </w:rPr>
               <w:t>0,969</w:t>
             </w:r>
@@ -2370,9 +3229,19 @@
         </w:tc>
         <w:tc>
           <w:tcPr>
-            <w:tcW w:type="dxa" w:w="784"/>
+            <w:tcW w:type="dxa" w:w="1045"/>
+            <w:tcBorders>
+              <w:top w:val="nil"/>
+              <w:left w:val="nil"/>
+              <w:bottom w:val="nil"/>
+              <w:right w:val="nil"/>
+            </w:tcBorders>
           </w:tcPr>
           <w:p>
+            <w:pPr>
+              <w:spacing w:after="0"/>
+              <w:jc w:val="right"/>
+            </w:pPr>
             <w:r/>
             <w:r>
               <w:rPr>
@@ -2380,17 +3249,27 @@
                 <w:b w:val="0"/>
                 <w:i w:val="0"/>
                 <w:color w:val="000000"/>
-                <w:sz w:val="14"/>
+                <w:sz w:val="20"/>
               </w:rPr>
-              <w:t>0,955 / 0,936 / 0,969</w:t>
+              <w:t>0,996</w:t>
             </w:r>
           </w:p>
         </w:tc>
         <w:tc>
           <w:tcPr>
-            <w:tcW w:type="dxa" w:w="784"/>
+            <w:tcW w:type="dxa" w:w="1045"/>
+            <w:tcBorders>
+              <w:top w:val="nil"/>
+              <w:left w:val="nil"/>
+              <w:bottom w:val="nil"/>
+              <w:right w:val="nil"/>
+            </w:tcBorders>
           </w:tcPr>
           <w:p>
+            <w:pPr>
+              <w:spacing w:after="0"/>
+              <w:jc w:val="right"/>
+            </w:pPr>
             <w:r/>
             <w:r>
               <w:rPr>
@@ -2398,17 +3277,27 @@
                 <w:b w:val="0"/>
                 <w:i w:val="0"/>
                 <w:color w:val="000000"/>
-                <w:sz w:val="14"/>
+                <w:sz w:val="20"/>
               </w:rPr>
-              <w:t>0,996</w:t>
+              <w:t>3,5</w:t>
             </w:r>
           </w:p>
         </w:tc>
         <w:tc>
           <w:tcPr>
-            <w:tcW w:type="dxa" w:w="784"/>
+            <w:tcW w:type="dxa" w:w="1045"/>
+            <w:tcBorders>
+              <w:top w:val="nil"/>
+              <w:left w:val="nil"/>
+              <w:bottom w:val="nil"/>
+              <w:right w:val="nil"/>
+            </w:tcBorders>
           </w:tcPr>
           <w:p>
+            <w:pPr>
+              <w:spacing w:after="0"/>
+              <w:jc w:val="right"/>
+            </w:pPr>
             <w:r/>
             <w:r>
               <w:rPr>
@@ -2416,17 +3305,29 @@
                 <w:b w:val="0"/>
                 <w:i w:val="0"/>
                 <w:color w:val="000000"/>
-                <w:sz w:val="14"/>
+                <w:sz w:val="20"/>
               </w:rPr>
-              <w:t>3,5</w:t>
+              <w:t>10,4</w:t>
             </w:r>
           </w:p>
         </w:tc>
+      </w:tr>
+      <w:tr>
         <w:tc>
           <w:tcPr>
-            <w:tcW w:type="dxa" w:w="784"/>
+            <w:tcW w:type="dxa" w:w="1045"/>
+            <w:tcBorders>
+              <w:top w:val="nil"/>
+              <w:left w:val="nil"/>
+              <w:bottom w:val="nil"/>
+              <w:right w:val="nil"/>
+            </w:tcBorders>
           </w:tcPr>
           <w:p>
+            <w:pPr>
+              <w:spacing w:after="0"/>
+              <w:jc w:val="left"/>
+            </w:pPr>
             <w:r/>
             <w:r>
               <w:rPr>
@@ -2434,17 +3335,27 @@
                 <w:b w:val="0"/>
                 <w:i w:val="0"/>
                 <w:color w:val="000000"/>
-                <w:sz w:val="14"/>
+                <w:sz w:val="20"/>
               </w:rPr>
-              <w:t>10,4</w:t>
+              <w:t>4 h</w:t>
             </w:r>
           </w:p>
         </w:tc>
         <w:tc>
           <w:tcPr>
-            <w:tcW w:type="dxa" w:w="784"/>
+            <w:tcW w:type="dxa" w:w="1045"/>
+            <w:tcBorders>
+              <w:top w:val="nil"/>
+              <w:left w:val="nil"/>
+              <w:bottom w:val="nil"/>
+              <w:right w:val="nil"/>
+            </w:tcBorders>
           </w:tcPr>
           <w:p>
+            <w:pPr>
+              <w:spacing w:after="0"/>
+              <w:jc w:val="left"/>
+            </w:pPr>
             <w:r/>
             <w:r>
               <w:rPr>
@@ -2452,17 +3363,27 @@
                 <w:b w:val="0"/>
                 <w:i w:val="0"/>
                 <w:color w:val="000000"/>
-                <w:sz w:val="14"/>
+                <w:sz w:val="20"/>
               </w:rPr>
-              <w:t>não</w:t>
+              <w:t>ALT</w:t>
             </w:r>
           </w:p>
         </w:tc>
         <w:tc>
           <w:tcPr>
-            <w:tcW w:type="dxa" w:w="784"/>
+            <w:tcW w:type="dxa" w:w="1045"/>
+            <w:tcBorders>
+              <w:top w:val="nil"/>
+              <w:left w:val="nil"/>
+              <w:bottom w:val="nil"/>
+              <w:right w:val="nil"/>
+            </w:tcBorders>
           </w:tcPr>
           <w:p>
+            <w:pPr>
+              <w:spacing w:after="0"/>
+              <w:jc w:val="right"/>
+            </w:pPr>
             <w:r/>
             <w:r>
               <w:rPr>
@@ -2470,17 +3391,27 @@
                 <w:b w:val="0"/>
                 <w:i w:val="0"/>
                 <w:color w:val="000000"/>
-                <w:sz w:val="14"/>
+                <w:sz w:val="20"/>
               </w:rPr>
-              <w:t>15</w:t>
+              <w:t>0,846</w:t>
             </w:r>
           </w:p>
         </w:tc>
         <w:tc>
           <w:tcPr>
-            <w:tcW w:type="dxa" w:w="784"/>
+            <w:tcW w:type="dxa" w:w="1045"/>
+            <w:tcBorders>
+              <w:top w:val="nil"/>
+              <w:left w:val="nil"/>
+              <w:bottom w:val="nil"/>
+              <w:right w:val="nil"/>
+            </w:tcBorders>
           </w:tcPr>
           <w:p>
+            <w:pPr>
+              <w:spacing w:after="0"/>
+              <w:jc w:val="right"/>
+            </w:pPr>
             <w:r/>
             <w:r>
               <w:rPr>
@@ -2488,9 +3419,149 @@
                 <w:b w:val="0"/>
                 <w:i w:val="0"/>
                 <w:color w:val="000000"/>
-                <w:sz w:val="14"/>
+                <w:sz w:val="20"/>
               </w:rPr>
-              <w:t>30</w:t>
+              <w:t>0,888</w:t>
+            </w:r>
+          </w:p>
+        </w:tc>
+        <w:tc>
+          <w:tcPr>
+            <w:tcW w:type="dxa" w:w="1045"/>
+            <w:tcBorders>
+              <w:top w:val="nil"/>
+              <w:left w:val="nil"/>
+              <w:bottom w:val="nil"/>
+              <w:right w:val="nil"/>
+            </w:tcBorders>
+          </w:tcPr>
+          <w:p>
+            <w:pPr>
+              <w:spacing w:after="0"/>
+              <w:jc w:val="right"/>
+            </w:pPr>
+            <w:r/>
+            <w:r>
+              <w:rPr>
+                <w:rFonts w:ascii="Times New Roman" w:hAnsi="Times New Roman" w:eastAsia="Times New Roman"/>
+                <w:b w:val="0"/>
+                <w:i w:val="0"/>
+                <w:color w:val="000000"/>
+                <w:sz w:val="20"/>
+              </w:rPr>
+              <w:t>0,878</w:t>
+            </w:r>
+          </w:p>
+        </w:tc>
+        <w:tc>
+          <w:tcPr>
+            <w:tcW w:type="dxa" w:w="1045"/>
+            <w:tcBorders>
+              <w:top w:val="nil"/>
+              <w:left w:val="nil"/>
+              <w:bottom w:val="nil"/>
+              <w:right w:val="nil"/>
+            </w:tcBorders>
+          </w:tcPr>
+          <w:p>
+            <w:pPr>
+              <w:spacing w:after="0"/>
+              <w:jc w:val="right"/>
+            </w:pPr>
+            <w:r/>
+            <w:r>
+              <w:rPr>
+                <w:rFonts w:ascii="Times New Roman" w:hAnsi="Times New Roman" w:eastAsia="Times New Roman"/>
+                <w:b w:val="0"/>
+                <w:i w:val="0"/>
+                <w:color w:val="000000"/>
+                <w:sz w:val="20"/>
+              </w:rPr>
+              <w:t>0,876</w:t>
+            </w:r>
+          </w:p>
+        </w:tc>
+        <w:tc>
+          <w:tcPr>
+            <w:tcW w:type="dxa" w:w="1045"/>
+            <w:tcBorders>
+              <w:top w:val="nil"/>
+              <w:left w:val="nil"/>
+              <w:bottom w:val="nil"/>
+              <w:right w:val="nil"/>
+            </w:tcBorders>
+          </w:tcPr>
+          <w:p>
+            <w:pPr>
+              <w:spacing w:after="0"/>
+              <w:jc w:val="right"/>
+            </w:pPr>
+            <w:r/>
+            <w:r>
+              <w:rPr>
+                <w:rFonts w:ascii="Times New Roman" w:hAnsi="Times New Roman" w:eastAsia="Times New Roman"/>
+                <w:b w:val="0"/>
+                <w:i w:val="0"/>
+                <w:color w:val="000000"/>
+                <w:sz w:val="20"/>
+              </w:rPr>
+              <w:t>0,993</w:t>
+            </w:r>
+          </w:p>
+        </w:tc>
+        <w:tc>
+          <w:tcPr>
+            <w:tcW w:type="dxa" w:w="1045"/>
+            <w:tcBorders>
+              <w:top w:val="nil"/>
+              <w:left w:val="nil"/>
+              <w:bottom w:val="nil"/>
+              <w:right w:val="nil"/>
+            </w:tcBorders>
+          </w:tcPr>
+          <w:p>
+            <w:pPr>
+              <w:spacing w:after="0"/>
+              <w:jc w:val="right"/>
+            </w:pPr>
+            <w:r/>
+            <w:r>
+              <w:rPr>
+                <w:rFonts w:ascii="Times New Roman" w:hAnsi="Times New Roman" w:eastAsia="Times New Roman"/>
+                <w:b w:val="0"/>
+                <w:i w:val="0"/>
+                <w:color w:val="000000"/>
+                <w:sz w:val="20"/>
+              </w:rPr>
+              <w:t>13,9</w:t>
+            </w:r>
+          </w:p>
+        </w:tc>
+        <w:tc>
+          <w:tcPr>
+            <w:tcW w:type="dxa" w:w="1045"/>
+            <w:tcBorders>
+              <w:top w:val="nil"/>
+              <w:left w:val="nil"/>
+              <w:bottom w:val="nil"/>
+              <w:right w:val="nil"/>
+            </w:tcBorders>
+          </w:tcPr>
+          <w:p>
+            <w:pPr>
+              <w:spacing w:after="0"/>
+              <w:jc w:val="right"/>
+            </w:pPr>
+            <w:r/>
+            <w:r>
+              <w:rPr>
+                <w:rFonts w:ascii="Times New Roman" w:hAnsi="Times New Roman" w:eastAsia="Times New Roman"/>
+                <w:b w:val="0"/>
+                <w:i w:val="0"/>
+                <w:color w:val="000000"/>
+                <w:sz w:val="20"/>
+              </w:rPr>
+              <w:t>52,7</w:t>
             </w:r>
           </w:p>
         </w:tc>
@@ -2498,9 +3569,19 @@
       <w:tr>
         <w:tc>
           <w:tcPr>
-            <w:tcW w:type="dxa" w:w="784"/>
+            <w:tcW w:type="dxa" w:w="1045"/>
+            <w:tcBorders>
+              <w:top w:val="nil"/>
+              <w:left w:val="nil"/>
+              <w:bottom w:val="nil"/>
+              <w:right w:val="nil"/>
+            </w:tcBorders>
           </w:tcPr>
           <w:p>
+            <w:pPr>
+              <w:spacing w:after="0"/>
+              <w:jc w:val="left"/>
+            </w:pPr>
             <w:r/>
             <w:r>
               <w:rPr>
@@ -2508,17 +3589,27 @@
                 <w:b w:val="0"/>
                 <w:i w:val="0"/>
                 <w:color w:val="000000"/>
-                <w:sz w:val="14"/>
+                <w:sz w:val="20"/>
               </w:rPr>
-              <w:t>4 h</w:t>
+              <w:t>8 h</w:t>
             </w:r>
           </w:p>
         </w:tc>
         <w:tc>
           <w:tcPr>
-            <w:tcW w:type="dxa" w:w="784"/>
+            <w:tcW w:type="dxa" w:w="1045"/>
+            <w:tcBorders>
+              <w:top w:val="nil"/>
+              <w:left w:val="nil"/>
+              <w:bottom w:val="nil"/>
+              <w:right w:val="nil"/>
+            </w:tcBorders>
           </w:tcPr>
           <w:p>
+            <w:pPr>
+              <w:spacing w:after="0"/>
+              <w:jc w:val="left"/>
+            </w:pPr>
             <w:r/>
             <w:r>
               <w:rPr>
@@ -2526,7 +3617,7 @@
                 <w:b w:val="0"/>
                 <w:i w:val="0"/>
                 <w:color w:val="000000"/>
-                <w:sz w:val="14"/>
+                <w:sz w:val="20"/>
               </w:rPr>
               <w:t>ALT</w:t>
             </w:r>
@@ -2534,9 +3625,19 @@
         </w:tc>
         <w:tc>
           <w:tcPr>
-            <w:tcW w:type="dxa" w:w="784"/>
+            <w:tcW w:type="dxa" w:w="1045"/>
+            <w:tcBorders>
+              <w:top w:val="nil"/>
+              <w:left w:val="nil"/>
+              <w:bottom w:val="nil"/>
+              <w:right w:val="nil"/>
+            </w:tcBorders>
           </w:tcPr>
           <w:p>
+            <w:pPr>
+              <w:spacing w:after="0"/>
+              <w:jc w:val="right"/>
+            </w:pPr>
             <w:r/>
             <w:r>
               <w:rPr>
@@ -2544,17 +3645,27 @@
                 <w:b w:val="0"/>
                 <w:i w:val="0"/>
                 <w:color w:val="000000"/>
-                <w:sz w:val="14"/>
+                <w:sz w:val="20"/>
               </w:rPr>
-              <w:t>24 entradas, chuva 36 h</w:t>
+              <w:t>0,694</w:t>
             </w:r>
           </w:p>
         </w:tc>
         <w:tc>
           <w:tcPr>
-            <w:tcW w:type="dxa" w:w="784"/>
+            <w:tcW w:type="dxa" w:w="1045"/>
+            <w:tcBorders>
+              <w:top w:val="nil"/>
+              <w:left w:val="nil"/>
+              <w:bottom w:val="nil"/>
+              <w:right w:val="nil"/>
+            </w:tcBorders>
           </w:tcPr>
           <w:p>
+            <w:pPr>
+              <w:spacing w:after="0"/>
+              <w:jc w:val="right"/>
+            </w:pPr>
             <w:r/>
             <w:r>
               <w:rPr>
@@ -2562,17 +3673,27 @@
                 <w:b w:val="0"/>
                 <w:i w:val="0"/>
                 <w:color w:val="000000"/>
-                <w:sz w:val="14"/>
+                <w:sz w:val="20"/>
               </w:rPr>
-              <w:t>R10</w:t>
+              <w:t>0,739</w:t>
             </w:r>
           </w:p>
         </w:tc>
         <w:tc>
           <w:tcPr>
-            <w:tcW w:type="dxa" w:w="784"/>
+            <w:tcW w:type="dxa" w:w="1045"/>
+            <w:tcBorders>
+              <w:top w:val="nil"/>
+              <w:left w:val="nil"/>
+              <w:bottom w:val="nil"/>
+              <w:right w:val="nil"/>
+            </w:tcBorders>
           </w:tcPr>
           <w:p>
+            <w:pPr>
+              <w:spacing w:after="0"/>
+              <w:jc w:val="right"/>
+            </w:pPr>
             <w:r/>
             <w:r>
               <w:rPr>
@@ -2580,17 +3701,27 @@
                 <w:b w:val="0"/>
                 <w:i w:val="0"/>
                 <w:color w:val="000000"/>
-                <w:sz w:val="14"/>
+                <w:sz w:val="20"/>
               </w:rPr>
-              <w:t>0,846</w:t>
+              <w:t>0,811</w:t>
             </w:r>
           </w:p>
         </w:tc>
         <w:tc>
           <w:tcPr>
-            <w:tcW w:type="dxa" w:w="784"/>
+            <w:tcW w:type="dxa" w:w="1045"/>
+            <w:tcBorders>
+              <w:top w:val="nil"/>
+              <w:left w:val="nil"/>
+              <w:bottom w:val="nil"/>
+              <w:right w:val="nil"/>
+            </w:tcBorders>
           </w:tcPr>
           <w:p>
+            <w:pPr>
+              <w:spacing w:after="0"/>
+              <w:jc w:val="right"/>
+            </w:pPr>
             <w:r/>
             <w:r>
               <w:rPr>
@@ -2598,17 +3729,27 @@
                 <w:b w:val="0"/>
                 <w:i w:val="0"/>
                 <w:color w:val="000000"/>
-                <w:sz w:val="14"/>
+                <w:sz w:val="20"/>
               </w:rPr>
-              <w:t>0,888 / 0,878 / 0,876</w:t>
+              <w:t>0,694</w:t>
             </w:r>
           </w:p>
         </w:tc>
         <w:tc>
           <w:tcPr>
-            <w:tcW w:type="dxa" w:w="784"/>
+            <w:tcW w:type="dxa" w:w="1045"/>
+            <w:tcBorders>
+              <w:top w:val="nil"/>
+              <w:left w:val="nil"/>
+              <w:bottom w:val="nil"/>
+              <w:right w:val="nil"/>
+            </w:tcBorders>
           </w:tcPr>
           <w:p>
+            <w:pPr>
+              <w:spacing w:after="0"/>
+              <w:jc w:val="right"/>
+            </w:pPr>
             <w:r/>
             <w:r>
               <w:rPr>
@@ -2616,17 +3757,27 @@
                 <w:b w:val="0"/>
                 <w:i w:val="0"/>
                 <w:color w:val="000000"/>
-                <w:sz w:val="14"/>
+                <w:sz w:val="20"/>
               </w:rPr>
-              <w:t>0,993</w:t>
+              <w:t>0,940</w:t>
             </w:r>
           </w:p>
         </w:tc>
         <w:tc>
           <w:tcPr>
-            <w:tcW w:type="dxa" w:w="784"/>
+            <w:tcW w:type="dxa" w:w="1045"/>
+            <w:tcBorders>
+              <w:top w:val="nil"/>
+              <w:left w:val="nil"/>
+              <w:bottom w:val="nil"/>
+              <w:right w:val="nil"/>
+            </w:tcBorders>
           </w:tcPr>
           <w:p>
+            <w:pPr>
+              <w:spacing w:after="0"/>
+              <w:jc w:val="right"/>
+            </w:pPr>
             <w:r/>
             <w:r>
               <w:rPr>
@@ -2634,17 +3785,27 @@
                 <w:b w:val="0"/>
                 <w:i w:val="0"/>
                 <w:color w:val="000000"/>
-                <w:sz w:val="14"/>
+                <w:sz w:val="20"/>
               </w:rPr>
-              <w:t>13,9</w:t>
+              <w:t>32</w:t>
             </w:r>
           </w:p>
         </w:tc>
         <w:tc>
           <w:tcPr>
-            <w:tcW w:type="dxa" w:w="784"/>
+            <w:tcW w:type="dxa" w:w="1045"/>
+            <w:tcBorders>
+              <w:top w:val="nil"/>
+              <w:left w:val="nil"/>
+              <w:bottom w:val="nil"/>
+              <w:right w:val="nil"/>
+            </w:tcBorders>
           </w:tcPr>
           <w:p>
+            <w:pPr>
+              <w:spacing w:after="0"/>
+              <w:jc w:val="right"/>
+            </w:pPr>
             <w:r/>
             <w:r>
               <w:rPr>
@@ -2652,17 +3813,29 @@
                 <w:b w:val="0"/>
                 <w:i w:val="0"/>
                 <w:color w:val="000000"/>
-                <w:sz w:val="14"/>
+                <w:sz w:val="20"/>
               </w:rPr>
-              <w:t>52,7</w:t>
+              <w:t>135</w:t>
             </w:r>
           </w:p>
         </w:tc>
+      </w:tr>
+      <w:tr>
         <w:tc>
           <w:tcPr>
-            <w:tcW w:type="dxa" w:w="784"/>
+            <w:tcW w:type="dxa" w:w="1045"/>
+            <w:tcBorders>
+              <w:top w:val="nil"/>
+              <w:left w:val="nil"/>
+              <w:bottom w:val="single" w:sz="16" w:space="0" w:color="000000"/>
+              <w:right w:val="nil"/>
+            </w:tcBorders>
           </w:tcPr>
           <w:p>
+            <w:pPr>
+              <w:spacing w:after="0"/>
+              <w:jc w:val="left"/>
+            </w:pPr>
             <w:r/>
             <w:r>
               <w:rPr>
@@ -2670,17 +3843,27 @@
                 <w:b w:val="0"/>
                 <w:i w:val="0"/>
                 <w:color w:val="000000"/>
-                <w:sz w:val="14"/>
+                <w:sz w:val="20"/>
               </w:rPr>
-              <w:t>sim</w:t>
+              <w:t>12 h</w:t>
             </w:r>
           </w:p>
         </w:tc>
         <w:tc>
           <w:tcPr>
-            <w:tcW w:type="dxa" w:w="784"/>
+            <w:tcW w:type="dxa" w:w="1045"/>
+            <w:tcBorders>
+              <w:top w:val="nil"/>
+              <w:left w:val="nil"/>
+              <w:bottom w:val="single" w:sz="16" w:space="0" w:color="000000"/>
+              <w:right w:val="nil"/>
+            </w:tcBorders>
           </w:tcPr>
           <w:p>
+            <w:pPr>
+              <w:spacing w:after="0"/>
+              <w:jc w:val="left"/>
+            </w:pPr>
             <w:r/>
             <w:r>
               <w:rPr>
@@ -2688,17 +3871,27 @@
                 <w:b w:val="0"/>
                 <w:i w:val="0"/>
                 <w:color w:val="000000"/>
-                <w:sz w:val="14"/>
+                <w:sz w:val="20"/>
               </w:rPr>
-              <w:t>24</w:t>
+              <w:t>CONV</w:t>
             </w:r>
           </w:p>
         </w:tc>
         <w:tc>
           <w:tcPr>
-            <w:tcW w:type="dxa" w:w="784"/>
+            <w:tcW w:type="dxa" w:w="1045"/>
+            <w:tcBorders>
+              <w:top w:val="nil"/>
+              <w:left w:val="nil"/>
+              <w:bottom w:val="single" w:sz="16" w:space="0" w:color="000000"/>
+              <w:right w:val="nil"/>
+            </w:tcBorders>
           </w:tcPr>
           <w:p>
+            <w:pPr>
+              <w:spacing w:after="0"/>
+              <w:jc w:val="right"/>
+            </w:pPr>
             <w:r/>
             <w:r>
               <w:rPr>
@@ -2706,19 +3899,27 @@
                 <w:b w:val="0"/>
                 <w:i w:val="0"/>
                 <w:color w:val="000000"/>
-                <w:sz w:val="14"/>
+                <w:sz w:val="20"/>
               </w:rPr>
-              <w:t>48</w:t>
+              <w:t>0,690</w:t>
             </w:r>
           </w:p>
         </w:tc>
-      </w:tr>
-      <w:tr>
         <w:tc>
           <w:tcPr>
-            <w:tcW w:type="dxa" w:w="784"/>
+            <w:tcW w:type="dxa" w:w="1045"/>
+            <w:tcBorders>
+              <w:top w:val="nil"/>
+              <w:left w:val="nil"/>
+              <w:bottom w:val="single" w:sz="16" w:space="0" w:color="000000"/>
+              <w:right w:val="nil"/>
+            </w:tcBorders>
           </w:tcPr>
           <w:p>
+            <w:pPr>
+              <w:spacing w:after="0"/>
+              <w:jc w:val="right"/>
+            </w:pPr>
             <w:r/>
             <w:r>
               <w:rPr>
@@ -2726,17 +3927,27 @@
                 <w:b w:val="0"/>
                 <w:i w:val="0"/>
                 <w:color w:val="000000"/>
-                <w:sz w:val="14"/>
+                <w:sz w:val="20"/>
               </w:rPr>
-              <w:t>8 h</w:t>
+              <w:t>0,824</w:t>
             </w:r>
           </w:p>
         </w:tc>
         <w:tc>
           <w:tcPr>
-            <w:tcW w:type="dxa" w:w="784"/>
+            <w:tcW w:type="dxa" w:w="1045"/>
+            <w:tcBorders>
+              <w:top w:val="nil"/>
+              <w:left w:val="nil"/>
+              <w:bottom w:val="single" w:sz="16" w:space="0" w:color="000000"/>
+              <w:right w:val="nil"/>
+            </w:tcBorders>
           </w:tcPr>
           <w:p>
+            <w:pPr>
+              <w:spacing w:after="0"/>
+              <w:jc w:val="right"/>
+            </w:pPr>
             <w:r/>
             <w:r>
               <w:rPr>
@@ -2744,17 +3955,27 @@
                 <w:b w:val="0"/>
                 <w:i w:val="0"/>
                 <w:color w:val="000000"/>
-                <w:sz w:val="14"/>
+                <w:sz w:val="20"/>
               </w:rPr>
-              <w:t>ALT</w:t>
+              <w:t>0,690</w:t>
             </w:r>
           </w:p>
         </w:tc>
         <w:tc>
           <w:tcPr>
-            <w:tcW w:type="dxa" w:w="784"/>
+            <w:tcW w:type="dxa" w:w="1045"/>
+            <w:tcBorders>
+              <w:top w:val="nil"/>
+              <w:left w:val="nil"/>
+              <w:bottom w:val="single" w:sz="16" w:space="0" w:color="000000"/>
+              <w:right w:val="nil"/>
+            </w:tcBorders>
           </w:tcPr>
           <w:p>
+            <w:pPr>
+              <w:spacing w:after="0"/>
+              <w:jc w:val="right"/>
+            </w:pPr>
             <w:r/>
             <w:r>
               <w:rPr>
@@ -2762,17 +3983,27 @@
                 <w:b w:val="0"/>
                 <w:i w:val="0"/>
                 <w:color w:val="000000"/>
-                <w:sz w:val="14"/>
+                <w:sz w:val="20"/>
               </w:rPr>
-              <w:t>10 entradas (C0289)</w:t>
+              <w:t>0,696</w:t>
             </w:r>
           </w:p>
         </w:tc>
         <w:tc>
           <w:tcPr>
-            <w:tcW w:type="dxa" w:w="784"/>
+            <w:tcW w:type="dxa" w:w="1045"/>
+            <w:tcBorders>
+              <w:top w:val="nil"/>
+              <w:left w:val="nil"/>
+              <w:bottom w:val="single" w:sz="16" w:space="0" w:color="000000"/>
+              <w:right w:val="nil"/>
+            </w:tcBorders>
           </w:tcPr>
           <w:p>
+            <w:pPr>
+              <w:spacing w:after="0"/>
+              <w:jc w:val="right"/>
+            </w:pPr>
             <w:r/>
             <w:r>
               <w:rPr>
@@ -2780,17 +4011,27 @@
                 <w:b w:val="0"/>
                 <w:i w:val="0"/>
                 <w:color w:val="000000"/>
-                <w:sz w:val="14"/>
+                <w:sz w:val="20"/>
               </w:rPr>
-              <w:t>altR_004</w:t>
+              <w:t>0,885</w:t>
             </w:r>
           </w:p>
         </w:tc>
         <w:tc>
           <w:tcPr>
-            <w:tcW w:type="dxa" w:w="784"/>
+            <w:tcW w:type="dxa" w:w="1045"/>
+            <w:tcBorders>
+              <w:top w:val="nil"/>
+              <w:left w:val="nil"/>
+              <w:bottom w:val="single" w:sz="16" w:space="0" w:color="000000"/>
+              <w:right w:val="nil"/>
+            </w:tcBorders>
           </w:tcPr>
           <w:p>
+            <w:pPr>
+              <w:spacing w:after="0"/>
+              <w:jc w:val="right"/>
+            </w:pPr>
             <w:r/>
             <w:r>
               <w:rPr>
@@ -2798,17 +4039,27 @@
                 <w:b w:val="0"/>
                 <w:i w:val="0"/>
                 <w:color w:val="000000"/>
-                <w:sz w:val="14"/>
+                <w:sz w:val="20"/>
               </w:rPr>
-              <w:t>0,694</w:t>
+              <w:t>40,9</w:t>
             </w:r>
           </w:p>
         </w:tc>
         <w:tc>
           <w:tcPr>
-            <w:tcW w:type="dxa" w:w="784"/>
+            <w:tcW w:type="dxa" w:w="1045"/>
+            <w:tcBorders>
+              <w:top w:val="nil"/>
+              <w:left w:val="nil"/>
+              <w:bottom w:val="single" w:sz="16" w:space="0" w:color="000000"/>
+              <w:right w:val="nil"/>
+            </w:tcBorders>
           </w:tcPr>
           <w:p>
+            <w:pPr>
+              <w:spacing w:after="0"/>
+              <w:jc w:val="right"/>
+            </w:pPr>
             <w:r/>
             <w:r>
               <w:rPr>
@@ -2816,340 +4067,68 @@
                 <w:b w:val="0"/>
                 <w:i w:val="0"/>
                 <w:color w:val="000000"/>
-                <w:sz w:val="14"/>
-              </w:rPr>
-              <w:t>0,739 / 0,811 / 0,694</w:t>
-            </w:r>
-          </w:p>
-        </w:tc>
-        <w:tc>
-          <w:tcPr>
-            <w:tcW w:type="dxa" w:w="784"/>
-          </w:tcPr>
-          <w:p>
-            <w:r/>
-            <w:r>
-              <w:rPr>
-                <w:rFonts w:ascii="Times New Roman" w:hAnsi="Times New Roman" w:eastAsia="Times New Roman"/>
-                <w:b w:val="0"/>
-                <w:i w:val="0"/>
-                <w:color w:val="000000"/>
-                <w:sz w:val="14"/>
-              </w:rPr>
-              <w:t>0,940</w:t>
-            </w:r>
-          </w:p>
-        </w:tc>
-        <w:tc>
-          <w:tcPr>
-            <w:tcW w:type="dxa" w:w="784"/>
-          </w:tcPr>
-          <w:p>
-            <w:r/>
-            <w:r>
-              <w:rPr>
-                <w:rFonts w:ascii="Times New Roman" w:hAnsi="Times New Roman" w:eastAsia="Times New Roman"/>
-                <w:b w:val="0"/>
-                <w:i w:val="0"/>
-                <w:color w:val="000000"/>
-                <w:sz w:val="14"/>
-              </w:rPr>
-              <w:t>32</w:t>
-            </w:r>
-          </w:p>
-        </w:tc>
-        <w:tc>
-          <w:tcPr>
-            <w:tcW w:type="dxa" w:w="784"/>
-          </w:tcPr>
-          <w:p>
-            <w:r/>
-            <w:r>
-              <w:rPr>
-                <w:rFonts w:ascii="Times New Roman" w:hAnsi="Times New Roman" w:eastAsia="Times New Roman"/>
-                <w:b w:val="0"/>
-                <w:i w:val="0"/>
-                <w:color w:val="000000"/>
-                <w:sz w:val="14"/>
-              </w:rPr>
-              <w:t>135</w:t>
-            </w:r>
-          </w:p>
-        </w:tc>
-        <w:tc>
-          <w:tcPr>
-            <w:tcW w:type="dxa" w:w="784"/>
-          </w:tcPr>
-          <w:p>
-            <w:r/>
-            <w:r>
-              <w:rPr>
-                <w:rFonts w:ascii="Times New Roman" w:hAnsi="Times New Roman" w:eastAsia="Times New Roman"/>
-                <w:b w:val="0"/>
-                <w:i w:val="0"/>
-                <w:color w:val="000000"/>
-                <w:sz w:val="14"/>
-              </w:rPr>
-              <w:t>sim</w:t>
-            </w:r>
-          </w:p>
-        </w:tc>
-        <w:tc>
-          <w:tcPr>
-            <w:tcW w:type="dxa" w:w="784"/>
-          </w:tcPr>
-          <w:p>
-            <w:r/>
-            <w:r>
-              <w:rPr>
-                <w:rFonts w:ascii="Times New Roman" w:hAnsi="Times New Roman" w:eastAsia="Times New Roman"/>
-                <w:b w:val="0"/>
-                <w:i w:val="0"/>
-                <w:color w:val="000000"/>
-                <w:sz w:val="14"/>
-              </w:rPr>
-              <w:t>10</w:t>
-            </w:r>
-          </w:p>
-        </w:tc>
-        <w:tc>
-          <w:tcPr>
-            <w:tcW w:type="dxa" w:w="784"/>
-          </w:tcPr>
-          <w:p>
-            <w:r/>
-            <w:r>
-              <w:rPr>
-                <w:rFonts w:ascii="Times New Roman" w:hAnsi="Times New Roman" w:eastAsia="Times New Roman"/>
-                <w:b w:val="0"/>
-                <w:i w:val="0"/>
-                <w:color w:val="000000"/>
-                <w:sz w:val="14"/>
-              </w:rPr>
-              <w:t>20</w:t>
-            </w:r>
-          </w:p>
-        </w:tc>
-      </w:tr>
-      <w:tr>
-        <w:tc>
-          <w:tcPr>
-            <w:tcW w:type="dxa" w:w="784"/>
-          </w:tcPr>
-          <w:p>
-            <w:r/>
-            <w:r>
-              <w:rPr>
-                <w:rFonts w:ascii="Times New Roman" w:hAnsi="Times New Roman" w:eastAsia="Times New Roman"/>
-                <w:b w:val="0"/>
-                <w:i w:val="0"/>
-                <w:color w:val="000000"/>
-                <w:sz w:val="14"/>
-              </w:rPr>
-              <w:t>12 h</w:t>
-            </w:r>
-          </w:p>
-        </w:tc>
-        <w:tc>
-          <w:tcPr>
-            <w:tcW w:type="dxa" w:w="784"/>
-          </w:tcPr>
-          <w:p>
-            <w:r/>
-            <w:r>
-              <w:rPr>
-                <w:rFonts w:ascii="Times New Roman" w:hAnsi="Times New Roman" w:eastAsia="Times New Roman"/>
-                <w:b w:val="0"/>
-                <w:i w:val="0"/>
-                <w:color w:val="000000"/>
-                <w:sz w:val="14"/>
-              </w:rPr>
-              <w:t>CONV</w:t>
-            </w:r>
-          </w:p>
-        </w:tc>
-        <w:tc>
-          <w:tcPr>
-            <w:tcW w:type="dxa" w:w="784"/>
-          </w:tcPr>
-          <w:p>
-            <w:r/>
-            <w:r>
-              <w:rPr>
-                <w:rFonts w:ascii="Times New Roman" w:hAnsi="Times New Roman" w:eastAsia="Times New Roman"/>
-                <w:b w:val="0"/>
-                <w:i w:val="0"/>
-                <w:color w:val="000000"/>
-                <w:sz w:val="14"/>
-              </w:rPr>
-              <w:t>14 entradas (C0149)</w:t>
-            </w:r>
-          </w:p>
-        </w:tc>
-        <w:tc>
-          <w:tcPr>
-            <w:tcW w:type="dxa" w:w="784"/>
-          </w:tcPr>
-          <w:p>
-            <w:r/>
-            <w:r>
-              <w:rPr>
-                <w:rFonts w:ascii="Times New Roman" w:hAnsi="Times New Roman" w:eastAsia="Times New Roman"/>
-                <w:b w:val="0"/>
-                <w:i w:val="0"/>
-                <w:color w:val="000000"/>
-                <w:sz w:val="14"/>
-              </w:rPr>
-              <w:t>R01_T2_V1_3</w:t>
-            </w:r>
-          </w:p>
-        </w:tc>
-        <w:tc>
-          <w:tcPr>
-            <w:tcW w:type="dxa" w:w="784"/>
-          </w:tcPr>
-          <w:p>
-            <w:r/>
-            <w:r>
-              <w:rPr>
-                <w:rFonts w:ascii="Times New Roman" w:hAnsi="Times New Roman" w:eastAsia="Times New Roman"/>
-                <w:b w:val="0"/>
-                <w:i w:val="0"/>
-                <w:color w:val="000000"/>
-                <w:sz w:val="14"/>
-              </w:rPr>
-              <w:t>0,690</w:t>
-            </w:r>
-          </w:p>
-        </w:tc>
-        <w:tc>
-          <w:tcPr>
-            <w:tcW w:type="dxa" w:w="784"/>
-          </w:tcPr>
-          <w:p>
-            <w:r/>
-            <w:r>
-              <w:rPr>
-                <w:rFonts w:ascii="Times New Roman" w:hAnsi="Times New Roman" w:eastAsia="Times New Roman"/>
-                <w:b w:val="0"/>
-                <w:i w:val="0"/>
-                <w:color w:val="000000"/>
-                <w:sz w:val="14"/>
-              </w:rPr>
-              <w:t>0,824 / 0,690 / 0,696</w:t>
-            </w:r>
-          </w:p>
-        </w:tc>
-        <w:tc>
-          <w:tcPr>
-            <w:tcW w:type="dxa" w:w="784"/>
-          </w:tcPr>
-          <w:p>
-            <w:r/>
-            <w:r>
-              <w:rPr>
-                <w:rFonts w:ascii="Times New Roman" w:hAnsi="Times New Roman" w:eastAsia="Times New Roman"/>
-                <w:b w:val="0"/>
-                <w:i w:val="0"/>
-                <w:color w:val="000000"/>
-                <w:sz w:val="14"/>
-              </w:rPr>
-              <w:t>0,885</w:t>
-            </w:r>
-          </w:p>
-        </w:tc>
-        <w:tc>
-          <w:tcPr>
-            <w:tcW w:type="dxa" w:w="784"/>
-          </w:tcPr>
-          <w:p>
-            <w:r/>
-            <w:r>
-              <w:rPr>
-                <w:rFonts w:ascii="Times New Roman" w:hAnsi="Times New Roman" w:eastAsia="Times New Roman"/>
-                <w:b w:val="0"/>
-                <w:i w:val="0"/>
-                <w:color w:val="000000"/>
-                <w:sz w:val="14"/>
-              </w:rPr>
-              <w:t>40,9</w:t>
-            </w:r>
-          </w:p>
-        </w:tc>
-        <w:tc>
-          <w:tcPr>
-            <w:tcW w:type="dxa" w:w="784"/>
-          </w:tcPr>
-          <w:p>
-            <w:r/>
-            <w:r>
-              <w:rPr>
-                <w:rFonts w:ascii="Times New Roman" w:hAnsi="Times New Roman" w:eastAsia="Times New Roman"/>
-                <w:b w:val="0"/>
-                <w:i w:val="0"/>
-                <w:color w:val="000000"/>
-                <w:sz w:val="14"/>
+                <w:sz w:val="20"/>
               </w:rPr>
               <w:t>125</w:t>
             </w:r>
           </w:p>
         </w:tc>
-        <w:tc>
-          <w:tcPr>
-            <w:tcW w:type="dxa" w:w="784"/>
-          </w:tcPr>
-          <w:p>
-            <w:r/>
-            <w:r>
-              <w:rPr>
-                <w:rFonts w:ascii="Times New Roman" w:hAnsi="Times New Roman" w:eastAsia="Times New Roman"/>
-                <w:b w:val="0"/>
-                <w:i w:val="0"/>
-                <w:color w:val="000000"/>
-                <w:sz w:val="14"/>
-              </w:rPr>
-              <w:t>sim</w:t>
-            </w:r>
-          </w:p>
-        </w:tc>
-        <w:tc>
-          <w:tcPr>
-            <w:tcW w:type="dxa" w:w="784"/>
-          </w:tcPr>
-          <w:p>
-            <w:r/>
-            <w:r>
-              <w:rPr>
-                <w:rFonts w:ascii="Times New Roman" w:hAnsi="Times New Roman" w:eastAsia="Times New Roman"/>
-                <w:b w:val="0"/>
-                <w:i w:val="0"/>
-                <w:color w:val="000000"/>
-                <w:sz w:val="14"/>
-              </w:rPr>
-              <w:t>14</w:t>
-            </w:r>
-          </w:p>
-        </w:tc>
-        <w:tc>
-          <w:tcPr>
-            <w:tcW w:type="dxa" w:w="784"/>
-          </w:tcPr>
-          <w:p>
-            <w:r/>
-            <w:r>
-              <w:rPr>
-                <w:rFonts w:ascii="Times New Roman" w:hAnsi="Times New Roman" w:eastAsia="Times New Roman"/>
-                <w:b w:val="0"/>
-                <w:i w:val="0"/>
-                <w:color w:val="000000"/>
-                <w:sz w:val="14"/>
-              </w:rPr>
-              <w:t>28</w:t>
-            </w:r>
-          </w:p>
-        </w:tc>
       </w:tr>
     </w:tbl>
+    <w:p>
+      <w:pPr>
+        <w:spacing w:before="80" w:after="40" w:line="276" w:lineRule="auto"/>
+        <w:ind w:firstLine="0"/>
+        <w:jc w:val="left"/>
+      </w:pPr>
+      <w:r>
+        <w:rPr>
+          <w:rFonts w:ascii="Times New Roman" w:hAnsi="Times New Roman" w:eastAsia="Times New Roman"/>
+          <w:b/>
+          <w:i w:val="0"/>
+          <w:color w:val="000000"/>
+          <w:sz w:val="20"/>
+        </w:rPr>
+        <w:t xml:space="preserve">Fonte: </w:t>
+      </w:r>
+      <w:r>
+        <w:rPr>
+          <w:rFonts w:ascii="Times New Roman" w:hAnsi="Times New Roman" w:eastAsia="Times New Roman"/>
+          <w:b w:val="0"/>
+          <w:i w:val="0"/>
+          <w:color w:val="000000"/>
+          <w:sz w:val="20"/>
+        </w:rPr>
+        <w:t>Fichas do recorte de 282 redes (artigo_rna_santa_tereza.json).</w:t>
+      </w:r>
+    </w:p>
+    <w:p>
+      <w:pPr>
+        <w:spacing w:after="200" w:line="276" w:lineRule="auto"/>
+        <w:ind w:firstLine="0"/>
+        <w:jc w:val="left"/>
+      </w:pPr>
+      <w:r>
+        <w:rPr>
+          <w:rFonts w:ascii="Times New Roman" w:hAnsi="Times New Roman" w:eastAsia="Times New Roman"/>
+          <w:b/>
+          <w:i w:val="0"/>
+          <w:color w:val="000000"/>
+          <w:sz w:val="20"/>
+        </w:rPr>
+        <w:t xml:space="preserve">Nota: </w:t>
+      </w:r>
+      <w:r>
+        <w:rPr>
+          <w:rFonts w:ascii="Times New Roman" w:hAnsi="Times New Roman" w:eastAsia="Times New Roman"/>
+          <w:b w:val="0"/>
+          <w:i w:val="0"/>
+          <w:color w:val="000000"/>
+          <w:sz w:val="20"/>
+        </w:rPr>
+        <w:t>NS = coeficiente de Nash-Sutcliffe no teste. MAE e E95 no teste por eventos, em centímetros na régua. ALT: a rede prevê a variação do nível. CONV: família complementar (equação de saída a declarar). Identificadores MATLAB: 2 h = 009_alt_STZ_2H_R09_T10-15-16_V1-5-12-17-21; 4 h = V01_R10_T19-21_V1-3-5-15-17_nh48_nit10_cic100000; 8 h = altR_004_08_8h_alt_8H_ALT_C0289; 12 h = 004_conv_C0149_R01_T2_V1_3. Chuva de 36 h ausente só em 2 h. Entradas / neurônios ocultos: 15/30, 24/48, 10/20 e 14/28.</w:t>
+      </w:r>
+    </w:p>
     <w:p>
       <w:pPr>
         <w:spacing w:after="160" w:line="360" w:lineRule="auto"/>

</xml_diff>

<commit_message>
Ajusta a Tabela 1 ao A4: 7 colunas e cabeçalho ABNT em duas linhas.
Junta os três PERS numa coluna, quebra unidade na linha de baixo e grava larguras fixas no DOCX para o Google Docs não partir Família, Equilíbrio nem o NS no meio do número.

Co-authored-by: juliana carolino carolino reis <juliana.reis@ufrgs.br>
</commit_message>
<xml_diff>
--- a/pesquisas/manuscrito-drive.docx
+++ b/pesquisas/manuscrito-drive.docx
@@ -398,7 +398,7 @@
       <w:tblPr>
         <w:tblW w:type="auto" w:w="0"/>
         <w:jc w:val="center"/>
-        <w:tblLayout w:type="autofit"/>
+        <w:tblLayout w:type="fixed"/>
         <w:tblLook w:firstColumn="1" w:firstRow="1" w:lastColumn="0" w:lastRow="0" w:noHBand="0" w:noVBand="1" w:val="04A0"/>
         <w:tblBorders>
           <w:top w:val="nil"/>
@@ -428,7 +428,7 @@
           </w:tcPr>
           <w:p>
             <w:pPr>
-              <w:spacing w:after="0"/>
+              <w:spacing w:after="0" w:before="0"/>
               <w:jc w:val="center"/>
             </w:pPr>
             <w:r/>
@@ -456,7 +456,7 @@
           </w:tcPr>
           <w:p>
             <w:pPr>
-              <w:spacing w:after="0"/>
+              <w:spacing w:after="0" w:before="0"/>
               <w:jc w:val="center"/>
             </w:pPr>
             <w:r/>
@@ -484,7 +484,7 @@
           </w:tcPr>
           <w:p>
             <w:pPr>
-              <w:spacing w:after="0"/>
+              <w:spacing w:after="0" w:before="0"/>
               <w:jc w:val="center"/>
             </w:pPr>
             <w:r/>
@@ -512,7 +512,7 @@
           </w:tcPr>
           <w:p>
             <w:pPr>
-              <w:spacing w:after="0"/>
+              <w:spacing w:after="0" w:before="0"/>
               <w:jc w:val="center"/>
             </w:pPr>
             <w:r/>
@@ -542,7 +542,7 @@
           </w:tcPr>
           <w:p>
             <w:pPr>
-              <w:spacing w:after="0"/>
+              <w:spacing w:after="0" w:before="0"/>
               <w:jc w:val="left"/>
             </w:pPr>
             <w:r/>
@@ -570,7 +570,7 @@
           </w:tcPr>
           <w:p>
             <w:pPr>
-              <w:spacing w:after="0"/>
+              <w:spacing w:after="0" w:before="0"/>
               <w:jc w:val="left"/>
             </w:pPr>
             <w:r/>
@@ -598,7 +598,7 @@
           </w:tcPr>
           <w:p>
             <w:pPr>
-              <w:spacing w:after="0"/>
+              <w:spacing w:after="0" w:before="0"/>
               <w:jc w:val="left"/>
             </w:pPr>
             <w:r/>
@@ -626,7 +626,7 @@
           </w:tcPr>
           <w:p>
             <w:pPr>
-              <w:spacing w:after="0"/>
+              <w:spacing w:after="0" w:before="0"/>
               <w:jc w:val="left"/>
             </w:pPr>
             <w:r/>
@@ -656,7 +656,7 @@
           </w:tcPr>
           <w:p>
             <w:pPr>
-              <w:spacing w:after="0"/>
+              <w:spacing w:after="0" w:before="0"/>
               <w:jc w:val="left"/>
             </w:pPr>
             <w:r/>
@@ -684,7 +684,7 @@
           </w:tcPr>
           <w:p>
             <w:pPr>
-              <w:spacing w:after="0"/>
+              <w:spacing w:after="0" w:before="0"/>
               <w:jc w:val="left"/>
             </w:pPr>
             <w:r/>
@@ -712,7 +712,7 @@
           </w:tcPr>
           <w:p>
             <w:pPr>
-              <w:spacing w:after="0"/>
+              <w:spacing w:after="0" w:before="0"/>
               <w:jc w:val="left"/>
             </w:pPr>
             <w:r/>
@@ -740,7 +740,7 @@
           </w:tcPr>
           <w:p>
             <w:pPr>
-              <w:spacing w:after="0"/>
+              <w:spacing w:after="0" w:before="0"/>
               <w:jc w:val="left"/>
             </w:pPr>
             <w:r/>
@@ -770,7 +770,7 @@
           </w:tcPr>
           <w:p>
             <w:pPr>
-              <w:spacing w:after="0"/>
+              <w:spacing w:after="0" w:before="0"/>
               <w:jc w:val="left"/>
             </w:pPr>
             <w:r/>
@@ -798,7 +798,7 @@
           </w:tcPr>
           <w:p>
             <w:pPr>
-              <w:spacing w:after="0"/>
+              <w:spacing w:after="0" w:before="0"/>
               <w:jc w:val="left"/>
             </w:pPr>
             <w:r/>
@@ -826,7 +826,7 @@
           </w:tcPr>
           <w:p>
             <w:pPr>
-              <w:spacing w:after="0"/>
+              <w:spacing w:after="0" w:before="0"/>
               <w:jc w:val="left"/>
             </w:pPr>
             <w:r/>
@@ -854,7 +854,7 @@
           </w:tcPr>
           <w:p>
             <w:pPr>
-              <w:spacing w:after="0"/>
+              <w:spacing w:after="0" w:before="0"/>
               <w:jc w:val="left"/>
             </w:pPr>
             <w:r/>
@@ -884,7 +884,7 @@
           </w:tcPr>
           <w:p>
             <w:pPr>
-              <w:spacing w:after="0"/>
+              <w:spacing w:after="0" w:before="0"/>
               <w:jc w:val="left"/>
             </w:pPr>
             <w:r/>
@@ -912,7 +912,7 @@
           </w:tcPr>
           <w:p>
             <w:pPr>
-              <w:spacing w:after="0"/>
+              <w:spacing w:after="0" w:before="0"/>
               <w:jc w:val="left"/>
             </w:pPr>
             <w:r/>
@@ -940,7 +940,7 @@
           </w:tcPr>
           <w:p>
             <w:pPr>
-              <w:spacing w:after="0"/>
+              <w:spacing w:after="0" w:before="0"/>
               <w:jc w:val="left"/>
             </w:pPr>
             <w:r/>
@@ -968,7 +968,7 @@
           </w:tcPr>
           <w:p>
             <w:pPr>
-              <w:spacing w:after="0"/>
+              <w:spacing w:after="0" w:before="0"/>
               <w:jc w:val="left"/>
             </w:pPr>
             <w:r/>
@@ -998,7 +998,7 @@
           </w:tcPr>
           <w:p>
             <w:pPr>
-              <w:spacing w:after="0"/>
+              <w:spacing w:after="0" w:before="0"/>
               <w:jc w:val="left"/>
             </w:pPr>
             <w:r/>
@@ -1026,7 +1026,7 @@
           </w:tcPr>
           <w:p>
             <w:pPr>
-              <w:spacing w:after="0"/>
+              <w:spacing w:after="0" w:before="0"/>
               <w:jc w:val="left"/>
             </w:pPr>
             <w:r/>
@@ -1054,7 +1054,7 @@
           </w:tcPr>
           <w:p>
             <w:pPr>
-              <w:spacing w:after="0"/>
+              <w:spacing w:after="0" w:before="0"/>
               <w:jc w:val="left"/>
             </w:pPr>
             <w:r/>
@@ -1082,7 +1082,7 @@
           </w:tcPr>
           <w:p>
             <w:pPr>
-              <w:spacing w:after="0"/>
+              <w:spacing w:after="0" w:before="0"/>
               <w:jc w:val="left"/>
             </w:pPr>
             <w:r/>
@@ -1112,7 +1112,7 @@
           </w:tcPr>
           <w:p>
             <w:pPr>
-              <w:spacing w:after="0"/>
+              <w:spacing w:after="0" w:before="0"/>
               <w:jc w:val="left"/>
             </w:pPr>
             <w:r/>
@@ -1140,7 +1140,7 @@
           </w:tcPr>
           <w:p>
             <w:pPr>
-              <w:spacing w:after="0"/>
+              <w:spacing w:after="0" w:before="0"/>
               <w:jc w:val="left"/>
             </w:pPr>
             <w:r/>
@@ -1168,7 +1168,7 @@
           </w:tcPr>
           <w:p>
             <w:pPr>
-              <w:spacing w:after="0"/>
+              <w:spacing w:after="0" w:before="0"/>
               <w:jc w:val="left"/>
             </w:pPr>
             <w:r/>
@@ -1196,7 +1196,7 @@
           </w:tcPr>
           <w:p>
             <w:pPr>
-              <w:spacing w:after="0"/>
+              <w:spacing w:after="0" w:before="0"/>
               <w:jc w:val="left"/>
             </w:pPr>
             <w:r/>
@@ -1226,7 +1226,7 @@
           </w:tcPr>
           <w:p>
             <w:pPr>
-              <w:spacing w:after="0"/>
+              <w:spacing w:after="0" w:before="0"/>
               <w:jc w:val="left"/>
             </w:pPr>
             <w:r/>
@@ -1254,7 +1254,7 @@
           </w:tcPr>
           <w:p>
             <w:pPr>
-              <w:spacing w:after="0"/>
+              <w:spacing w:after="0" w:before="0"/>
               <w:jc w:val="left"/>
             </w:pPr>
             <w:r/>
@@ -1282,7 +1282,7 @@
           </w:tcPr>
           <w:p>
             <w:pPr>
-              <w:spacing w:after="0"/>
+              <w:spacing w:after="0" w:before="0"/>
               <w:jc w:val="left"/>
             </w:pPr>
             <w:r/>
@@ -1310,7 +1310,7 @@
           </w:tcPr>
           <w:p>
             <w:pPr>
-              <w:spacing w:after="0"/>
+              <w:spacing w:after="0" w:before="0"/>
               <w:jc w:val="left"/>
             </w:pPr>
             <w:r/>
@@ -1621,7 +1621,7 @@
       <w:tblPr>
         <w:tblW w:type="auto" w:w="0"/>
         <w:jc w:val="center"/>
-        <w:tblLayout w:type="autofit"/>
+        <w:tblLayout w:type="fixed"/>
         <w:tblLook w:firstColumn="1" w:firstRow="1" w:lastColumn="0" w:lastRow="0" w:noHBand="0" w:noVBand="1" w:val="04A0"/>
         <w:tblBorders>
           <w:top w:val="nil"/>
@@ -1651,7 +1651,7 @@
           </w:tcPr>
           <w:p>
             <w:pPr>
-              <w:spacing w:after="0"/>
+              <w:spacing w:after="0" w:before="0"/>
               <w:jc w:val="center"/>
             </w:pPr>
             <w:r/>
@@ -1679,7 +1679,7 @@
           </w:tcPr>
           <w:p>
             <w:pPr>
-              <w:spacing w:after="0"/>
+              <w:spacing w:after="0" w:before="0"/>
               <w:jc w:val="center"/>
             </w:pPr>
             <w:r/>
@@ -1707,7 +1707,7 @@
           </w:tcPr>
           <w:p>
             <w:pPr>
-              <w:spacing w:after="0"/>
+              <w:spacing w:after="0" w:before="0"/>
               <w:jc w:val="center"/>
             </w:pPr>
             <w:r/>
@@ -1735,7 +1735,7 @@
           </w:tcPr>
           <w:p>
             <w:pPr>
-              <w:spacing w:after="0"/>
+              <w:spacing w:after="0" w:before="0"/>
               <w:jc w:val="center"/>
             </w:pPr>
             <w:r/>
@@ -1765,7 +1765,7 @@
           </w:tcPr>
           <w:p>
             <w:pPr>
-              <w:spacing w:after="0"/>
+              <w:spacing w:after="0" w:before="0"/>
               <w:jc w:val="left"/>
             </w:pPr>
             <w:r/>
@@ -1793,7 +1793,7 @@
           </w:tcPr>
           <w:p>
             <w:pPr>
-              <w:spacing w:after="0"/>
+              <w:spacing w:after="0" w:before="0"/>
               <w:jc w:val="left"/>
             </w:pPr>
             <w:r/>
@@ -1821,7 +1821,7 @@
           </w:tcPr>
           <w:p>
             <w:pPr>
-              <w:spacing w:after="0"/>
+              <w:spacing w:after="0" w:before="0"/>
               <w:jc w:val="right"/>
             </w:pPr>
             <w:r/>
@@ -1849,7 +1849,7 @@
           </w:tcPr>
           <w:p>
             <w:pPr>
-              <w:spacing w:after="0"/>
+              <w:spacing w:after="0" w:before="0"/>
               <w:jc w:val="left"/>
             </w:pPr>
             <w:r/>
@@ -1879,7 +1879,7 @@
           </w:tcPr>
           <w:p>
             <w:pPr>
-              <w:spacing w:after="0"/>
+              <w:spacing w:after="0" w:before="0"/>
               <w:jc w:val="left"/>
             </w:pPr>
             <w:r/>
@@ -1907,7 +1907,7 @@
           </w:tcPr>
           <w:p>
             <w:pPr>
-              <w:spacing w:after="0"/>
+              <w:spacing w:after="0" w:before="0"/>
               <w:jc w:val="left"/>
             </w:pPr>
             <w:r/>
@@ -1935,7 +1935,7 @@
           </w:tcPr>
           <w:p>
             <w:pPr>
-              <w:spacing w:after="0"/>
+              <w:spacing w:after="0" w:before="0"/>
               <w:jc w:val="right"/>
             </w:pPr>
             <w:r/>
@@ -1963,7 +1963,7 @@
           </w:tcPr>
           <w:p>
             <w:pPr>
-              <w:spacing w:after="0"/>
+              <w:spacing w:after="0" w:before="0"/>
               <w:jc w:val="left"/>
             </w:pPr>
             <w:r/>
@@ -1993,7 +1993,7 @@
           </w:tcPr>
           <w:p>
             <w:pPr>
-              <w:spacing w:after="0"/>
+              <w:spacing w:after="0" w:before="0"/>
               <w:jc w:val="left"/>
             </w:pPr>
             <w:r/>
@@ -2021,7 +2021,7 @@
           </w:tcPr>
           <w:p>
             <w:pPr>
-              <w:spacing w:after="0"/>
+              <w:spacing w:after="0" w:before="0"/>
               <w:jc w:val="left"/>
             </w:pPr>
             <w:r/>
@@ -2049,7 +2049,7 @@
           </w:tcPr>
           <w:p>
             <w:pPr>
-              <w:spacing w:after="0"/>
+              <w:spacing w:after="0" w:before="0"/>
               <w:jc w:val="right"/>
             </w:pPr>
             <w:r/>
@@ -2077,7 +2077,7 @@
           </w:tcPr>
           <w:p>
             <w:pPr>
-              <w:spacing w:after="0"/>
+              <w:spacing w:after="0" w:before="0"/>
               <w:jc w:val="left"/>
             </w:pPr>
             <w:r/>
@@ -2107,7 +2107,7 @@
           </w:tcPr>
           <w:p>
             <w:pPr>
-              <w:spacing w:after="0"/>
+              <w:spacing w:after="0" w:before="0"/>
               <w:jc w:val="left"/>
             </w:pPr>
             <w:r/>
@@ -2135,7 +2135,7 @@
           </w:tcPr>
           <w:p>
             <w:pPr>
-              <w:spacing w:after="0"/>
+              <w:spacing w:after="0" w:before="0"/>
               <w:jc w:val="left"/>
             </w:pPr>
             <w:r/>
@@ -2163,7 +2163,7 @@
           </w:tcPr>
           <w:p>
             <w:pPr>
-              <w:spacing w:after="0"/>
+              <w:spacing w:after="0" w:before="0"/>
               <w:jc w:val="right"/>
             </w:pPr>
             <w:r/>
@@ -2191,7 +2191,7 @@
           </w:tcPr>
           <w:p>
             <w:pPr>
-              <w:spacing w:after="0"/>
+              <w:spacing w:after="0" w:before="0"/>
               <w:jc w:val="left"/>
             </w:pPr>
             <w:r/>
@@ -2221,7 +2221,7 @@
           </w:tcPr>
           <w:p>
             <w:pPr>
-              <w:spacing w:after="0"/>
+              <w:spacing w:after="0" w:before="0"/>
               <w:jc w:val="left"/>
             </w:pPr>
             <w:r/>
@@ -2249,7 +2249,7 @@
           </w:tcPr>
           <w:p>
             <w:pPr>
-              <w:spacing w:after="0"/>
+              <w:spacing w:after="0" w:before="0"/>
               <w:jc w:val="left"/>
             </w:pPr>
             <w:r/>
@@ -2277,7 +2277,7 @@
           </w:tcPr>
           <w:p>
             <w:pPr>
-              <w:spacing w:after="0"/>
+              <w:spacing w:after="0" w:before="0"/>
               <w:jc w:val="right"/>
             </w:pPr>
             <w:r/>
@@ -2305,7 +2305,7 @@
           </w:tcPr>
           <w:p>
             <w:pPr>
-              <w:spacing w:after="0"/>
+              <w:spacing w:after="0" w:before="0"/>
               <w:jc w:val="left"/>
             </w:pPr>
             <w:r/>
@@ -2335,7 +2335,7 @@
           </w:tcPr>
           <w:p>
             <w:pPr>
-              <w:spacing w:after="0"/>
+              <w:spacing w:after="0" w:before="0"/>
               <w:jc w:val="left"/>
             </w:pPr>
             <w:r/>
@@ -2363,7 +2363,7 @@
           </w:tcPr>
           <w:p>
             <w:pPr>
-              <w:spacing w:after="0"/>
+              <w:spacing w:after="0" w:before="0"/>
               <w:jc w:val="left"/>
             </w:pPr>
             <w:r/>
@@ -2391,7 +2391,7 @@
           </w:tcPr>
           <w:p>
             <w:pPr>
-              <w:spacing w:after="0"/>
+              <w:spacing w:after="0" w:before="0"/>
               <w:jc w:val="right"/>
             </w:pPr>
             <w:r/>
@@ -2419,7 +2419,7 @@
           </w:tcPr>
           <w:p>
             <w:pPr>
-              <w:spacing w:after="0"/>
+              <w:spacing w:after="0" w:before="0"/>
               <w:jc w:val="left"/>
             </w:pPr>
             <w:r/>
@@ -2449,7 +2449,7 @@
           </w:tcPr>
           <w:p>
             <w:pPr>
-              <w:spacing w:after="0"/>
+              <w:spacing w:after="0" w:before="0"/>
               <w:jc w:val="left"/>
             </w:pPr>
             <w:r/>
@@ -2477,7 +2477,7 @@
           </w:tcPr>
           <w:p>
             <w:pPr>
-              <w:spacing w:after="0"/>
+              <w:spacing w:after="0" w:before="0"/>
               <w:jc w:val="left"/>
             </w:pPr>
             <w:r/>
@@ -2505,7 +2505,7 @@
           </w:tcPr>
           <w:p>
             <w:pPr>
-              <w:spacing w:after="0"/>
+              <w:spacing w:after="0" w:before="0"/>
               <w:jc w:val="right"/>
             </w:pPr>
             <w:r/>
@@ -2533,7 +2533,7 @@
           </w:tcPr>
           <w:p>
             <w:pPr>
-              <w:spacing w:after="0"/>
+              <w:spacing w:after="0" w:before="0"/>
               <w:jc w:val="left"/>
             </w:pPr>
             <w:r/>
@@ -2563,7 +2563,7 @@
           </w:tcPr>
           <w:p>
             <w:pPr>
-              <w:spacing w:after="0"/>
+              <w:spacing w:after="0" w:before="0"/>
               <w:jc w:val="left"/>
             </w:pPr>
             <w:r/>
@@ -2591,7 +2591,7 @@
           </w:tcPr>
           <w:p>
             <w:pPr>
-              <w:spacing w:after="0"/>
+              <w:spacing w:after="0" w:before="0"/>
               <w:jc w:val="left"/>
             </w:pPr>
             <w:r/>
@@ -2619,7 +2619,7 @@
           </w:tcPr>
           <w:p>
             <w:pPr>
-              <w:spacing w:after="0"/>
+              <w:spacing w:after="0" w:before="0"/>
               <w:jc w:val="right"/>
             </w:pPr>
             <w:r/>
@@ -2647,7 +2647,7 @@
           </w:tcPr>
           <w:p>
             <w:pPr>
-              <w:spacing w:after="0"/>
+              <w:spacing w:after="0" w:before="0"/>
               <w:jc w:val="left"/>
             </w:pPr>
             <w:r/>
@@ -2780,9 +2780,7 @@
     </w:p>
     <w:tbl>
       <w:tblPr>
-        <w:tblW w:type="auto" w:w="0"/>
         <w:jc w:val="center"/>
-        <w:tblLayout w:type="autofit"/>
         <w:tblLook w:firstColumn="1" w:firstRow="1" w:lastColumn="0" w:lastRow="0" w:noHBand="0" w:noVBand="1" w:val="04A0"/>
         <w:tblBorders>
           <w:top w:val="nil"/>
@@ -2792,22 +2790,23 @@
           <w:insideH w:val="nil"/>
           <w:insideV w:val="nil"/>
         </w:tblBorders>
+        <w:tblLayout w:type="fixed"/>
+        <w:tblW w:w="9071" w:type="dxa"/>
       </w:tblPr>
       <w:tblGrid>
-        <w:gridCol w:w="1045"/>
-        <w:gridCol w:w="1045"/>
-        <w:gridCol w:w="1045"/>
-        <w:gridCol w:w="1045"/>
-        <w:gridCol w:w="1045"/>
-        <w:gridCol w:w="1045"/>
-        <w:gridCol w:w="1045"/>
-        <w:gridCol w:w="1045"/>
-        <w:gridCol w:w="1045"/>
+        <w:gridCol w:w="1077"/>
+        <w:gridCol w:w="964"/>
+        <w:gridCol w:w="1134"/>
+        <w:gridCol w:w="2948"/>
+        <w:gridCol w:w="794"/>
+        <w:gridCol w:w="1077"/>
+        <w:gridCol w:w="1077"/>
       </w:tblGrid>
       <w:tr>
         <w:tc>
           <w:tcPr>
-            <w:tcW w:type="dxa" w:w="1045"/>
+            <w:tcW w:w="1077" w:type="dxa"/>
+            <w:noWrap/>
             <w:tcBorders>
               <w:top w:val="single" w:sz="16" w:space="0" w:color="000000"/>
               <w:left w:val="nil"/>
@@ -2817,7 +2816,7 @@
           </w:tcPr>
           <w:p>
             <w:pPr>
-              <w:spacing w:after="0"/>
+              <w:spacing w:after="0" w:before="0"/>
               <w:jc w:val="center"/>
             </w:pPr>
             <w:r/>
@@ -2835,7 +2834,8 @@
         </w:tc>
         <w:tc>
           <w:tcPr>
-            <w:tcW w:type="dxa" w:w="1045"/>
+            <w:tcW w:w="964" w:type="dxa"/>
+            <w:noWrap/>
             <w:tcBorders>
               <w:top w:val="single" w:sz="16" w:space="0" w:color="000000"/>
               <w:left w:val="nil"/>
@@ -2845,7 +2845,7 @@
           </w:tcPr>
           <w:p>
             <w:pPr>
-              <w:spacing w:after="0"/>
+              <w:spacing w:after="0" w:before="0"/>
               <w:jc w:val="center"/>
             </w:pPr>
             <w:r/>
@@ -2863,7 +2863,8 @@
         </w:tc>
         <w:tc>
           <w:tcPr>
-            <w:tcW w:type="dxa" w:w="1045"/>
+            <w:tcW w:w="1134" w:type="dxa"/>
+            <w:noWrap/>
             <w:tcBorders>
               <w:top w:val="single" w:sz="16" w:space="0" w:color="000000"/>
               <w:left w:val="nil"/>
@@ -2873,7 +2874,7 @@
           </w:tcPr>
           <w:p>
             <w:pPr>
-              <w:spacing w:after="0"/>
+              <w:spacing w:after="0" w:before="0"/>
               <w:jc w:val="center"/>
             </w:pPr>
             <w:r/>
@@ -2891,7 +2892,7 @@
         </w:tc>
         <w:tc>
           <w:tcPr>
-            <w:tcW w:type="dxa" w:w="1045"/>
+            <w:tcW w:w="2948" w:type="dxa"/>
             <w:tcBorders>
               <w:top w:val="single" w:sz="16" w:space="0" w:color="000000"/>
               <w:left w:val="nil"/>
@@ -2901,7 +2902,7 @@
           </w:tcPr>
           <w:p>
             <w:pPr>
-              <w:spacing w:after="0"/>
+              <w:spacing w:after="0" w:before="0"/>
               <w:jc w:val="center"/>
             </w:pPr>
             <w:r/>
@@ -2913,13 +2914,27 @@
                 <w:color w:val="000000"/>
                 <w:sz w:val="20"/>
               </w:rPr>
-              <w:t>PERS geral</w:t>
+              <w:t>PERS</w:t>
+            </w:r>
+            <w:r>
+              <w:br/>
+            </w:r>
+            <w:r>
+              <w:rPr>
+                <w:rFonts w:ascii="Times New Roman" w:hAnsi="Times New Roman" w:eastAsia="Times New Roman"/>
+                <w:b/>
+                <w:i w:val="0"/>
+                <w:color w:val="000000"/>
+                <w:sz w:val="20"/>
+              </w:rPr>
+              <w:t>(geral / validação / teste)</w:t>
             </w:r>
           </w:p>
         </w:tc>
         <w:tc>
           <w:tcPr>
-            <w:tcW w:type="dxa" w:w="1045"/>
+            <w:tcW w:w="794" w:type="dxa"/>
+            <w:noWrap/>
             <w:tcBorders>
               <w:top w:val="single" w:sz="16" w:space="0" w:color="000000"/>
               <w:left w:val="nil"/>
@@ -2929,63 +2944,7 @@
           </w:tcPr>
           <w:p>
             <w:pPr>
-              <w:spacing w:after="0"/>
-              <w:jc w:val="center"/>
-            </w:pPr>
-            <w:r/>
-            <w:r>
-              <w:rPr>
-                <w:rFonts w:ascii="Times New Roman" w:hAnsi="Times New Roman" w:eastAsia="Times New Roman"/>
-                <w:b/>
-                <w:i w:val="0"/>
-                <w:color w:val="000000"/>
-                <w:sz w:val="20"/>
-              </w:rPr>
-              <w:t>PERS validação</w:t>
-            </w:r>
-          </w:p>
-        </w:tc>
-        <w:tc>
-          <w:tcPr>
-            <w:tcW w:type="dxa" w:w="1045"/>
-            <w:tcBorders>
-              <w:top w:val="single" w:sz="16" w:space="0" w:color="000000"/>
-              <w:left w:val="nil"/>
-              <w:bottom w:val="single" w:sz="8" w:space="0" w:color="000000"/>
-              <w:right w:val="nil"/>
-            </w:tcBorders>
-          </w:tcPr>
-          <w:p>
-            <w:pPr>
-              <w:spacing w:after="0"/>
-              <w:jc w:val="center"/>
-            </w:pPr>
-            <w:r/>
-            <w:r>
-              <w:rPr>
-                <w:rFonts w:ascii="Times New Roman" w:hAnsi="Times New Roman" w:eastAsia="Times New Roman"/>
-                <w:b/>
-                <w:i w:val="0"/>
-                <w:color w:val="000000"/>
-                <w:sz w:val="20"/>
-              </w:rPr>
-              <w:t>PERS teste</w:t>
-            </w:r>
-          </w:p>
-        </w:tc>
-        <w:tc>
-          <w:tcPr>
-            <w:tcW w:type="dxa" w:w="1045"/>
-            <w:tcBorders>
-              <w:top w:val="single" w:sz="16" w:space="0" w:color="000000"/>
-              <w:left w:val="nil"/>
-              <w:bottom w:val="single" w:sz="8" w:space="0" w:color="000000"/>
-              <w:right w:val="nil"/>
-            </w:tcBorders>
-          </w:tcPr>
-          <w:p>
-            <w:pPr>
-              <w:spacing w:after="0"/>
+              <w:spacing w:after="0" w:before="0"/>
               <w:jc w:val="center"/>
             </w:pPr>
             <w:r/>
@@ -3003,7 +2962,7 @@
         </w:tc>
         <w:tc>
           <w:tcPr>
-            <w:tcW w:type="dxa" w:w="1045"/>
+            <w:tcW w:w="1077" w:type="dxa"/>
             <w:tcBorders>
               <w:top w:val="single" w:sz="16" w:space="0" w:color="000000"/>
               <w:left w:val="nil"/>
@@ -3013,7 +2972,7 @@
           </w:tcPr>
           <w:p>
             <w:pPr>
-              <w:spacing w:after="0"/>
+              <w:spacing w:after="0" w:before="0"/>
               <w:jc w:val="center"/>
             </w:pPr>
             <w:r/>
@@ -3025,13 +2984,26 @@
                 <w:color w:val="000000"/>
                 <w:sz w:val="20"/>
               </w:rPr>
-              <w:t>MAE (cm)</w:t>
+              <w:t>MAE</w:t>
+            </w:r>
+            <w:r>
+              <w:br/>
+            </w:r>
+            <w:r>
+              <w:rPr>
+                <w:rFonts w:ascii="Times New Roman" w:hAnsi="Times New Roman" w:eastAsia="Times New Roman"/>
+                <w:b/>
+                <w:i w:val="0"/>
+                <w:color w:val="000000"/>
+                <w:sz w:val="20"/>
+              </w:rPr>
+              <w:t>(cm)</w:t>
             </w:r>
           </w:p>
         </w:tc>
         <w:tc>
           <w:tcPr>
-            <w:tcW w:type="dxa" w:w="1045"/>
+            <w:tcW w:w="1077" w:type="dxa"/>
             <w:tcBorders>
               <w:top w:val="single" w:sz="16" w:space="0" w:color="000000"/>
               <w:left w:val="nil"/>
@@ -3041,7 +3013,7 @@
           </w:tcPr>
           <w:p>
             <w:pPr>
-              <w:spacing w:after="0"/>
+              <w:spacing w:after="0" w:before="0"/>
               <w:jc w:val="center"/>
             </w:pPr>
             <w:r/>
@@ -3053,7 +3025,20 @@
                 <w:color w:val="000000"/>
                 <w:sz w:val="20"/>
               </w:rPr>
-              <w:t>E95 (cm)</w:t>
+              <w:t>E95</w:t>
+            </w:r>
+            <w:r>
+              <w:br/>
+            </w:r>
+            <w:r>
+              <w:rPr>
+                <w:rFonts w:ascii="Times New Roman" w:hAnsi="Times New Roman" w:eastAsia="Times New Roman"/>
+                <w:b/>
+                <w:i w:val="0"/>
+                <w:color w:val="000000"/>
+                <w:sz w:val="20"/>
+              </w:rPr>
+              <w:t>(cm)</w:t>
             </w:r>
           </w:p>
         </w:tc>
@@ -3061,7 +3046,8 @@
       <w:tr>
         <w:tc>
           <w:tcPr>
-            <w:tcW w:type="dxa" w:w="1045"/>
+            <w:tcW w:w="1077" w:type="dxa"/>
+            <w:noWrap/>
             <w:tcBorders>
               <w:top w:val="nil"/>
               <w:left w:val="nil"/>
@@ -3071,7 +3057,7 @@
           </w:tcPr>
           <w:p>
             <w:pPr>
-              <w:spacing w:after="0"/>
+              <w:spacing w:after="0" w:before="0"/>
               <w:jc w:val="left"/>
             </w:pPr>
             <w:r/>
@@ -3089,7 +3075,8 @@
         </w:tc>
         <w:tc>
           <w:tcPr>
-            <w:tcW w:type="dxa" w:w="1045"/>
+            <w:tcW w:w="964" w:type="dxa"/>
+            <w:noWrap/>
             <w:tcBorders>
               <w:top w:val="nil"/>
               <w:left w:val="nil"/>
@@ -3099,7 +3086,7 @@
           </w:tcPr>
           <w:p>
             <w:pPr>
-              <w:spacing w:after="0"/>
+              <w:spacing w:after="0" w:before="0"/>
               <w:jc w:val="left"/>
             </w:pPr>
             <w:r/>
@@ -3117,7 +3104,8 @@
         </w:tc>
         <w:tc>
           <w:tcPr>
-            <w:tcW w:type="dxa" w:w="1045"/>
+            <w:tcW w:w="1134" w:type="dxa"/>
+            <w:noWrap/>
             <w:tcBorders>
               <w:top w:val="nil"/>
               <w:left w:val="nil"/>
@@ -3127,7 +3115,7 @@
           </w:tcPr>
           <w:p>
             <w:pPr>
-              <w:spacing w:after="0"/>
+              <w:spacing w:after="0" w:before="0"/>
               <w:jc w:val="right"/>
             </w:pPr>
             <w:r/>
@@ -3145,7 +3133,8 @@
         </w:tc>
         <w:tc>
           <w:tcPr>
-            <w:tcW w:type="dxa" w:w="1045"/>
+            <w:tcW w:w="2948" w:type="dxa"/>
+            <w:noWrap/>
             <w:tcBorders>
               <w:top w:val="nil"/>
               <w:left w:val="nil"/>
@@ -3155,8 +3144,8 @@
           </w:tcPr>
           <w:p>
             <w:pPr>
-              <w:spacing w:after="0"/>
-              <w:jc w:val="right"/>
+              <w:spacing w:after="0" w:before="0"/>
+              <w:jc w:val="left"/>
             </w:pPr>
             <w:r/>
             <w:r>
@@ -3167,13 +3156,14 @@
                 <w:color w:val="000000"/>
                 <w:sz w:val="20"/>
               </w:rPr>
-              <w:t>0,955</w:t>
+              <w:t>0,955 / 0,936 / 0,969</w:t>
             </w:r>
           </w:p>
         </w:tc>
         <w:tc>
           <w:tcPr>
-            <w:tcW w:type="dxa" w:w="1045"/>
+            <w:tcW w:w="794" w:type="dxa"/>
+            <w:noWrap/>
             <w:tcBorders>
               <w:top w:val="nil"/>
               <w:left w:val="nil"/>
@@ -3183,63 +3173,7 @@
           </w:tcPr>
           <w:p>
             <w:pPr>
-              <w:spacing w:after="0"/>
-              <w:jc w:val="right"/>
-            </w:pPr>
-            <w:r/>
-            <w:r>
-              <w:rPr>
-                <w:rFonts w:ascii="Times New Roman" w:hAnsi="Times New Roman" w:eastAsia="Times New Roman"/>
-                <w:b w:val="0"/>
-                <w:i w:val="0"/>
-                <w:color w:val="000000"/>
-                <w:sz w:val="20"/>
-              </w:rPr>
-              <w:t>0,936</w:t>
-            </w:r>
-          </w:p>
-        </w:tc>
-        <w:tc>
-          <w:tcPr>
-            <w:tcW w:type="dxa" w:w="1045"/>
-            <w:tcBorders>
-              <w:top w:val="nil"/>
-              <w:left w:val="nil"/>
-              <w:bottom w:val="nil"/>
-              <w:right w:val="nil"/>
-            </w:tcBorders>
-          </w:tcPr>
-          <w:p>
-            <w:pPr>
-              <w:spacing w:after="0"/>
-              <w:jc w:val="right"/>
-            </w:pPr>
-            <w:r/>
-            <w:r>
-              <w:rPr>
-                <w:rFonts w:ascii="Times New Roman" w:hAnsi="Times New Roman" w:eastAsia="Times New Roman"/>
-                <w:b w:val="0"/>
-                <w:i w:val="0"/>
-                <w:color w:val="000000"/>
-                <w:sz w:val="20"/>
-              </w:rPr>
-              <w:t>0,969</w:t>
-            </w:r>
-          </w:p>
-        </w:tc>
-        <w:tc>
-          <w:tcPr>
-            <w:tcW w:type="dxa" w:w="1045"/>
-            <w:tcBorders>
-              <w:top w:val="nil"/>
-              <w:left w:val="nil"/>
-              <w:bottom w:val="nil"/>
-              <w:right w:val="nil"/>
-            </w:tcBorders>
-          </w:tcPr>
-          <w:p>
-            <w:pPr>
-              <w:spacing w:after="0"/>
+              <w:spacing w:after="0" w:before="0"/>
               <w:jc w:val="right"/>
             </w:pPr>
             <w:r/>
@@ -3257,7 +3191,8 @@
         </w:tc>
         <w:tc>
           <w:tcPr>
-            <w:tcW w:type="dxa" w:w="1045"/>
+            <w:tcW w:w="1077" w:type="dxa"/>
+            <w:noWrap/>
             <w:tcBorders>
               <w:top w:val="nil"/>
               <w:left w:val="nil"/>
@@ -3267,7 +3202,7 @@
           </w:tcPr>
           <w:p>
             <w:pPr>
-              <w:spacing w:after="0"/>
+              <w:spacing w:after="0" w:before="0"/>
               <w:jc w:val="right"/>
             </w:pPr>
             <w:r/>
@@ -3285,7 +3220,8 @@
         </w:tc>
         <w:tc>
           <w:tcPr>
-            <w:tcW w:type="dxa" w:w="1045"/>
+            <w:tcW w:w="1077" w:type="dxa"/>
+            <w:noWrap/>
             <w:tcBorders>
               <w:top w:val="nil"/>
               <w:left w:val="nil"/>
@@ -3295,7 +3231,7 @@
           </w:tcPr>
           <w:p>
             <w:pPr>
-              <w:spacing w:after="0"/>
+              <w:spacing w:after="0" w:before="0"/>
               <w:jc w:val="right"/>
             </w:pPr>
             <w:r/>
@@ -3315,7 +3251,8 @@
       <w:tr>
         <w:tc>
           <w:tcPr>
-            <w:tcW w:type="dxa" w:w="1045"/>
+            <w:tcW w:w="1077" w:type="dxa"/>
+            <w:noWrap/>
             <w:tcBorders>
               <w:top w:val="nil"/>
               <w:left w:val="nil"/>
@@ -3325,7 +3262,7 @@
           </w:tcPr>
           <w:p>
             <w:pPr>
-              <w:spacing w:after="0"/>
+              <w:spacing w:after="0" w:before="0"/>
               <w:jc w:val="left"/>
             </w:pPr>
             <w:r/>
@@ -3343,7 +3280,8 @@
         </w:tc>
         <w:tc>
           <w:tcPr>
-            <w:tcW w:type="dxa" w:w="1045"/>
+            <w:tcW w:w="964" w:type="dxa"/>
+            <w:noWrap/>
             <w:tcBorders>
               <w:top w:val="nil"/>
               <w:left w:val="nil"/>
@@ -3353,7 +3291,7 @@
           </w:tcPr>
           <w:p>
             <w:pPr>
-              <w:spacing w:after="0"/>
+              <w:spacing w:after="0" w:before="0"/>
               <w:jc w:val="left"/>
             </w:pPr>
             <w:r/>
@@ -3371,7 +3309,8 @@
         </w:tc>
         <w:tc>
           <w:tcPr>
-            <w:tcW w:type="dxa" w:w="1045"/>
+            <w:tcW w:w="1134" w:type="dxa"/>
+            <w:noWrap/>
             <w:tcBorders>
               <w:top w:val="nil"/>
               <w:left w:val="nil"/>
@@ -3381,7 +3320,7 @@
           </w:tcPr>
           <w:p>
             <w:pPr>
-              <w:spacing w:after="0"/>
+              <w:spacing w:after="0" w:before="0"/>
               <w:jc w:val="right"/>
             </w:pPr>
             <w:r/>
@@ -3399,7 +3338,8 @@
         </w:tc>
         <w:tc>
           <w:tcPr>
-            <w:tcW w:type="dxa" w:w="1045"/>
+            <w:tcW w:w="2948" w:type="dxa"/>
+            <w:noWrap/>
             <w:tcBorders>
               <w:top w:val="nil"/>
               <w:left w:val="nil"/>
@@ -3409,8 +3349,8 @@
           </w:tcPr>
           <w:p>
             <w:pPr>
-              <w:spacing w:after="0"/>
-              <w:jc w:val="right"/>
+              <w:spacing w:after="0" w:before="0"/>
+              <w:jc w:val="left"/>
             </w:pPr>
             <w:r/>
             <w:r>
@@ -3421,13 +3361,14 @@
                 <w:color w:val="000000"/>
                 <w:sz w:val="20"/>
               </w:rPr>
-              <w:t>0,888</w:t>
+              <w:t>0,888 / 0,878 / 0,876</w:t>
             </w:r>
           </w:p>
         </w:tc>
         <w:tc>
           <w:tcPr>
-            <w:tcW w:type="dxa" w:w="1045"/>
+            <w:tcW w:w="794" w:type="dxa"/>
+            <w:noWrap/>
             <w:tcBorders>
               <w:top w:val="nil"/>
               <w:left w:val="nil"/>
@@ -3437,63 +3378,7 @@
           </w:tcPr>
           <w:p>
             <w:pPr>
-              <w:spacing w:after="0"/>
-              <w:jc w:val="right"/>
-            </w:pPr>
-            <w:r/>
-            <w:r>
-              <w:rPr>
-                <w:rFonts w:ascii="Times New Roman" w:hAnsi="Times New Roman" w:eastAsia="Times New Roman"/>
-                <w:b w:val="0"/>
-                <w:i w:val="0"/>
-                <w:color w:val="000000"/>
-                <w:sz w:val="20"/>
-              </w:rPr>
-              <w:t>0,878</w:t>
-            </w:r>
-          </w:p>
-        </w:tc>
-        <w:tc>
-          <w:tcPr>
-            <w:tcW w:type="dxa" w:w="1045"/>
-            <w:tcBorders>
-              <w:top w:val="nil"/>
-              <w:left w:val="nil"/>
-              <w:bottom w:val="nil"/>
-              <w:right w:val="nil"/>
-            </w:tcBorders>
-          </w:tcPr>
-          <w:p>
-            <w:pPr>
-              <w:spacing w:after="0"/>
-              <w:jc w:val="right"/>
-            </w:pPr>
-            <w:r/>
-            <w:r>
-              <w:rPr>
-                <w:rFonts w:ascii="Times New Roman" w:hAnsi="Times New Roman" w:eastAsia="Times New Roman"/>
-                <w:b w:val="0"/>
-                <w:i w:val="0"/>
-                <w:color w:val="000000"/>
-                <w:sz w:val="20"/>
-              </w:rPr>
-              <w:t>0,876</w:t>
-            </w:r>
-          </w:p>
-        </w:tc>
-        <w:tc>
-          <w:tcPr>
-            <w:tcW w:type="dxa" w:w="1045"/>
-            <w:tcBorders>
-              <w:top w:val="nil"/>
-              <w:left w:val="nil"/>
-              <w:bottom w:val="nil"/>
-              <w:right w:val="nil"/>
-            </w:tcBorders>
-          </w:tcPr>
-          <w:p>
-            <w:pPr>
-              <w:spacing w:after="0"/>
+              <w:spacing w:after="0" w:before="0"/>
               <w:jc w:val="right"/>
             </w:pPr>
             <w:r/>
@@ -3511,7 +3396,8 @@
         </w:tc>
         <w:tc>
           <w:tcPr>
-            <w:tcW w:type="dxa" w:w="1045"/>
+            <w:tcW w:w="1077" w:type="dxa"/>
+            <w:noWrap/>
             <w:tcBorders>
               <w:top w:val="nil"/>
               <w:left w:val="nil"/>
@@ -3521,7 +3407,7 @@
           </w:tcPr>
           <w:p>
             <w:pPr>
-              <w:spacing w:after="0"/>
+              <w:spacing w:after="0" w:before="0"/>
               <w:jc w:val="right"/>
             </w:pPr>
             <w:r/>
@@ -3539,7 +3425,8 @@
         </w:tc>
         <w:tc>
           <w:tcPr>
-            <w:tcW w:type="dxa" w:w="1045"/>
+            <w:tcW w:w="1077" w:type="dxa"/>
+            <w:noWrap/>
             <w:tcBorders>
               <w:top w:val="nil"/>
               <w:left w:val="nil"/>
@@ -3549,7 +3436,7 @@
           </w:tcPr>
           <w:p>
             <w:pPr>
-              <w:spacing w:after="0"/>
+              <w:spacing w:after="0" w:before="0"/>
               <w:jc w:val="right"/>
             </w:pPr>
             <w:r/>
@@ -3569,7 +3456,8 @@
       <w:tr>
         <w:tc>
           <w:tcPr>
-            <w:tcW w:type="dxa" w:w="1045"/>
+            <w:tcW w:w="1077" w:type="dxa"/>
+            <w:noWrap/>
             <w:tcBorders>
               <w:top w:val="nil"/>
               <w:left w:val="nil"/>
@@ -3579,7 +3467,7 @@
           </w:tcPr>
           <w:p>
             <w:pPr>
-              <w:spacing w:after="0"/>
+              <w:spacing w:after="0" w:before="0"/>
               <w:jc w:val="left"/>
             </w:pPr>
             <w:r/>
@@ -3597,7 +3485,8 @@
         </w:tc>
         <w:tc>
           <w:tcPr>
-            <w:tcW w:type="dxa" w:w="1045"/>
+            <w:tcW w:w="964" w:type="dxa"/>
+            <w:noWrap/>
             <w:tcBorders>
               <w:top w:val="nil"/>
               <w:left w:val="nil"/>
@@ -3607,7 +3496,7 @@
           </w:tcPr>
           <w:p>
             <w:pPr>
-              <w:spacing w:after="0"/>
+              <w:spacing w:after="0" w:before="0"/>
               <w:jc w:val="left"/>
             </w:pPr>
             <w:r/>
@@ -3625,7 +3514,8 @@
         </w:tc>
         <w:tc>
           <w:tcPr>
-            <w:tcW w:type="dxa" w:w="1045"/>
+            <w:tcW w:w="1134" w:type="dxa"/>
+            <w:noWrap/>
             <w:tcBorders>
               <w:top w:val="nil"/>
               <w:left w:val="nil"/>
@@ -3635,7 +3525,7 @@
           </w:tcPr>
           <w:p>
             <w:pPr>
-              <w:spacing w:after="0"/>
+              <w:spacing w:after="0" w:before="0"/>
               <w:jc w:val="right"/>
             </w:pPr>
             <w:r/>
@@ -3653,7 +3543,8 @@
         </w:tc>
         <w:tc>
           <w:tcPr>
-            <w:tcW w:type="dxa" w:w="1045"/>
+            <w:tcW w:w="2948" w:type="dxa"/>
+            <w:noWrap/>
             <w:tcBorders>
               <w:top w:val="nil"/>
               <w:left w:val="nil"/>
@@ -3663,8 +3554,8 @@
           </w:tcPr>
           <w:p>
             <w:pPr>
-              <w:spacing w:after="0"/>
-              <w:jc w:val="right"/>
+              <w:spacing w:after="0" w:before="0"/>
+              <w:jc w:val="left"/>
             </w:pPr>
             <w:r/>
             <w:r>
@@ -3675,13 +3566,14 @@
                 <w:color w:val="000000"/>
                 <w:sz w:val="20"/>
               </w:rPr>
-              <w:t>0,739</w:t>
+              <w:t>0,739 / 0,811 / 0,694</w:t>
             </w:r>
           </w:p>
         </w:tc>
         <w:tc>
           <w:tcPr>
-            <w:tcW w:type="dxa" w:w="1045"/>
+            <w:tcW w:w="794" w:type="dxa"/>
+            <w:noWrap/>
             <w:tcBorders>
               <w:top w:val="nil"/>
               <w:left w:val="nil"/>
@@ -3691,63 +3583,7 @@
           </w:tcPr>
           <w:p>
             <w:pPr>
-              <w:spacing w:after="0"/>
-              <w:jc w:val="right"/>
-            </w:pPr>
-            <w:r/>
-            <w:r>
-              <w:rPr>
-                <w:rFonts w:ascii="Times New Roman" w:hAnsi="Times New Roman" w:eastAsia="Times New Roman"/>
-                <w:b w:val="0"/>
-                <w:i w:val="0"/>
-                <w:color w:val="000000"/>
-                <w:sz w:val="20"/>
-              </w:rPr>
-              <w:t>0,811</w:t>
-            </w:r>
-          </w:p>
-        </w:tc>
-        <w:tc>
-          <w:tcPr>
-            <w:tcW w:type="dxa" w:w="1045"/>
-            <w:tcBorders>
-              <w:top w:val="nil"/>
-              <w:left w:val="nil"/>
-              <w:bottom w:val="nil"/>
-              <w:right w:val="nil"/>
-            </w:tcBorders>
-          </w:tcPr>
-          <w:p>
-            <w:pPr>
-              <w:spacing w:after="0"/>
-              <w:jc w:val="right"/>
-            </w:pPr>
-            <w:r/>
-            <w:r>
-              <w:rPr>
-                <w:rFonts w:ascii="Times New Roman" w:hAnsi="Times New Roman" w:eastAsia="Times New Roman"/>
-                <w:b w:val="0"/>
-                <w:i w:val="0"/>
-                <w:color w:val="000000"/>
-                <w:sz w:val="20"/>
-              </w:rPr>
-              <w:t>0,694</w:t>
-            </w:r>
-          </w:p>
-        </w:tc>
-        <w:tc>
-          <w:tcPr>
-            <w:tcW w:type="dxa" w:w="1045"/>
-            <w:tcBorders>
-              <w:top w:val="nil"/>
-              <w:left w:val="nil"/>
-              <w:bottom w:val="nil"/>
-              <w:right w:val="nil"/>
-            </w:tcBorders>
-          </w:tcPr>
-          <w:p>
-            <w:pPr>
-              <w:spacing w:after="0"/>
+              <w:spacing w:after="0" w:before="0"/>
               <w:jc w:val="right"/>
             </w:pPr>
             <w:r/>
@@ -3765,7 +3601,8 @@
         </w:tc>
         <w:tc>
           <w:tcPr>
-            <w:tcW w:type="dxa" w:w="1045"/>
+            <w:tcW w:w="1077" w:type="dxa"/>
+            <w:noWrap/>
             <w:tcBorders>
               <w:top w:val="nil"/>
               <w:left w:val="nil"/>
@@ -3775,7 +3612,7 @@
           </w:tcPr>
           <w:p>
             <w:pPr>
-              <w:spacing w:after="0"/>
+              <w:spacing w:after="0" w:before="0"/>
               <w:jc w:val="right"/>
             </w:pPr>
             <w:r/>
@@ -3793,7 +3630,8 @@
         </w:tc>
         <w:tc>
           <w:tcPr>
-            <w:tcW w:type="dxa" w:w="1045"/>
+            <w:tcW w:w="1077" w:type="dxa"/>
+            <w:noWrap/>
             <w:tcBorders>
               <w:top w:val="nil"/>
               <w:left w:val="nil"/>
@@ -3803,7 +3641,7 @@
           </w:tcPr>
           <w:p>
             <w:pPr>
-              <w:spacing w:after="0"/>
+              <w:spacing w:after="0" w:before="0"/>
               <w:jc w:val="right"/>
             </w:pPr>
             <w:r/>
@@ -3823,7 +3661,8 @@
       <w:tr>
         <w:tc>
           <w:tcPr>
-            <w:tcW w:type="dxa" w:w="1045"/>
+            <w:tcW w:w="1077" w:type="dxa"/>
+            <w:noWrap/>
             <w:tcBorders>
               <w:top w:val="nil"/>
               <w:left w:val="nil"/>
@@ -3833,7 +3672,7 @@
           </w:tcPr>
           <w:p>
             <w:pPr>
-              <w:spacing w:after="0"/>
+              <w:spacing w:after="0" w:before="0"/>
               <w:jc w:val="left"/>
             </w:pPr>
             <w:r/>
@@ -3851,7 +3690,8 @@
         </w:tc>
         <w:tc>
           <w:tcPr>
-            <w:tcW w:type="dxa" w:w="1045"/>
+            <w:tcW w:w="964" w:type="dxa"/>
+            <w:noWrap/>
             <w:tcBorders>
               <w:top w:val="nil"/>
               <w:left w:val="nil"/>
@@ -3861,7 +3701,7 @@
           </w:tcPr>
           <w:p>
             <w:pPr>
-              <w:spacing w:after="0"/>
+              <w:spacing w:after="0" w:before="0"/>
               <w:jc w:val="left"/>
             </w:pPr>
             <w:r/>
@@ -3879,7 +3719,8 @@
         </w:tc>
         <w:tc>
           <w:tcPr>
-            <w:tcW w:type="dxa" w:w="1045"/>
+            <w:tcW w:w="1134" w:type="dxa"/>
+            <w:noWrap/>
             <w:tcBorders>
               <w:top w:val="nil"/>
               <w:left w:val="nil"/>
@@ -3889,7 +3730,7 @@
           </w:tcPr>
           <w:p>
             <w:pPr>
-              <w:spacing w:after="0"/>
+              <w:spacing w:after="0" w:before="0"/>
               <w:jc w:val="right"/>
             </w:pPr>
             <w:r/>
@@ -3907,7 +3748,8 @@
         </w:tc>
         <w:tc>
           <w:tcPr>
-            <w:tcW w:type="dxa" w:w="1045"/>
+            <w:tcW w:w="2948" w:type="dxa"/>
+            <w:noWrap/>
             <w:tcBorders>
               <w:top w:val="nil"/>
               <w:left w:val="nil"/>
@@ -3917,8 +3759,8 @@
           </w:tcPr>
           <w:p>
             <w:pPr>
-              <w:spacing w:after="0"/>
-              <w:jc w:val="right"/>
+              <w:spacing w:after="0" w:before="0"/>
+              <w:jc w:val="left"/>
             </w:pPr>
             <w:r/>
             <w:r>
@@ -3929,13 +3771,14 @@
                 <w:color w:val="000000"/>
                 <w:sz w:val="20"/>
               </w:rPr>
-              <w:t>0,824</w:t>
+              <w:t>0,824 / 0,690 / 0,696</w:t>
             </w:r>
           </w:p>
         </w:tc>
         <w:tc>
           <w:tcPr>
-            <w:tcW w:type="dxa" w:w="1045"/>
+            <w:tcW w:w="794" w:type="dxa"/>
+            <w:noWrap/>
             <w:tcBorders>
               <w:top w:val="nil"/>
               <w:left w:val="nil"/>
@@ -3945,63 +3788,7 @@
           </w:tcPr>
           <w:p>
             <w:pPr>
-              <w:spacing w:after="0"/>
-              <w:jc w:val="right"/>
-            </w:pPr>
-            <w:r/>
-            <w:r>
-              <w:rPr>
-                <w:rFonts w:ascii="Times New Roman" w:hAnsi="Times New Roman" w:eastAsia="Times New Roman"/>
-                <w:b w:val="0"/>
-                <w:i w:val="0"/>
-                <w:color w:val="000000"/>
-                <w:sz w:val="20"/>
-              </w:rPr>
-              <w:t>0,690</w:t>
-            </w:r>
-          </w:p>
-        </w:tc>
-        <w:tc>
-          <w:tcPr>
-            <w:tcW w:type="dxa" w:w="1045"/>
-            <w:tcBorders>
-              <w:top w:val="nil"/>
-              <w:left w:val="nil"/>
-              <w:bottom w:val="single" w:sz="16" w:space="0" w:color="000000"/>
-              <w:right w:val="nil"/>
-            </w:tcBorders>
-          </w:tcPr>
-          <w:p>
-            <w:pPr>
-              <w:spacing w:after="0"/>
-              <w:jc w:val="right"/>
-            </w:pPr>
-            <w:r/>
-            <w:r>
-              <w:rPr>
-                <w:rFonts w:ascii="Times New Roman" w:hAnsi="Times New Roman" w:eastAsia="Times New Roman"/>
-                <w:b w:val="0"/>
-                <w:i w:val="0"/>
-                <w:color w:val="000000"/>
-                <w:sz w:val="20"/>
-              </w:rPr>
-              <w:t>0,696</w:t>
-            </w:r>
-          </w:p>
-        </w:tc>
-        <w:tc>
-          <w:tcPr>
-            <w:tcW w:type="dxa" w:w="1045"/>
-            <w:tcBorders>
-              <w:top w:val="nil"/>
-              <w:left w:val="nil"/>
-              <w:bottom w:val="single" w:sz="16" w:space="0" w:color="000000"/>
-              <w:right w:val="nil"/>
-            </w:tcBorders>
-          </w:tcPr>
-          <w:p>
-            <w:pPr>
-              <w:spacing w:after="0"/>
+              <w:spacing w:after="0" w:before="0"/>
               <w:jc w:val="right"/>
             </w:pPr>
             <w:r/>
@@ -4019,7 +3806,8 @@
         </w:tc>
         <w:tc>
           <w:tcPr>
-            <w:tcW w:type="dxa" w:w="1045"/>
+            <w:tcW w:w="1077" w:type="dxa"/>
+            <w:noWrap/>
             <w:tcBorders>
               <w:top w:val="nil"/>
               <w:left w:val="nil"/>
@@ -4029,7 +3817,7 @@
           </w:tcPr>
           <w:p>
             <w:pPr>
-              <w:spacing w:after="0"/>
+              <w:spacing w:after="0" w:before="0"/>
               <w:jc w:val="right"/>
             </w:pPr>
             <w:r/>
@@ -4047,7 +3835,8 @@
         </w:tc>
         <w:tc>
           <w:tcPr>
-            <w:tcW w:type="dxa" w:w="1045"/>
+            <w:tcW w:w="1077" w:type="dxa"/>
+            <w:noWrap/>
             <w:tcBorders>
               <w:top w:val="nil"/>
               <w:left w:val="nil"/>
@@ -4057,7 +3846,7 @@
           </w:tcPr>
           <w:p>
             <w:pPr>
-              <w:spacing w:after="0"/>
+              <w:spacing w:after="0" w:before="0"/>
               <w:jc w:val="right"/>
             </w:pPr>
             <w:r/>

</xml_diff>